<commit_message>
Add some new next steps for Luke
</commit_message>
<xml_diff>
--- a/Outline and next steps.docx
+++ b/Outline and next steps.docx
@@ -250,21 +250,15 @@
           <w:ilvl w:val="0"/>
           <w:numId w:val="2"/>
         </w:numPr>
-      </w:pPr>
-      <w:r>
-        <w:t xml:space="preserve">Ross and Luke: Finalize </w:t>
-      </w:r>
-      <w:r>
         <w:rPr>
           <w:strike/>
         </w:rPr>
-        <w:t>taxonomic categories and</w:t>
-      </w:r>
-      <w:r>
-        <w:t xml:space="preserve"> thresholds</w:t>
-      </w:r>
-      <w:r>
-        <w:t xml:space="preserve"> (total n per tow)</w:t>
+      </w:pPr>
+      <w:r>
+        <w:rPr>
+          <w:strike/>
+        </w:rPr>
+        <w:t>Ross and Luke: Finalize taxonomic categories and thresholds</w:t>
       </w:r>
     </w:p>
     <w:p>
@@ -294,13 +288,40 @@
         </w:numPr>
       </w:pPr>
       <w:r>
-        <w:t>Ross: Finalize cluster analysis and</w:t>
-      </w:r>
-      <w:r>
-        <w:t xml:space="preserve"> </w:t>
-      </w:r>
-      <w:r>
-        <w:t>map cluster types by year (jitter depths)</w:t>
+        <w:t>Luke: Add color coding by taxon to “01_data_wrangling.R”</w:t>
+      </w:r>
+    </w:p>
+    <w:p>
+      <w:pPr>
+        <w:pStyle w:val="ListParagraph"/>
+        <w:numPr>
+          <w:ilvl w:val="0"/>
+          <w:numId w:val="2"/>
+        </w:numPr>
+      </w:pPr>
+      <w:r>
+        <w:t xml:space="preserve">Luke: </w:t>
+      </w:r>
+      <w:r>
+        <w:t>Finalize cluster analysis</w:t>
+      </w:r>
+    </w:p>
+    <w:p>
+      <w:pPr>
+        <w:pStyle w:val="ListParagraph"/>
+        <w:numPr>
+          <w:ilvl w:val="0"/>
+          <w:numId w:val="2"/>
+        </w:numPr>
+      </w:pPr>
+      <w:r>
+        <w:t xml:space="preserve">Ross: </w:t>
+      </w:r>
+      <w:r>
+        <w:t>M</w:t>
+      </w:r>
+      <w:r>
+        <w:t>ap cluster types by year (jitter depths)</w:t>
       </w:r>
     </w:p>
     <w:p>

</xml_diff>

<commit_message>
cross off ISA on list of next steps
</commit_message>
<xml_diff>
--- a/Outline and next steps.docx
+++ b/Outline and next steps.docx
@@ -137,7 +137,15 @@
         </w:numPr>
       </w:pPr>
       <w:r>
-        <w:t>Distance-based redundancy analysis (db-RDA) using spatiotemporal (e.g. year, time of day, latitude, seafloor depth, mean sampling depth) and environmental (e.g. temperature, salinity, dissolved oxygen, productivity) variables to explain variation in assemblage composition</w:t>
+        <w:t>Distance-based redundancy analysis (</w:t>
+      </w:r>
+      <w:proofErr w:type="spellStart"/>
+      <w:r>
+        <w:t>db</w:t>
+      </w:r>
+      <w:proofErr w:type="spellEnd"/>
+      <w:r>
+        <w:t>-RDA) using spatiotemporal (e.g. year, time of day, latitude, seafloor depth, mean sampling depth) and environmental (e.g. temperature, salinity, dissolved oxygen, productivity) variables to explain variation in assemblage composition</w:t>
       </w:r>
     </w:p>
     <w:p>
@@ -164,7 +172,23 @@
         </w:numPr>
       </w:pPr>
       <w:r>
-        <w:t xml:space="preserve">Fit db-RDA models using vegan::capscale and assess significance of individual environmental variables using </w:t>
+        <w:t xml:space="preserve">Fit </w:t>
+      </w:r>
+      <w:proofErr w:type="spellStart"/>
+      <w:r>
+        <w:t>db</w:t>
+      </w:r>
+      <w:proofErr w:type="spellEnd"/>
+      <w:r>
+        <w:t>-RDA models using vegan::</w:t>
+      </w:r>
+      <w:proofErr w:type="spellStart"/>
+      <w:r>
+        <w:t>capscale</w:t>
+      </w:r>
+      <w:proofErr w:type="spellEnd"/>
+      <w:r>
+        <w:t xml:space="preserve"> and assess significance of individual environmental variables using </w:t>
       </w:r>
       <w:r>
         <w:t>vegan:: partial tests (see section 2.6 of Bleuel et al. 2024)</w:t>
@@ -179,7 +203,23 @@
         </w:numPr>
       </w:pPr>
       <w:r>
-        <w:t xml:space="preserve">Compare support for a base db-RDA model that only uses spatiotemporal covariates to a full db-RDA model that includes spatiotemporal and environmental covariates using ANOVA (see </w:t>
+        <w:t xml:space="preserve">Compare support for a base </w:t>
+      </w:r>
+      <w:proofErr w:type="spellStart"/>
+      <w:r>
+        <w:t>db</w:t>
+      </w:r>
+      <w:proofErr w:type="spellEnd"/>
+      <w:r>
+        <w:t xml:space="preserve">-RDA model that only uses spatiotemporal covariates to a full </w:t>
+      </w:r>
+      <w:proofErr w:type="spellStart"/>
+      <w:r>
+        <w:t>db</w:t>
+      </w:r>
+      <w:proofErr w:type="spellEnd"/>
+      <w:r>
+        <w:t xml:space="preserve">-RDA model that includes spatiotemporal and environmental covariates using ANOVA (see </w:t>
       </w:r>
       <w:r>
         <w:t>“Redundancy analysis” subsection of results in De Pascale et al. 2025)</w:t>
@@ -194,7 +234,15 @@
         </w:numPr>
       </w:pPr>
       <w:r>
-        <w:t>Plot model-constrained variation in assemblage composition, as explained by variables in db-RDAs (see Fig. 2 in De Pascale et al. 2025)</w:t>
+        <w:t xml:space="preserve">Plot model-constrained variation in assemblage composition, as explained by variables in </w:t>
+      </w:r>
+      <w:proofErr w:type="spellStart"/>
+      <w:r>
+        <w:t>db</w:t>
+      </w:r>
+      <w:proofErr w:type="spellEnd"/>
+      <w:r>
+        <w:t>-RDAs (see Fig. 2 in De Pascale et al. 2025)</w:t>
       </w:r>
     </w:p>
     <w:p>
@@ -276,25 +324,53 @@
         <w:rPr>
           <w:strike/>
         </w:rPr>
-        <w:t>Luke: Go through “01_data_wrangling.R” to double-check data treatment, revert to concentration data for multivariate analyses (Obj. 1 &amp; 2) and counts for univariate analysis (Obj. 3)</w:t>
-      </w:r>
-    </w:p>
-    <w:p>
-      <w:pPr>
-        <w:pStyle w:val="ListParagraph"/>
-        <w:numPr>
-          <w:ilvl w:val="0"/>
-          <w:numId w:val="2"/>
-        </w:numPr>
+        <w:t>Luke: Go through “01_data_</w:t>
+      </w:r>
+      <w:proofErr w:type="gramStart"/>
+      <w:r>
         <w:rPr>
           <w:strike/>
         </w:rPr>
-      </w:pPr>
+        <w:t>wrangling.R</w:t>
+      </w:r>
+      <w:proofErr w:type="gramEnd"/>
       <w:r>
         <w:rPr>
           <w:strike/>
         </w:rPr>
-        <w:t>Luke: Add color coding by taxon to “01_data_wrangling.R”</w:t>
+        <w:t>” to double-check data treatment, revert to concentration data for multivariate analyses (Obj. 1 &amp; 2) and counts for univariate analysis (Obj. 3)</w:t>
+      </w:r>
+    </w:p>
+    <w:p>
+      <w:pPr>
+        <w:pStyle w:val="ListParagraph"/>
+        <w:numPr>
+          <w:ilvl w:val="0"/>
+          <w:numId w:val="2"/>
+        </w:numPr>
+        <w:rPr>
+          <w:strike/>
+        </w:rPr>
+      </w:pPr>
+      <w:r>
+        <w:rPr>
+          <w:strike/>
+        </w:rPr>
+        <w:t>Luke: Add color coding by taxon to “01_data_</w:t>
+      </w:r>
+      <w:proofErr w:type="gramStart"/>
+      <w:r>
+        <w:rPr>
+          <w:strike/>
+        </w:rPr>
+        <w:t>wrangling.R</w:t>
+      </w:r>
+      <w:proofErr w:type="gramEnd"/>
+      <w:r>
+        <w:rPr>
+          <w:strike/>
+        </w:rPr>
+        <w:t>”</w:t>
       </w:r>
     </w:p>
     <w:p>
@@ -348,7 +424,15 @@
         </w:numPr>
       </w:pPr>
       <w:r>
-        <w:t>Luke: Try implementing db-RDA</w:t>
+        <w:t xml:space="preserve">Luke: Try implementing </w:t>
+      </w:r>
+      <w:proofErr w:type="spellStart"/>
+      <w:r>
+        <w:t>db</w:t>
+      </w:r>
+      <w:proofErr w:type="spellEnd"/>
+      <w:r>
+        <w:t>-RDA</w:t>
       </w:r>
     </w:p>
     <w:p>
@@ -358,8 +442,14 @@
           <w:ilvl w:val="0"/>
           <w:numId w:val="2"/>
         </w:numPr>
-      </w:pPr>
-      <w:r>
+        <w:rPr>
+          <w:strike/>
+        </w:rPr>
+      </w:pPr>
+      <w:r>
+        <w:rPr>
+          <w:strike/>
+        </w:rPr>
         <w:t>Ross: Try implementing indicator taxa analysis on clusters</w:t>
       </w:r>
     </w:p>

</xml_diff>

<commit_message>
Update with new tasks from today's meeting
</commit_message>
<xml_diff>
--- a/Outline and next steps.docx
+++ b/Outline and next steps.docx
@@ -137,15 +137,7 @@
         </w:numPr>
       </w:pPr>
       <w:r>
-        <w:t>Distance-based redundancy analysis (</w:t>
-      </w:r>
-      <w:proofErr w:type="spellStart"/>
-      <w:r>
-        <w:t>db</w:t>
-      </w:r>
-      <w:proofErr w:type="spellEnd"/>
-      <w:r>
-        <w:t>-RDA) using spatiotemporal (e.g. year, time of day, latitude, seafloor depth, mean sampling depth) and environmental (e.g. temperature, salinity, dissolved oxygen, productivity) variables to explain variation in assemblage composition</w:t>
+        <w:t>Distance-based redundancy analysis (db-RDA) using spatiotemporal (e.g. year, time of day, latitude, seafloor depth, mean sampling depth) and environmental (e.g. temperature, salinity, dissolved oxygen, productivity) variables to explain variation in assemblage composition</w:t>
       </w:r>
     </w:p>
     <w:p>
@@ -172,23 +164,7 @@
         </w:numPr>
       </w:pPr>
       <w:r>
-        <w:t xml:space="preserve">Fit </w:t>
-      </w:r>
-      <w:proofErr w:type="spellStart"/>
-      <w:r>
-        <w:t>db</w:t>
-      </w:r>
-      <w:proofErr w:type="spellEnd"/>
-      <w:r>
-        <w:t>-RDA models using vegan::</w:t>
-      </w:r>
-      <w:proofErr w:type="spellStart"/>
-      <w:r>
-        <w:t>capscale</w:t>
-      </w:r>
-      <w:proofErr w:type="spellEnd"/>
-      <w:r>
-        <w:t xml:space="preserve"> and assess significance of individual environmental variables using </w:t>
+        <w:t xml:space="preserve">Fit db-RDA models using vegan::capscale and assess significance of individual environmental variables using </w:t>
       </w:r>
       <w:r>
         <w:t>vegan:: partial tests (see section 2.6 of Bleuel et al. 2024)</w:t>
@@ -203,23 +179,7 @@
         </w:numPr>
       </w:pPr>
       <w:r>
-        <w:t xml:space="preserve">Compare support for a base </w:t>
-      </w:r>
-      <w:proofErr w:type="spellStart"/>
-      <w:r>
-        <w:t>db</w:t>
-      </w:r>
-      <w:proofErr w:type="spellEnd"/>
-      <w:r>
-        <w:t xml:space="preserve">-RDA model that only uses spatiotemporal covariates to a full </w:t>
-      </w:r>
-      <w:proofErr w:type="spellStart"/>
-      <w:r>
-        <w:t>db</w:t>
-      </w:r>
-      <w:proofErr w:type="spellEnd"/>
-      <w:r>
-        <w:t xml:space="preserve">-RDA model that includes spatiotemporal and environmental covariates using ANOVA (see </w:t>
+        <w:t xml:space="preserve">Compare support for a base db-RDA model that only uses spatiotemporal covariates to a full db-RDA model that includes spatiotemporal and environmental covariates using ANOVA (see </w:t>
       </w:r>
       <w:r>
         <w:t>“Redundancy analysis” subsection of results in De Pascale et al. 2025)</w:t>
@@ -234,15 +194,7 @@
         </w:numPr>
       </w:pPr>
       <w:r>
-        <w:t xml:space="preserve">Plot model-constrained variation in assemblage composition, as explained by variables in </w:t>
-      </w:r>
-      <w:proofErr w:type="spellStart"/>
-      <w:r>
-        <w:t>db</w:t>
-      </w:r>
-      <w:proofErr w:type="spellEnd"/>
-      <w:r>
-        <w:t>-RDAs (see Fig. 2 in De Pascale et al. 2025)</w:t>
+        <w:t>Plot model-constrained variation in assemblage composition, as explained by variables in db-RDAs (see Fig. 2 in De Pascale et al. 2025)</w:t>
       </w:r>
     </w:p>
     <w:p>
@@ -324,53 +276,25 @@
         <w:rPr>
           <w:strike/>
         </w:rPr>
-        <w:t>Luke: Go through “01_data_</w:t>
-      </w:r>
-      <w:proofErr w:type="gramStart"/>
-      <w:r>
+        <w:t>Luke: Go through “01_data_wrangling.R” to double-check data treatment, revert to concentration data for multivariate analyses (Obj. 1 &amp; 2) and counts for univariate analysis (Obj. 3)</w:t>
+      </w:r>
+    </w:p>
+    <w:p>
+      <w:pPr>
+        <w:pStyle w:val="ListParagraph"/>
+        <w:numPr>
+          <w:ilvl w:val="0"/>
+          <w:numId w:val="2"/>
+        </w:numPr>
         <w:rPr>
           <w:strike/>
         </w:rPr>
-        <w:t>wrangling.R</w:t>
-      </w:r>
-      <w:proofErr w:type="gramEnd"/>
+      </w:pPr>
       <w:r>
         <w:rPr>
           <w:strike/>
         </w:rPr>
-        <w:t>” to double-check data treatment, revert to concentration data for multivariate analyses (Obj. 1 &amp; 2) and counts for univariate analysis (Obj. 3)</w:t>
-      </w:r>
-    </w:p>
-    <w:p>
-      <w:pPr>
-        <w:pStyle w:val="ListParagraph"/>
-        <w:numPr>
-          <w:ilvl w:val="0"/>
-          <w:numId w:val="2"/>
-        </w:numPr>
-        <w:rPr>
-          <w:strike/>
-        </w:rPr>
-      </w:pPr>
-      <w:r>
-        <w:rPr>
-          <w:strike/>
-        </w:rPr>
-        <w:t>Luke: Add color coding by taxon to “01_data_</w:t>
-      </w:r>
-      <w:proofErr w:type="gramStart"/>
-      <w:r>
-        <w:rPr>
-          <w:strike/>
-        </w:rPr>
-        <w:t>wrangling.R</w:t>
-      </w:r>
-      <w:proofErr w:type="gramEnd"/>
-      <w:r>
-        <w:rPr>
-          <w:strike/>
-        </w:rPr>
-        <w:t>”</w:t>
+        <w:t>Luke: Add color coding by taxon to “01_data_wrangling.R”</w:t>
       </w:r>
     </w:p>
     <w:p>
@@ -424,15 +348,16 @@
         </w:numPr>
       </w:pPr>
       <w:r>
-        <w:t xml:space="preserve">Luke: Try implementing </w:t>
-      </w:r>
-      <w:proofErr w:type="spellStart"/>
-      <w:r>
-        <w:t>db</w:t>
-      </w:r>
-      <w:proofErr w:type="spellEnd"/>
-      <w:r>
-        <w:t>-RDA</w:t>
+        <w:t xml:space="preserve">Luke: </w:t>
+      </w:r>
+      <w:r>
+        <w:t>Finalize</w:t>
+      </w:r>
+      <w:r>
+        <w:t xml:space="preserve"> db-RDA</w:t>
+      </w:r>
+      <w:r>
+        <w:t xml:space="preserve"> plot, read about variable inflation, try adding interaction between salinity and temperature</w:t>
       </w:r>
     </w:p>
     <w:p>
@@ -463,6 +388,45 @@
       </w:pPr>
       <w:r>
         <w:t>Ross: Finalize NMDS plot</w:t>
+      </w:r>
+    </w:p>
+    <w:p>
+      <w:pPr>
+        <w:pStyle w:val="ListParagraph"/>
+        <w:numPr>
+          <w:ilvl w:val="0"/>
+          <w:numId w:val="2"/>
+        </w:numPr>
+      </w:pPr>
+      <w:r>
+        <w:t>Ross and Luke: Read Dexter et al. (2018) about NMDS stress</w:t>
+      </w:r>
+    </w:p>
+    <w:p>
+      <w:pPr>
+        <w:pStyle w:val="ListParagraph"/>
+        <w:numPr>
+          <w:ilvl w:val="0"/>
+          <w:numId w:val="2"/>
+        </w:numPr>
+      </w:pPr>
+      <w:r>
+        <w:t xml:space="preserve">Ross: </w:t>
+      </w:r>
+      <w:r>
+        <w:t xml:space="preserve">Linear regression plot </w:t>
+      </w:r>
+      <w:r>
+        <w:t>for Obj. 3</w:t>
+      </w:r>
+      <w:r>
+        <w:t xml:space="preserve"> (</w:t>
+      </w:r>
+      <w:r>
+        <w:t>Larval fish abundance ~ taxon * time of day + taxon * depth</w:t>
+      </w:r>
+      <w:r>
+        <w:t>), plots of daily variation in depth distributions of indicator taxa</w:t>
       </w:r>
     </w:p>
     <w:p>
@@ -489,7 +453,19 @@
         </w:numPr>
       </w:pPr>
       <w:r>
-        <w:t>Ross: Next iteration of model and plots for Obj. 3</w:t>
+        <w:t>Ross: Make PowerPoint with figures/tables summarizing results relevant to each objective for meeting with Su</w:t>
+      </w:r>
+    </w:p>
+    <w:p>
+      <w:pPr>
+        <w:pStyle w:val="ListParagraph"/>
+        <w:numPr>
+          <w:ilvl w:val="0"/>
+          <w:numId w:val="2"/>
+        </w:numPr>
+      </w:pPr>
+      <w:r>
+        <w:t>Ross: Draft statistical analysis methods for paper</w:t>
       </w:r>
     </w:p>
     <w:sectPr>

</xml_diff>

<commit_message>
Add new next steps for some figures
</commit_message>
<xml_diff>
--- a/Outline and next steps.docx
+++ b/Outline and next steps.docx
@@ -235,213 +235,18 @@
       </w:r>
     </w:p>
     <w:p>
-      <w:r>
+      <w:pPr>
         <w:rPr>
           <w:b/>
           <w:bCs/>
         </w:rPr>
-        <w:t>Next steps (before next meeting?)</w:t>
-      </w:r>
-    </w:p>
-    <w:p>
-      <w:pPr>
-        <w:pStyle w:val="ListParagraph"/>
-        <w:numPr>
-          <w:ilvl w:val="0"/>
-          <w:numId w:val="2"/>
-        </w:numPr>
-        <w:rPr>
-          <w:strike/>
-        </w:rPr>
-      </w:pPr>
-      <w:r>
-        <w:rPr>
-          <w:strike/>
-        </w:rPr>
-        <w:t>Ross and Luke: Finalize taxonomic categories and thresholds</w:t>
-      </w:r>
-    </w:p>
-    <w:p>
-      <w:pPr>
-        <w:pStyle w:val="ListParagraph"/>
-        <w:numPr>
-          <w:ilvl w:val="0"/>
-          <w:numId w:val="2"/>
-        </w:numPr>
-        <w:rPr>
-          <w:strike/>
-        </w:rPr>
-      </w:pPr>
-      <w:r>
-        <w:rPr>
-          <w:strike/>
-        </w:rPr>
-        <w:t>Luke: Go through “01_data_wrangling.R” to double-check data treatment, revert to concentration data for multivariate analyses (Obj. 1 &amp; 2) and counts for univariate analysis (Obj. 3)</w:t>
-      </w:r>
-    </w:p>
-    <w:p>
-      <w:pPr>
-        <w:pStyle w:val="ListParagraph"/>
-        <w:numPr>
-          <w:ilvl w:val="0"/>
-          <w:numId w:val="2"/>
-        </w:numPr>
-        <w:rPr>
-          <w:strike/>
-        </w:rPr>
-      </w:pPr>
-      <w:r>
-        <w:rPr>
-          <w:strike/>
-        </w:rPr>
-        <w:t>Luke: Add color coding by taxon to “01_data_wrangling.R”</w:t>
-      </w:r>
-    </w:p>
-    <w:p>
-      <w:pPr>
-        <w:pStyle w:val="ListParagraph"/>
-        <w:numPr>
-          <w:ilvl w:val="0"/>
-          <w:numId w:val="2"/>
-        </w:numPr>
-        <w:rPr>
-          <w:strike/>
-        </w:rPr>
-      </w:pPr>
-      <w:r>
-        <w:rPr>
-          <w:strike/>
-        </w:rPr>
-        <w:t>Ross</w:t>
-      </w:r>
-      <w:r>
-        <w:rPr>
-          <w:strike/>
-        </w:rPr>
-        <w:t>: Finalize cluster analysis</w:t>
-      </w:r>
-    </w:p>
-    <w:p>
-      <w:pPr>
-        <w:pStyle w:val="ListParagraph"/>
-        <w:numPr>
-          <w:ilvl w:val="0"/>
-          <w:numId w:val="2"/>
-        </w:numPr>
-      </w:pPr>
-      <w:r>
-        <w:t xml:space="preserve">Ross: </w:t>
-      </w:r>
-      <w:r>
-        <w:t>M</w:t>
-      </w:r>
-      <w:r>
-        <w:t>ap cluster types by year (jitter depths)</w:t>
-      </w:r>
-    </w:p>
-    <w:p>
-      <w:pPr>
-        <w:pStyle w:val="ListParagraph"/>
-        <w:numPr>
-          <w:ilvl w:val="0"/>
-          <w:numId w:val="2"/>
-        </w:numPr>
-      </w:pPr>
-      <w:r>
-        <w:t xml:space="preserve">Luke: </w:t>
-      </w:r>
-      <w:r>
-        <w:t>Finalize</w:t>
-      </w:r>
-      <w:r>
-        <w:t xml:space="preserve"> db-RDA</w:t>
-      </w:r>
-      <w:r>
-        <w:t xml:space="preserve"> plot, read about variable inflation, try adding interaction between salinity and temperature</w:t>
-      </w:r>
-    </w:p>
-    <w:p>
-      <w:pPr>
-        <w:pStyle w:val="ListParagraph"/>
-        <w:numPr>
-          <w:ilvl w:val="0"/>
-          <w:numId w:val="2"/>
-        </w:numPr>
-        <w:rPr>
-          <w:strike/>
-        </w:rPr>
-      </w:pPr>
-      <w:r>
-        <w:rPr>
-          <w:strike/>
-        </w:rPr>
-        <w:t>Ross: Try implementing indicator taxa analysis on clusters</w:t>
-      </w:r>
-    </w:p>
-    <w:p>
-      <w:pPr>
-        <w:pStyle w:val="ListParagraph"/>
-        <w:numPr>
-          <w:ilvl w:val="0"/>
-          <w:numId w:val="2"/>
-        </w:numPr>
-      </w:pPr>
-      <w:r>
-        <w:t>Ross: Finalize NMDS plot</w:t>
-      </w:r>
-    </w:p>
-    <w:p>
-      <w:pPr>
-        <w:pStyle w:val="ListParagraph"/>
-        <w:numPr>
-          <w:ilvl w:val="0"/>
-          <w:numId w:val="2"/>
-        </w:numPr>
-      </w:pPr>
-      <w:r>
-        <w:t>Ross and Luke: Read Dexter et al. (2018) about NMDS stress</w:t>
-      </w:r>
-    </w:p>
-    <w:p>
-      <w:pPr>
-        <w:pStyle w:val="ListParagraph"/>
-        <w:numPr>
-          <w:ilvl w:val="0"/>
-          <w:numId w:val="2"/>
-        </w:numPr>
-      </w:pPr>
-      <w:r>
-        <w:t xml:space="preserve">Ross: </w:t>
-      </w:r>
-      <w:r>
-        <w:t xml:space="preserve">Linear regression plot </w:t>
-      </w:r>
-      <w:r>
-        <w:t>for Obj. 3</w:t>
-      </w:r>
-      <w:r>
-        <w:t xml:space="preserve"> (</w:t>
-      </w:r>
-      <w:r>
-        <w:t>Larval fish abundance ~ taxon * time of day + taxon * depth</w:t>
-      </w:r>
-      <w:r>
-        <w:t>), plots of daily variation in depth distributions of indicator taxa</w:t>
-      </w:r>
-    </w:p>
-    <w:p>
-      <w:pPr>
+      </w:pPr>
+      <w:r>
         <w:rPr>
           <w:b/>
           <w:bCs/>
         </w:rPr>
-      </w:pPr>
-      <w:r>
-        <w:rPr>
-          <w:b/>
-          <w:bCs/>
-        </w:rPr>
-        <w:t>Future steps (during or after next meeting)</w:t>
+        <w:t>Next steps</w:t>
       </w:r>
     </w:p>
     <w:p>
@@ -453,7 +258,7 @@
         </w:numPr>
       </w:pPr>
       <w:r>
-        <w:t>Ross: Make PowerPoint with figures/tables summarizing results relevant to each objective for meeting with Su</w:t>
+        <w:t>Luke: Pare down figures and present in lab meeting on Thursday</w:t>
       </w:r>
     </w:p>
     <w:p>
@@ -465,7 +270,67 @@
         </w:numPr>
       </w:pPr>
       <w:r>
-        <w:t>Ross: Draft statistical analysis methods for paper</w:t>
+        <w:t xml:space="preserve">Ross: </w:t>
+      </w:r>
+    </w:p>
+    <w:p>
+      <w:pPr>
+        <w:pStyle w:val="ListParagraph"/>
+        <w:numPr>
+          <w:ilvl w:val="1"/>
+          <w:numId w:val="2"/>
+        </w:numPr>
+      </w:pPr>
+      <w:r>
+        <w:t>Stacked bar plot: order x-axis by cluster, remove faceting; change color scheme to mesopelagics, flatfishes, and others</w:t>
+      </w:r>
+      <w:r>
+        <w:t xml:space="preserve"> (may have to add two “other” categories for “sculpin relatives” and a real junk drawer category)</w:t>
+      </w:r>
+      <w:r>
+        <w:t xml:space="preserve">, and make sure colors are color-blind friendly; </w:t>
+      </w:r>
+      <w:r>
+        <w:t>update axis titles, legend title, x-axis values (give each tow a number based on order in time/date, then order x-axis by cluster first, then tow ID); make two versions (one with only the 4 main clusters, one with all clusters)</w:t>
+      </w:r>
+    </w:p>
+    <w:p>
+      <w:pPr>
+        <w:pStyle w:val="ListParagraph"/>
+        <w:numPr>
+          <w:ilvl w:val="1"/>
+          <w:numId w:val="2"/>
+        </w:numPr>
+      </w:pPr>
+      <w:r>
+        <w:t>Indicator taxa table: first column indicating cluster, second column listing all indicator taxa for each cluster, third column with p-values</w:t>
+      </w:r>
+    </w:p>
+    <w:p>
+      <w:pPr>
+        <w:pStyle w:val="ListParagraph"/>
+        <w:numPr>
+          <w:ilvl w:val="1"/>
+          <w:numId w:val="2"/>
+        </w:numPr>
+      </w:pPr>
+      <w:r>
+        <w:t xml:space="preserve">Map colored by cluster: </w:t>
+      </w:r>
+      <w:r>
+        <w:t>a</w:t>
+      </w:r>
+      <w:r>
+        <w:t>rrange points</w:t>
+      </w:r>
+      <w:r>
+        <w:t xml:space="preserve"> (and potentially set color darkness)</w:t>
+      </w:r>
+      <w:r>
+        <w:t xml:space="preserve"> </w:t>
+      </w:r>
+      <w:r>
+        <w:t>by depth stratum; make color hues for each cluster more distinct (especially among the four major clusters); add “x”s to indicate location of tows that were excluded from analysis or had no fish; update axis titles, legend title, facet labels; add facets for each replicate in 2018 and 2019 and reduce area plotted in maps for 2018 and 2019; add state boundaries, add isobaths to chart area, remove gridlines from chart area</w:t>
       </w:r>
     </w:p>
     <w:sectPr>

</xml_diff>

<commit_message>
Add new items to "next steps"
</commit_message>
<xml_diff>
--- a/Outline and next steps.docx
+++ b/Outline and next steps.docx
@@ -201,12 +201,24 @@
       <w:pPr>
         <w:pStyle w:val="ListParagraph"/>
         <w:numPr>
+          <w:ilvl w:val="1"/>
+          <w:numId w:val="2"/>
+        </w:numPr>
+      </w:pPr>
+      <w:r>
+        <w:lastRenderedPageBreak/>
+        <w:t>Variance partitioning analysis on dbRDA models to test how much variation in assemblage structure is explained by spatiotemporal variables alone, environmental variables alone, and is shared between them, as well as whether the fraction of variation explained by each is significantly different from zero</w:t>
+      </w:r>
+    </w:p>
+    <w:p>
+      <w:pPr>
+        <w:pStyle w:val="ListParagraph"/>
+        <w:numPr>
           <w:ilvl w:val="0"/>
           <w:numId w:val="2"/>
         </w:numPr>
       </w:pPr>
       <w:r>
-        <w:lastRenderedPageBreak/>
         <w:t>Objective 3: Explore how vertical position of fish larvae differs during day vs. night using data from winter 2019</w:t>
       </w:r>
     </w:p>
@@ -272,6 +284,27 @@
       <w:r>
         <w:t xml:space="preserve">Ross: </w:t>
       </w:r>
+      <w:r>
+        <w:t>Add a version of objective 2 &amp; 3 analyses with data for all clusters except for the main 4 clusters excluded from the data set to see if results change substantially</w:t>
+      </w:r>
+      <w:r>
+        <w:t xml:space="preserve"> (probably easiest to just make new scripts and filter the data set by cluster at the start of each)</w:t>
+      </w:r>
+    </w:p>
+    <w:p>
+      <w:pPr>
+        <w:pStyle w:val="ListParagraph"/>
+        <w:numPr>
+          <w:ilvl w:val="0"/>
+          <w:numId w:val="2"/>
+        </w:numPr>
+      </w:pPr>
+      <w:r>
+        <w:t xml:space="preserve">Ross: </w:t>
+      </w:r>
+      <w:r>
+        <w:t>Update figures</w:t>
+      </w:r>
     </w:p>
     <w:p>
       <w:pPr>
@@ -282,6 +315,18 @@
         </w:numPr>
       </w:pPr>
       <w:r>
+        <w:t>Dendrogram: make colors of clusters consistent with other plots (make them more distinct than what they currently are); make x-axis more descriptive and plain language</w:t>
+      </w:r>
+    </w:p>
+    <w:p>
+      <w:pPr>
+        <w:pStyle w:val="ListParagraph"/>
+        <w:numPr>
+          <w:ilvl w:val="1"/>
+          <w:numId w:val="2"/>
+        </w:numPr>
+      </w:pPr>
+      <w:r>
         <w:t>Stacked bar plot: order x-axis by cluster, remove faceting; change color scheme to mesopelagics, flatfishes, and others</w:t>
       </w:r>
       <w:r>
@@ -291,7 +336,25 @@
         <w:t xml:space="preserve">, and make sure colors are color-blind friendly; </w:t>
       </w:r>
       <w:r>
-        <w:t>update axis titles, legend title, x-axis values (give each tow a number based on order in time/date, then order x-axis by cluster first, then tow ID); make two versions (one with only the 4 main clusters, one with all clusters)</w:t>
+        <w:t>update axis titles</w:t>
+      </w:r>
+      <w:r>
+        <w:t xml:space="preserve"> (make y-axis title “</w:t>
+      </w:r>
+      <w:r>
+        <w:t>Concentration (ind./m</w:t>
+      </w:r>
+      <w:r>
+        <w:rPr>
+          <w:vertAlign w:val="superscript"/>
+        </w:rPr>
+        <w:t>3</w:t>
+      </w:r>
+      <w:r>
+        <w:t>)”, and make x-axis title “Mean tow depth (m)”)</w:t>
+      </w:r>
+      <w:r>
+        <w:t>, legend title, x-axis values (give each tow a number based on order in time/date, then order x-axis by cluster first, then tow ID); make two versions (one with only the 4 main clusters, one with all clusters)</w:t>
       </w:r>
     </w:p>
     <w:p>
@@ -303,6 +366,226 @@
         </w:numPr>
       </w:pPr>
       <w:r>
+        <w:t xml:space="preserve">Map colored by cluster: </w:t>
+      </w:r>
+      <w:r>
+        <w:t>a</w:t>
+      </w:r>
+      <w:r>
+        <w:t>rrange points</w:t>
+      </w:r>
+      <w:r>
+        <w:t xml:space="preserve"> (and potentially set color darkness)</w:t>
+      </w:r>
+      <w:r>
+        <w:t xml:space="preserve"> </w:t>
+      </w:r>
+      <w:r>
+        <w:t>by depth stratum; make color hues for each cluster more distinct (especially among the four major clusters); add “x”s to indicate location of tows that were excluded from analysis or had no fish; update axis titles, legend title, facet labels; add facets for each replicate in 2018 and 2019 and reduce area plotted in maps for 2018 and 2019; add state boundaries, add isobaths to chart area, remove gridlines from chart area</w:t>
+      </w:r>
+    </w:p>
+    <w:p>
+      <w:pPr>
+        <w:pStyle w:val="ListParagraph"/>
+        <w:numPr>
+          <w:ilvl w:val="1"/>
+          <w:numId w:val="2"/>
+        </w:numPr>
+      </w:pPr>
+      <w:r>
+        <w:t>NMDS plot with no overlays: make a version with only the 4 main clusters</w:t>
+      </w:r>
+      <w:r>
+        <w:t xml:space="preserve"> </w:t>
+      </w:r>
+    </w:p>
+    <w:p>
+      <w:pPr>
+        <w:pStyle w:val="ListParagraph"/>
+        <w:numPr>
+          <w:ilvl w:val="1"/>
+          <w:numId w:val="2"/>
+        </w:numPr>
+      </w:pPr>
+      <w:r>
+        <w:lastRenderedPageBreak/>
+        <w:t>NMDS plot with overlays: remove vectors for distance_to_shore_km and</w:t>
+      </w:r>
+      <w:r>
+        <w:t xml:space="preserve"> </w:t>
+      </w:r>
+      <w:r>
+        <w:t>start_longitude_dd and ellipses for shelf position</w:t>
+      </w:r>
+      <w:r>
+        <w:t>; change color of “Day/Night” ellipses to black and make day ellipse a solid line</w:t>
+      </w:r>
+      <w:r>
+        <w:t>; make year a factor so that one vector is plotted for each year; make a version with only the 4 main clusters</w:t>
+      </w:r>
+      <w:r>
+        <w:t>; capitalize “cluster” in legend title</w:t>
+      </w:r>
+      <w:r>
+        <w:t>; change “Day/Night” legend title to “Time of day”</w:t>
+      </w:r>
+      <w:r>
+        <w:t>; add code to save plot with reasonable dimensions (around 6.5” width x 5.5” height) and adjust text, symbols, lines, etc. to an appropriate size in the saved plot; make a version with only the 4 main clusters</w:t>
+      </w:r>
+    </w:p>
+    <w:p>
+      <w:pPr>
+        <w:pStyle w:val="ListParagraph"/>
+        <w:numPr>
+          <w:ilvl w:val="1"/>
+          <w:numId w:val="2"/>
+        </w:numPr>
+      </w:pPr>
+      <w:r>
+        <w:t>dbRDA plot:</w:t>
+      </w:r>
+      <w:r>
+        <w:t xml:space="preserve"> make legend titles, legend symbols, figure dimensions, point sizes, vector and ellipse thickness, etc. consistent with full NMDS plot</w:t>
+      </w:r>
+    </w:p>
+    <w:p>
+      <w:pPr>
+        <w:pStyle w:val="ListParagraph"/>
+        <w:numPr>
+          <w:ilvl w:val="1"/>
+          <w:numId w:val="2"/>
+        </w:numPr>
+      </w:pPr>
+      <w:r>
+        <w:t xml:space="preserve">Line graph of concentration vs. depth by taxon: </w:t>
+      </w:r>
+      <w:r>
+        <w:t>update axis titles (make y-axis title “Concentration (ind./m</w:t>
+      </w:r>
+      <w:r>
+        <w:rPr>
+          <w:vertAlign w:val="superscript"/>
+        </w:rPr>
+        <w:t>3</w:t>
+      </w:r>
+      <w:r>
+        <w:t>)”</w:t>
+      </w:r>
+      <w:r>
+        <w:t>;</w:t>
+      </w:r>
+      <w:r>
+        <w:t xml:space="preserve"> </w:t>
+      </w:r>
+      <w:r>
+        <w:t>and make x-axis title “Mean tow depth (m)”)</w:t>
+      </w:r>
+      <w:r>
+        <w:t>;</w:t>
+      </w:r>
+      <w:r>
+        <w:t xml:space="preserve"> check y-axis values (probably shouldn’t be negative, zeros would be undefined (although we need to figure out how to still include them in the plot))</w:t>
+      </w:r>
+      <w:r>
+        <w:t>;</w:t>
+      </w:r>
+      <w:r>
+        <w:t xml:space="preserve"> capitalize legend title</w:t>
+      </w:r>
+      <w:r>
+        <w:t>;</w:t>
+      </w:r>
+      <w:r>
+        <w:t xml:space="preserve"> change taxon names to proper formatting (italicize, replace underscores with spaces, add periods after each “spp”)</w:t>
+      </w:r>
+      <w:r>
+        <w:t>;</w:t>
+      </w:r>
+      <w:r>
+        <w:t xml:space="preserve"> rotate x-axis values back to 0</w:t>
+      </w:r>
+      <w:r>
+        <w:t>;</w:t>
+      </w:r>
+      <w:r>
+        <w:t xml:space="preserve"> change colors to be consistent with stacked bar plots</w:t>
+      </w:r>
+    </w:p>
+    <w:p>
+      <w:pPr>
+        <w:pStyle w:val="ListParagraph"/>
+        <w:numPr>
+          <w:ilvl w:val="1"/>
+          <w:numId w:val="2"/>
+        </w:numPr>
+      </w:pPr>
+      <w:r>
+        <w:t xml:space="preserve">Effect plot for three-way intercept model: change taxon names to proper formatting; change colors to be color-blind friendly; change x-axis title to </w:t>
+      </w:r>
+      <w:r>
+        <w:t>“</w:t>
+      </w:r>
+      <w:r>
+        <w:t>Predicted c</w:t>
+      </w:r>
+      <w:r>
+        <w:t>oncentration (ind./m</w:t>
+      </w:r>
+      <w:r>
+        <w:rPr>
+          <w:vertAlign w:val="superscript"/>
+        </w:rPr>
+        <w:t>3</w:t>
+      </w:r>
+      <w:r>
+        <w:t>)”</w:t>
+      </w:r>
+      <w:r>
+        <w:t>; abbreviate on-chart labels to “D/N: [ns, ., *, or ***]”, “Tows: [n]”, and “n: [n]”; make x-axis values easier to read</w:t>
+      </w:r>
+    </w:p>
+    <w:p>
+      <w:pPr>
+        <w:pStyle w:val="ListParagraph"/>
+        <w:numPr>
+          <w:ilvl w:val="1"/>
+          <w:numId w:val="2"/>
+        </w:numPr>
+      </w:pPr>
+      <w:r>
+        <w:t>Line graph of concentration vs. depth by taxon</w:t>
+      </w:r>
+      <w:r>
+        <w:t xml:space="preserve"> with only abundant taxa</w:t>
+      </w:r>
+      <w:r>
+        <w:t>:</w:t>
+      </w:r>
+      <w:r>
+        <w:t xml:space="preserve"> try plotting concentrations of Ammodytidae instead of Isopsetta isolepis (I’m mostly curious why concentrations in the effect plot for the three-way interaction model seem to be zero, but the choice of taxon to represent cluster 5 is pretty subjective anyway); fix all formatting to match full line graph; add confidence interval ribbons back in</w:t>
+      </w:r>
+    </w:p>
+    <w:p>
+      <w:pPr>
+        <w:pStyle w:val="ListParagraph"/>
+        <w:numPr>
+          <w:ilvl w:val="0"/>
+          <w:numId w:val="2"/>
+        </w:numPr>
+      </w:pPr>
+      <w:r>
+        <w:t>Ross: Make tables</w:t>
+      </w:r>
+    </w:p>
+    <w:p>
+      <w:pPr>
+        <w:pStyle w:val="ListParagraph"/>
+        <w:numPr>
+          <w:ilvl w:val="1"/>
+          <w:numId w:val="2"/>
+        </w:numPr>
+      </w:pPr>
+      <w:r>
         <w:t>Indicator taxa table: first column indicating cluster, second column listing all indicator taxa for each cluster, third column with p-values</w:t>
       </w:r>
     </w:p>
@@ -315,22 +598,29 @@
         </w:numPr>
       </w:pPr>
       <w:r>
-        <w:t xml:space="preserve">Map colored by cluster: </w:t>
-      </w:r>
-      <w:r>
-        <w:t>a</w:t>
-      </w:r>
-      <w:r>
-        <w:t>rrange points</w:t>
-      </w:r>
-      <w:r>
-        <w:t xml:space="preserve"> (and potentially set color darkness)</w:t>
-      </w:r>
-      <w:r>
-        <w:t xml:space="preserve"> </w:t>
-      </w:r>
-      <w:r>
-        <w:t>by depth stratum; make color hues for each cluster more distinct (especially among the four major clusters); add “x”s to indicate location of tows that were excluded from analysis or had no fish; update axis titles, legend title, facet labels; add facets for each replicate in 2018 and 2019 and reduce area plotted in maps for 2018 and 2019; add state boundaries, add isobaths to chart area, remove gridlines from chart area</w:t>
+        <w:t xml:space="preserve">Single-species model table: display </w:t>
+      </w:r>
+      <w:r>
+        <w:t>z</w:t>
+      </w:r>
+      <w:r>
+        <w:t xml:space="preserve"> values and p-values for </w:t>
+      </w:r>
+      <w:r>
+        <w:t>regression terms for time of day, mean tow depth, and interaction between time of day and depth from single-species regression models in one table (need to make it very clear that these are from 4 separate models)</w:t>
+      </w:r>
+    </w:p>
+    <w:p>
+      <w:pPr>
+        <w:pStyle w:val="ListParagraph"/>
+        <w:numPr>
+          <w:ilvl w:val="0"/>
+          <w:numId w:val="2"/>
+        </w:numPr>
+      </w:pPr>
+      <w:r>
+        <w:lastRenderedPageBreak/>
+        <w:t>Ross: Add all figures and tables to a PowerPoint in the order that they will appear in the manuscript and write an outline of the results section and a short list of the main data-supported results of the paper</w:t>
       </w:r>
     </w:p>
     <w:sectPr>

</xml_diff>

<commit_message>
check off completed items
</commit_message>
<xml_diff>
--- a/Outline and next steps.docx
+++ b/Outline and next steps.docx
@@ -137,7 +137,15 @@
         </w:numPr>
       </w:pPr>
       <w:r>
-        <w:t>Distance-based redundancy analysis (db-RDA) using spatiotemporal (e.g. year, time of day, latitude, seafloor depth, mean sampling depth) and environmental (e.g. temperature, salinity, dissolved oxygen, productivity) variables to explain variation in assemblage composition</w:t>
+        <w:t>Distance-based redundancy analysis (</w:t>
+      </w:r>
+      <w:proofErr w:type="spellStart"/>
+      <w:r>
+        <w:t>db</w:t>
+      </w:r>
+      <w:proofErr w:type="spellEnd"/>
+      <w:r>
+        <w:t>-RDA) using spatiotemporal (e.g. year, time of day, latitude, seafloor depth, mean sampling depth) and environmental (e.g. temperature, salinity, dissolved oxygen, productivity) variables to explain variation in assemblage composition</w:t>
       </w:r>
     </w:p>
     <w:p>
@@ -164,7 +172,23 @@
         </w:numPr>
       </w:pPr>
       <w:r>
-        <w:t xml:space="preserve">Fit db-RDA models using vegan::capscale and assess significance of individual environmental variables using </w:t>
+        <w:t xml:space="preserve">Fit </w:t>
+      </w:r>
+      <w:proofErr w:type="spellStart"/>
+      <w:r>
+        <w:t>db</w:t>
+      </w:r>
+      <w:proofErr w:type="spellEnd"/>
+      <w:r>
+        <w:t>-RDA models using vegan::</w:t>
+      </w:r>
+      <w:proofErr w:type="spellStart"/>
+      <w:r>
+        <w:t>capscale</w:t>
+      </w:r>
+      <w:proofErr w:type="spellEnd"/>
+      <w:r>
+        <w:t xml:space="preserve"> and assess significance of individual environmental variables using </w:t>
       </w:r>
       <w:r>
         <w:t>vegan:: partial tests (see section 2.6 of Bleuel et al. 2024)</w:t>
@@ -179,7 +203,23 @@
         </w:numPr>
       </w:pPr>
       <w:r>
-        <w:t xml:space="preserve">Compare support for a base db-RDA model that only uses spatiotemporal covariates to a full db-RDA model that includes spatiotemporal and environmental covariates using ANOVA (see </w:t>
+        <w:t xml:space="preserve">Compare support for a base </w:t>
+      </w:r>
+      <w:proofErr w:type="spellStart"/>
+      <w:r>
+        <w:t>db</w:t>
+      </w:r>
+      <w:proofErr w:type="spellEnd"/>
+      <w:r>
+        <w:t xml:space="preserve">-RDA model that only uses spatiotemporal covariates to a full </w:t>
+      </w:r>
+      <w:proofErr w:type="spellStart"/>
+      <w:r>
+        <w:t>db</w:t>
+      </w:r>
+      <w:proofErr w:type="spellEnd"/>
+      <w:r>
+        <w:t xml:space="preserve">-RDA model that includes spatiotemporal and environmental covariates using ANOVA (see </w:t>
       </w:r>
       <w:r>
         <w:t>“Redundancy analysis” subsection of results in De Pascale et al. 2025)</w:t>
@@ -194,7 +234,15 @@
         </w:numPr>
       </w:pPr>
       <w:r>
-        <w:t>Plot model-constrained variation in assemblage composition, as explained by variables in db-RDAs (see Fig. 2 in De Pascale et al. 2025)</w:t>
+        <w:t xml:space="preserve">Plot model-constrained variation in assemblage composition, as explained by variables in </w:t>
+      </w:r>
+      <w:proofErr w:type="spellStart"/>
+      <w:r>
+        <w:t>db</w:t>
+      </w:r>
+      <w:proofErr w:type="spellEnd"/>
+      <w:r>
+        <w:t>-RDAs (see Fig. 2 in De Pascale et al. 2025)</w:t>
       </w:r>
     </w:p>
     <w:p>
@@ -207,7 +255,15 @@
       </w:pPr>
       <w:r>
         <w:lastRenderedPageBreak/>
-        <w:t>Variance partitioning analysis on dbRDA models to test how much variation in assemblage structure is explained by spatiotemporal variables alone, environmental variables alone, and is shared between them, as well as whether the fraction of variation explained by each is significantly different from zero</w:t>
+        <w:t xml:space="preserve">Variance partitioning analysis on </w:t>
+      </w:r>
+      <w:proofErr w:type="spellStart"/>
+      <w:r>
+        <w:t>dbRDA</w:t>
+      </w:r>
+      <w:proofErr w:type="spellEnd"/>
+      <w:r>
+        <w:t xml:space="preserve"> models to test how much variation in assemblage structure is explained by spatiotemporal variables alone, environmental variables alone, and is shared between them, as well as whether the fraction of variation explained by each is significantly different from zero</w:t>
       </w:r>
     </w:p>
     <w:p>
@@ -288,7 +344,15 @@
         <w:t>Add a version of objective 2 &amp; 3 analyses with data for all clusters except for the main 4 clusters excluded from the data set to see if results change substantially</w:t>
       </w:r>
       <w:r>
-        <w:t xml:space="preserve"> (probably easiest to just make new scripts and filter the data set by cluster at the start of each)</w:t>
+        <w:t xml:space="preserve"> (probably easiest </w:t>
+      </w:r>
+      <w:proofErr w:type="gramStart"/>
+      <w:r>
+        <w:t>to just</w:t>
+      </w:r>
+      <w:proofErr w:type="gramEnd"/>
+      <w:r>
+        <w:t xml:space="preserve"> make new scripts and filter the data set by cluster at the start of each)</w:t>
       </w:r>
     </w:p>
     <w:p>
@@ -315,7 +379,21 @@
         </w:numPr>
       </w:pPr>
       <w:r>
-        <w:t>Dendrogram: make colors of clusters consistent with other plots (make them more distinct than what they currently are); make x-axis more descriptive and plain language</w:t>
+        <w:t xml:space="preserve">Dendrogram: make colors of clusters consistent with other plots (make them more distinct </w:t>
+      </w:r>
+      <w:proofErr w:type="gramStart"/>
+      <w:r>
+        <w:t>than what</w:t>
+      </w:r>
+      <w:proofErr w:type="gramEnd"/>
+      <w:r>
+        <w:t xml:space="preserve"> they currently are); </w:t>
+      </w:r>
+      <w:r>
+        <w:rPr>
+          <w:strike/>
+        </w:rPr>
+        <w:t>make x-axis more descriptive and plain language</w:t>
       </w:r>
     </w:p>
     <w:p>
@@ -325,24 +403,207 @@
           <w:ilvl w:val="1"/>
           <w:numId w:val="2"/>
         </w:numPr>
-      </w:pPr>
-      <w:r>
-        <w:t>Stacked bar plot: order x-axis by cluster, remove faceting; change color scheme to mesopelagics, flatfishes, and others</w:t>
-      </w:r>
-      <w:r>
+        <w:rPr>
+          <w:strike/>
+        </w:rPr>
+      </w:pPr>
+      <w:r>
+        <w:rPr>
+          <w:strike/>
+        </w:rPr>
+        <w:t xml:space="preserve">Stacked bar plot: order x-axis by cluster, remove faceting; change color scheme to </w:t>
+      </w:r>
+      <w:proofErr w:type="spellStart"/>
+      <w:r>
+        <w:rPr>
+          <w:strike/>
+        </w:rPr>
+        <w:t>mesopelagics</w:t>
+      </w:r>
+      <w:proofErr w:type="spellEnd"/>
+      <w:r>
+        <w:rPr>
+          <w:strike/>
+        </w:rPr>
+        <w:t>, flatfishes, and others</w:t>
+      </w:r>
+      <w:r>
+        <w:rPr>
+          <w:strike/>
+        </w:rPr>
         <w:t xml:space="preserve"> (may have to add two “other” categories for “sculpin relatives” and a real junk drawer category)</w:t>
       </w:r>
       <w:r>
+        <w:rPr>
+          <w:strike/>
+        </w:rPr>
         <w:t xml:space="preserve">, and make sure colors are color-blind friendly; </w:t>
       </w:r>
       <w:r>
+        <w:rPr>
+          <w:strike/>
+        </w:rPr>
         <w:t>update axis titles</w:t>
       </w:r>
       <w:r>
+        <w:rPr>
+          <w:strike/>
+        </w:rPr>
         <w:t xml:space="preserve"> (make y-axis title “</w:t>
       </w:r>
       <w:r>
+        <w:rPr>
+          <w:strike/>
+        </w:rPr>
         <w:t>Concentration (ind./m</w:t>
+      </w:r>
+      <w:r>
+        <w:rPr>
+          <w:strike/>
+          <w:vertAlign w:val="superscript"/>
+        </w:rPr>
+        <w:t>3</w:t>
+      </w:r>
+      <w:r>
+        <w:rPr>
+          <w:strike/>
+        </w:rPr>
+        <w:t>)”, and make x-axis title “Mean tow depth (m)”)</w:t>
+      </w:r>
+      <w:r>
+        <w:rPr>
+          <w:strike/>
+        </w:rPr>
+        <w:t>, legend title, x-axis values (give each tow a number based on order in time/date, then order x-axis by cluster first, then tow ID); make two versions (one with only the 4 main clusters, one with all clusters)</w:t>
+      </w:r>
+    </w:p>
+    <w:p>
+      <w:pPr>
+        <w:pStyle w:val="ListParagraph"/>
+        <w:numPr>
+          <w:ilvl w:val="1"/>
+          <w:numId w:val="2"/>
+        </w:numPr>
+      </w:pPr>
+      <w:r>
+        <w:t xml:space="preserve">Map colored by cluster: </w:t>
+      </w:r>
+      <w:r>
+        <w:t>a</w:t>
+      </w:r>
+      <w:r>
+        <w:t>rrange points</w:t>
+      </w:r>
+      <w:r>
+        <w:t xml:space="preserve"> (and potentially set color darkness)</w:t>
+      </w:r>
+      <w:r>
+        <w:t xml:space="preserve"> </w:t>
+      </w:r>
+      <w:r>
+        <w:t>by depth stratum; make color hues for each cluster more distinct (especially among the four major clusters); add “</w:t>
+      </w:r>
+      <w:proofErr w:type="spellStart"/>
+      <w:r>
+        <w:t>x”s</w:t>
+      </w:r>
+      <w:proofErr w:type="spellEnd"/>
+      <w:r>
+        <w:t xml:space="preserve"> to indicate location of tows that were excluded from analysis or had no fish; update axis titles, legend title, facet labels; add facets for each replicate in 2018 and 2019 and reduce area plotted in maps for 2018 and 2019; add state boundaries, add isobaths to chart area, remove gridlines from chart area</w:t>
+      </w:r>
+    </w:p>
+    <w:p>
+      <w:pPr>
+        <w:pStyle w:val="ListParagraph"/>
+        <w:numPr>
+          <w:ilvl w:val="1"/>
+          <w:numId w:val="2"/>
+        </w:numPr>
+      </w:pPr>
+      <w:r>
+        <w:t>NMDS plot with no overlays: make a version with only the 4 main clusters</w:t>
+      </w:r>
+      <w:r>
+        <w:t xml:space="preserve"> </w:t>
+      </w:r>
+    </w:p>
+    <w:p>
+      <w:pPr>
+        <w:pStyle w:val="ListParagraph"/>
+        <w:numPr>
+          <w:ilvl w:val="1"/>
+          <w:numId w:val="2"/>
+        </w:numPr>
+      </w:pPr>
+      <w:r>
+        <w:lastRenderedPageBreak/>
+        <w:t xml:space="preserve">NMDS plot with overlays: remove vectors for </w:t>
+      </w:r>
+      <w:proofErr w:type="spellStart"/>
+      <w:r>
+        <w:t>distance_to_shore_km</w:t>
+      </w:r>
+      <w:proofErr w:type="spellEnd"/>
+      <w:r>
+        <w:t xml:space="preserve"> and</w:t>
+      </w:r>
+      <w:r>
+        <w:t xml:space="preserve"> </w:t>
+      </w:r>
+      <w:proofErr w:type="spellStart"/>
+      <w:r>
+        <w:t>start_longitude_dd</w:t>
+      </w:r>
+      <w:proofErr w:type="spellEnd"/>
+      <w:r>
+        <w:t xml:space="preserve"> and ellipses for shelf position</w:t>
+      </w:r>
+      <w:r>
+        <w:t>; change color of “Day/Night” ellipses to black and make day ellipse a solid line</w:t>
+      </w:r>
+      <w:r>
+        <w:t>; make year a factor so that one vector is plotted for each year; make a version with only the 4 main clusters</w:t>
+      </w:r>
+      <w:r>
+        <w:t>; capitalize “cluster” in legend title</w:t>
+      </w:r>
+      <w:r>
+        <w:t>; change “Day/Night” legend title to “Time of day”</w:t>
+      </w:r>
+      <w:r>
+        <w:t>; add code to save plot with reasonable dimensions (around 6.5” width x 5.5” height) and adjust text, symbols, lines, etc. to an appropriate size in the saved plot; make a version with only the 4 main clusters</w:t>
+      </w:r>
+    </w:p>
+    <w:p>
+      <w:pPr>
+        <w:pStyle w:val="ListParagraph"/>
+        <w:numPr>
+          <w:ilvl w:val="1"/>
+          <w:numId w:val="2"/>
+        </w:numPr>
+      </w:pPr>
+      <w:proofErr w:type="spellStart"/>
+      <w:r>
+        <w:t>dbRDA</w:t>
+      </w:r>
+      <w:proofErr w:type="spellEnd"/>
+      <w:r>
+        <w:t xml:space="preserve"> plot:</w:t>
+      </w:r>
+      <w:r>
+        <w:t xml:space="preserve"> make legend titles, legend symbols, figure dimensions, point sizes, vector and ellipse thickness, etc. consistent with full NMDS plot</w:t>
+      </w:r>
+    </w:p>
+    <w:p>
+      <w:pPr>
+        <w:pStyle w:val="ListParagraph"/>
+        <w:numPr>
+          <w:ilvl w:val="1"/>
+          <w:numId w:val="2"/>
+        </w:numPr>
+      </w:pPr>
+      <w:r>
+        <w:t>Line graph of concentration vs. depth by taxon: update axis titles (make y-axis title “Concentration (ind./m</w:t>
       </w:r>
       <w:r>
         <w:rPr>
@@ -351,10 +612,51 @@
         <w:t>3</w:t>
       </w:r>
       <w:r>
-        <w:t>)”, and make x-axis title “Mean tow depth (m)”)</w:t>
-      </w:r>
-      <w:r>
-        <w:t>, legend title, x-axis values (give each tow a number based on order in time/date, then order x-axis by cluster first, then tow ID); make two versions (one with only the 4 main clusters, one with all clusters)</w:t>
+        <w:t>)”</w:t>
+      </w:r>
+      <w:r>
+        <w:t>;</w:t>
+      </w:r>
+      <w:r>
+        <w:t xml:space="preserve"> and make x-axis title “Mean tow depth (m)”)</w:t>
+      </w:r>
+      <w:r>
+        <w:t>;</w:t>
+      </w:r>
+      <w:r>
+        <w:t xml:space="preserve"> check y-axis values (probably shouldn’t be negative, zeros would be undefined (although we need to figure out how to still include them in the plot))</w:t>
+      </w:r>
+      <w:r>
+        <w:t>;</w:t>
+      </w:r>
+      <w:r>
+        <w:t xml:space="preserve"> capitalize legend title</w:t>
+      </w:r>
+      <w:r>
+        <w:t>;</w:t>
+      </w:r>
+      <w:r>
+        <w:t xml:space="preserve"> change taxon names to proper formatting (italicize, replace underscores with spaces, add periods after each “</w:t>
+      </w:r>
+      <w:proofErr w:type="spellStart"/>
+      <w:r>
+        <w:t>spp</w:t>
+      </w:r>
+      <w:proofErr w:type="spellEnd"/>
+      <w:r>
+        <w:t>”)</w:t>
+      </w:r>
+      <w:r>
+        <w:t>;</w:t>
+      </w:r>
+      <w:r>
+        <w:t xml:space="preserve"> rotate x-axis values back to 0</w:t>
+      </w:r>
+      <w:r>
+        <w:t>;</w:t>
+      </w:r>
+      <w:r>
+        <w:t xml:space="preserve"> change colors to be consistent with stacked bar plots</w:t>
       </w:r>
     </w:p>
     <w:p>
@@ -366,101 +668,7 @@
         </w:numPr>
       </w:pPr>
       <w:r>
-        <w:t xml:space="preserve">Map colored by cluster: </w:t>
-      </w:r>
-      <w:r>
-        <w:t>a</w:t>
-      </w:r>
-      <w:r>
-        <w:t>rrange points</w:t>
-      </w:r>
-      <w:r>
-        <w:t xml:space="preserve"> (and potentially set color darkness)</w:t>
-      </w:r>
-      <w:r>
-        <w:t xml:space="preserve"> </w:t>
-      </w:r>
-      <w:r>
-        <w:t>by depth stratum; make color hues for each cluster more distinct (especially among the four major clusters); add “x”s to indicate location of tows that were excluded from analysis or had no fish; update axis titles, legend title, facet labels; add facets for each replicate in 2018 and 2019 and reduce area plotted in maps for 2018 and 2019; add state boundaries, add isobaths to chart area, remove gridlines from chart area</w:t>
-      </w:r>
-    </w:p>
-    <w:p>
-      <w:pPr>
-        <w:pStyle w:val="ListParagraph"/>
-        <w:numPr>
-          <w:ilvl w:val="1"/>
-          <w:numId w:val="2"/>
-        </w:numPr>
-      </w:pPr>
-      <w:r>
-        <w:t>NMDS plot with no overlays: make a version with only the 4 main clusters</w:t>
-      </w:r>
-      <w:r>
-        <w:t xml:space="preserve"> </w:t>
-      </w:r>
-    </w:p>
-    <w:p>
-      <w:pPr>
-        <w:pStyle w:val="ListParagraph"/>
-        <w:numPr>
-          <w:ilvl w:val="1"/>
-          <w:numId w:val="2"/>
-        </w:numPr>
-      </w:pPr>
-      <w:r>
-        <w:lastRenderedPageBreak/>
-        <w:t>NMDS plot with overlays: remove vectors for distance_to_shore_km and</w:t>
-      </w:r>
-      <w:r>
-        <w:t xml:space="preserve"> </w:t>
-      </w:r>
-      <w:r>
-        <w:t>start_longitude_dd and ellipses for shelf position</w:t>
-      </w:r>
-      <w:r>
-        <w:t>; change color of “Day/Night” ellipses to black and make day ellipse a solid line</w:t>
-      </w:r>
-      <w:r>
-        <w:t>; make year a factor so that one vector is plotted for each year; make a version with only the 4 main clusters</w:t>
-      </w:r>
-      <w:r>
-        <w:t>; capitalize “cluster” in legend title</w:t>
-      </w:r>
-      <w:r>
-        <w:t>; change “Day/Night” legend title to “Time of day”</w:t>
-      </w:r>
-      <w:r>
-        <w:t>; add code to save plot with reasonable dimensions (around 6.5” width x 5.5” height) and adjust text, symbols, lines, etc. to an appropriate size in the saved plot; make a version with only the 4 main clusters</w:t>
-      </w:r>
-    </w:p>
-    <w:p>
-      <w:pPr>
-        <w:pStyle w:val="ListParagraph"/>
-        <w:numPr>
-          <w:ilvl w:val="1"/>
-          <w:numId w:val="2"/>
-        </w:numPr>
-      </w:pPr>
-      <w:r>
-        <w:t>dbRDA plot:</w:t>
-      </w:r>
-      <w:r>
-        <w:t xml:space="preserve"> make legend titles, legend symbols, figure dimensions, point sizes, vector and ellipse thickness, etc. consistent with full NMDS plot</w:t>
-      </w:r>
-    </w:p>
-    <w:p>
-      <w:pPr>
-        <w:pStyle w:val="ListParagraph"/>
-        <w:numPr>
-          <w:ilvl w:val="1"/>
-          <w:numId w:val="2"/>
-        </w:numPr>
-      </w:pPr>
-      <w:r>
-        <w:t xml:space="preserve">Line graph of concentration vs. depth by taxon: </w:t>
-      </w:r>
-      <w:r>
-        <w:t>update axis titles (make y-axis title “Concentration (ind./m</w:t>
+        <w:t>Effect plot for three-way intercept model: change taxon names to proper formatting; change colors to be color-blind friendly; change x-axis title to “Predicted concentration (ind./m</w:t>
       </w:r>
       <w:r>
         <w:rPr>
@@ -469,46 +677,63 @@
         <w:t>3</w:t>
       </w:r>
       <w:r>
-        <w:t>)”</w:t>
-      </w:r>
-      <w:r>
-        <w:t>;</w:t>
-      </w:r>
+        <w:t>)”; abbreviate on-chart labels to “D/N: [ns</w:t>
+      </w:r>
+      <w:proofErr w:type="gramStart"/>
+      <w:r>
+        <w:t>, .</w:t>
+      </w:r>
+      <w:proofErr w:type="gramEnd"/>
+      <w:r>
+        <w:t>, *, or ***]”, “Tows: [n]”, and “n: [n]”; make x-axis values easier to read</w:t>
+      </w:r>
+    </w:p>
+    <w:p>
+      <w:pPr>
+        <w:pStyle w:val="ListParagraph"/>
+        <w:numPr>
+          <w:ilvl w:val="1"/>
+          <w:numId w:val="2"/>
+        </w:numPr>
+      </w:pPr>
+      <w:r>
+        <w:t xml:space="preserve">Line graph of concentration vs. depth by taxon with only abundant taxa: try plotting concentrations of </w:t>
+      </w:r>
+      <w:proofErr w:type="spellStart"/>
+      <w:r>
+        <w:t>Ammodytidae</w:t>
+      </w:r>
+      <w:proofErr w:type="spellEnd"/>
+      <w:r>
+        <w:t xml:space="preserve"> instead of </w:t>
+      </w:r>
+      <w:proofErr w:type="spellStart"/>
+      <w:r>
+        <w:t>Isopsetta</w:t>
+      </w:r>
+      <w:proofErr w:type="spellEnd"/>
       <w:r>
         <w:t xml:space="preserve"> </w:t>
       </w:r>
-      <w:r>
-        <w:t>and make x-axis title “Mean tow depth (m)”)</w:t>
-      </w:r>
-      <w:r>
-        <w:t>;</w:t>
-      </w:r>
-      <w:r>
-        <w:t xml:space="preserve"> check y-axis values (probably shouldn’t be negative, zeros would be undefined (although we need to figure out how to still include them in the plot))</w:t>
-      </w:r>
-      <w:r>
-        <w:t>;</w:t>
-      </w:r>
-      <w:r>
-        <w:t xml:space="preserve"> capitalize legend title</w:t>
-      </w:r>
-      <w:r>
-        <w:t>;</w:t>
-      </w:r>
-      <w:r>
-        <w:t xml:space="preserve"> change taxon names to proper formatting (italicize, replace underscores with spaces, add periods after each “spp”)</w:t>
-      </w:r>
-      <w:r>
-        <w:t>;</w:t>
-      </w:r>
-      <w:r>
-        <w:t xml:space="preserve"> rotate x-axis values back to 0</w:t>
-      </w:r>
-      <w:r>
-        <w:t>;</w:t>
-      </w:r>
-      <w:r>
-        <w:t xml:space="preserve"> change colors to be consistent with stacked bar plots</w:t>
+      <w:proofErr w:type="spellStart"/>
+      <w:r>
+        <w:t>isolepis</w:t>
+      </w:r>
+      <w:proofErr w:type="spellEnd"/>
+      <w:r>
+        <w:t xml:space="preserve"> (I’m mostly curious why concentrations in the effect plot for the three-way interaction model seem to be zero, but the choice of taxon to represent cluster 5 is pretty subjective anyway); fix all formatting to match full line graph; add confidence interval ribbons back in</w:t>
+      </w:r>
+    </w:p>
+    <w:p>
+      <w:pPr>
+        <w:pStyle w:val="ListParagraph"/>
+        <w:numPr>
+          <w:ilvl w:val="0"/>
+          <w:numId w:val="2"/>
+        </w:numPr>
+      </w:pPr>
+      <w:r>
+        <w:t>Ross: Make tables</w:t>
       </w:r>
     </w:p>
     <w:p>
@@ -518,30 +743,15 @@
           <w:ilvl w:val="1"/>
           <w:numId w:val="2"/>
         </w:numPr>
-      </w:pPr>
-      <w:r>
-        <w:t xml:space="preserve">Effect plot for three-way intercept model: change taxon names to proper formatting; change colors to be color-blind friendly; change x-axis title to </w:t>
-      </w:r>
-      <w:r>
-        <w:t>“</w:t>
-      </w:r>
-      <w:r>
-        <w:t>Predicted c</w:t>
-      </w:r>
-      <w:r>
-        <w:t>oncentration (ind./m</w:t>
-      </w:r>
-      <w:r>
         <w:rPr>
-          <w:vertAlign w:val="superscript"/>
+          <w:strike/>
         </w:rPr>
-        <w:t>3</w:t>
-      </w:r>
-      <w:r>
-        <w:t>)”</w:t>
-      </w:r>
-      <w:r>
-        <w:t>; abbreviate on-chart labels to “D/N: [ns, ., *, or ***]”, “Tows: [n]”, and “n: [n]”; make x-axis values easier to read</w:t>
+      </w:pPr>
+      <w:r>
+        <w:rPr>
+          <w:strike/>
+        </w:rPr>
+        <w:t>Indicator taxa table: first column indicating cluster, second column listing all indicator taxa for each cluster, third column with p-values</w:t>
       </w:r>
     </w:p>
     <w:p>
@@ -553,16 +763,16 @@
         </w:numPr>
       </w:pPr>
       <w:r>
-        <w:t>Line graph of concentration vs. depth by taxon</w:t>
-      </w:r>
-      <w:r>
-        <w:t xml:space="preserve"> with only abundant taxa</w:t>
-      </w:r>
-      <w:r>
-        <w:t>:</w:t>
-      </w:r>
-      <w:r>
-        <w:t xml:space="preserve"> try plotting concentrations of Ammodytidae instead of Isopsetta isolepis (I’m mostly curious why concentrations in the effect plot for the three-way interaction model seem to be zero, but the choice of taxon to represent cluster 5 is pretty subjective anyway); fix all formatting to match full line graph; add confidence interval ribbons back in</w:t>
+        <w:t xml:space="preserve">Single-species model table: display </w:t>
+      </w:r>
+      <w:r>
+        <w:t>z</w:t>
+      </w:r>
+      <w:r>
+        <w:t xml:space="preserve"> values and p-values for </w:t>
+      </w:r>
+      <w:r>
+        <w:t>regression terms for time of day, mean tow depth, and interaction between time of day and depth from single-species regression models in one table (need to make it very clear that these are from 4 separate models)</w:t>
       </w:r>
     </w:p>
     <w:p>
@@ -574,53 +784,16 @@
         </w:numPr>
       </w:pPr>
       <w:r>
-        <w:t>Ross: Make tables</w:t>
-      </w:r>
-    </w:p>
-    <w:p>
-      <w:pPr>
-        <w:pStyle w:val="ListParagraph"/>
-        <w:numPr>
-          <w:ilvl w:val="1"/>
-          <w:numId w:val="2"/>
-        </w:numPr>
-      </w:pPr>
-      <w:r>
-        <w:t>Indicator taxa table: first column indicating cluster, second column listing all indicator taxa for each cluster, third column with p-values</w:t>
-      </w:r>
-    </w:p>
-    <w:p>
-      <w:pPr>
-        <w:pStyle w:val="ListParagraph"/>
-        <w:numPr>
-          <w:ilvl w:val="1"/>
-          <w:numId w:val="2"/>
-        </w:numPr>
-      </w:pPr>
-      <w:r>
-        <w:t xml:space="preserve">Single-species model table: display </w:t>
-      </w:r>
-      <w:r>
-        <w:t>z</w:t>
-      </w:r>
-      <w:r>
-        <w:t xml:space="preserve"> values and p-values for </w:t>
-      </w:r>
-      <w:r>
-        <w:t>regression terms for time of day, mean tow depth, and interaction between time of day and depth from single-species regression models in one table (need to make it very clear that these are from 4 separate models)</w:t>
-      </w:r>
-    </w:p>
-    <w:p>
-      <w:pPr>
-        <w:pStyle w:val="ListParagraph"/>
-        <w:numPr>
-          <w:ilvl w:val="0"/>
-          <w:numId w:val="2"/>
-        </w:numPr>
-      </w:pPr>
-      <w:r>
         <w:lastRenderedPageBreak/>
-        <w:t>Ross: Add all figures and tables to a PowerPoint in the order that they will appear in the manuscript and write an outline of the results section and a short list of the main data-supported results of the paper</w:t>
+        <w:t xml:space="preserve">Ross: Add all figures and tables to a PowerPoint in </w:t>
+      </w:r>
+      <w:proofErr w:type="gramStart"/>
+      <w:r>
+        <w:t>the order</w:t>
+      </w:r>
+      <w:proofErr w:type="gramEnd"/>
+      <w:r>
+        <w:t xml:space="preserve"> that they will appear in the manuscript and write an outline of the results section and a short list of the main data-supported results of the paper</w:t>
       </w:r>
     </w:p>
     <w:sectPr>
@@ -674,7 +847,7 @@
         <w:rFonts w:ascii="Wingdings" w:hAnsi="Wingdings" w:hint="default"/>
       </w:rPr>
     </w:lvl>
-    <w:lvl w:ilvl="3" w:tplc="04090001" w:tentative="1">
+    <w:lvl w:ilvl="3" w:tplc="04090001">
       <w:start w:val="1"/>
       <w:numFmt w:val="bullet"/>
       <w:lvlText w:val=""/>
@@ -1471,7 +1644,6 @@
   <w:style w:type="character" w:default="1" w:styleId="DefaultParagraphFont">
     <w:name w:val="Default Paragraph Font"/>
     <w:uiPriority w:val="1"/>
-    <w:semiHidden/>
     <w:unhideWhenUsed/>
   </w:style>
   <w:style w:type="table" w:default="1" w:styleId="TableNormal">

</xml_diff>

<commit_message>
cross off completed tasks from next steps lisk
</commit_message>
<xml_diff>
--- a/Outline and next steps.docx
+++ b/Outline and next steps.docx
@@ -377,23 +377,29 @@
           <w:ilvl w:val="1"/>
           <w:numId w:val="2"/>
         </w:numPr>
-      </w:pPr>
-      <w:r>
+        <w:rPr>
+          <w:strike/>
+        </w:rPr>
+      </w:pPr>
+      <w:r>
+        <w:rPr>
+          <w:strike/>
+        </w:rPr>
         <w:t xml:space="preserve">Dendrogram: make colors of clusters consistent with other plots (make them more distinct </w:t>
       </w:r>
       <w:proofErr w:type="gramStart"/>
       <w:r>
+        <w:rPr>
+          <w:strike/>
+        </w:rPr>
         <w:t>than what</w:t>
       </w:r>
       <w:proofErr w:type="gramEnd"/>
       <w:r>
-        <w:t xml:space="preserve"> they currently are); </w:t>
-      </w:r>
-      <w:r>
         <w:rPr>
           <w:strike/>
         </w:rPr>
-        <w:t>make x-axis more descriptive and plain language</w:t>
+        <w:t xml:space="preserve"> they currently are); make x-axis more descriptive and plain language</w:t>
       </w:r>
     </w:p>
     <w:p>
@@ -1644,6 +1650,7 @@
   <w:style w:type="character" w:default="1" w:styleId="DefaultParagraphFont">
     <w:name w:val="Default Paragraph Font"/>
     <w:uiPriority w:val="1"/>
+    <w:semiHidden/>
     <w:unhideWhenUsed/>
   </w:style>
   <w:style w:type="table" w:default="1" w:styleId="TableNormal">

</xml_diff>

<commit_message>
Honestly, idk what changed it just appeared in my git window after i opened it
</commit_message>
<xml_diff>
--- a/Outline and next steps.docx
+++ b/Outline and next steps.docx
@@ -414,10 +414,13 @@
         </w:rPr>
       </w:pPr>
       <w:r>
-        <w:rPr>
-          <w:strike/>
-        </w:rPr>
-        <w:t xml:space="preserve">Stacked bar plot: order x-axis by cluster, remove faceting; change color scheme to </w:t>
+        <w:t>Stacked bar plot: order x-axis by cluster</w:t>
+      </w:r>
+      <w:r>
+        <w:rPr>
+          <w:strike/>
+        </w:rPr>
+        <w:t xml:space="preserve">, remove faceting; change color scheme to </w:t>
       </w:r>
       <w:proofErr w:type="spellStart"/>
       <w:r>
@@ -480,7 +483,10 @@
         <w:rPr>
           <w:strike/>
         </w:rPr>
-        <w:t>, legend title, x-axis values (give each tow a number based on order in time/date, then order x-axis by cluster first, then tow ID); make two versions (one with only the 4 main clusters, one with all clusters)</w:t>
+        <w:t xml:space="preserve">, legend title, x-axis values (give each tow a number based on order in time/date, </w:t>
+      </w:r>
+      <w:r>
+        <w:t>then order x-axis by cluster first, then tow ID); make two versions (one with only the 4 main clusters, one with all clusters)</w:t>
       </w:r>
     </w:p>
     <w:p>
@@ -495,19 +501,37 @@
         <w:t xml:space="preserve">Map colored by cluster: </w:t>
       </w:r>
       <w:r>
+        <w:rPr>
+          <w:strike/>
+        </w:rPr>
         <w:t>a</w:t>
       </w:r>
       <w:r>
+        <w:rPr>
+          <w:strike/>
+        </w:rPr>
         <w:t>rrange points</w:t>
       </w:r>
       <w:r>
+        <w:rPr>
+          <w:strike/>
+        </w:rPr>
         <w:t xml:space="preserve"> (and potentially set color darkness)</w:t>
       </w:r>
       <w:r>
+        <w:rPr>
+          <w:strike/>
+        </w:rPr>
         <w:t xml:space="preserve"> </w:t>
       </w:r>
       <w:r>
-        <w:t>by depth stratum; make color hues for each cluster more distinct (especially among the four major clusters); add “</w:t>
+        <w:rPr>
+          <w:strike/>
+        </w:rPr>
+        <w:t>by depth stratum; make color hues for each cluster more distinct (especially among the four major clusters);</w:t>
+      </w:r>
+      <w:r>
+        <w:t xml:space="preserve"> add “</w:t>
       </w:r>
       <w:proofErr w:type="spellStart"/>
       <w:r>
@@ -515,7 +539,13 @@
       </w:r>
       <w:proofErr w:type="spellEnd"/>
       <w:r>
-        <w:t xml:space="preserve"> to indicate location of tows that were excluded from analysis or had no fish; update axis titles, legend title, facet labels; add facets for each replicate in 2018 and 2019 and reduce area plotted in maps for 2018 and 2019; add state boundaries, add isobaths to chart area, remove gridlines from chart area</w:t>
+        <w:t xml:space="preserve"> to indicate location of tows that were excluded from analysis or had no fish; </w:t>
+      </w:r>
+      <w:r>
+        <w:rPr>
+          <w:strike/>
+        </w:rPr>
+        <w:t>update axis titles, legend title, facet labels; add facets for each replicate in 2018 and 2019 and reduce area plotted in maps for 2018 and 2019; add state boundaries, add isobaths to chart area, remove gridlines from chart area</w:t>
       </w:r>
     </w:p>
     <w:p>

</xml_diff>

<commit_message>
Cross off completed tasks. Make remaining tasks a different color so they're easier to see.
</commit_message>
<xml_diff>
--- a/Outline and next steps.docx
+++ b/Outline and next steps.docx
@@ -137,15 +137,7 @@
         </w:numPr>
       </w:pPr>
       <w:r>
-        <w:t>Distance-based redundancy analysis (</w:t>
-      </w:r>
-      <w:proofErr w:type="spellStart"/>
-      <w:r>
-        <w:t>db</w:t>
-      </w:r>
-      <w:proofErr w:type="spellEnd"/>
-      <w:r>
-        <w:t>-RDA) using spatiotemporal (e.g. year, time of day, latitude, seafloor depth, mean sampling depth) and environmental (e.g. temperature, salinity, dissolved oxygen, productivity) variables to explain variation in assemblage composition</w:t>
+        <w:t>Distance-based redundancy analysis (db-RDA) using spatiotemporal (e.g. year, time of day, latitude, seafloor depth, mean sampling depth) and environmental (e.g. temperature, salinity, dissolved oxygen, productivity) variables to explain variation in assemblage composition</w:t>
       </w:r>
     </w:p>
     <w:p>
@@ -172,23 +164,7 @@
         </w:numPr>
       </w:pPr>
       <w:r>
-        <w:t xml:space="preserve">Fit </w:t>
-      </w:r>
-      <w:proofErr w:type="spellStart"/>
-      <w:r>
-        <w:t>db</w:t>
-      </w:r>
-      <w:proofErr w:type="spellEnd"/>
-      <w:r>
-        <w:t>-RDA models using vegan::</w:t>
-      </w:r>
-      <w:proofErr w:type="spellStart"/>
-      <w:r>
-        <w:t>capscale</w:t>
-      </w:r>
-      <w:proofErr w:type="spellEnd"/>
-      <w:r>
-        <w:t xml:space="preserve"> and assess significance of individual environmental variables using </w:t>
+        <w:t xml:space="preserve">Fit db-RDA models using vegan::capscale and assess significance of individual environmental variables using </w:t>
       </w:r>
       <w:r>
         <w:t>vegan:: partial tests (see section 2.6 of Bleuel et al. 2024)</w:t>
@@ -203,23 +179,7 @@
         </w:numPr>
       </w:pPr>
       <w:r>
-        <w:t xml:space="preserve">Compare support for a base </w:t>
-      </w:r>
-      <w:proofErr w:type="spellStart"/>
-      <w:r>
-        <w:t>db</w:t>
-      </w:r>
-      <w:proofErr w:type="spellEnd"/>
-      <w:r>
-        <w:t xml:space="preserve">-RDA model that only uses spatiotemporal covariates to a full </w:t>
-      </w:r>
-      <w:proofErr w:type="spellStart"/>
-      <w:r>
-        <w:t>db</w:t>
-      </w:r>
-      <w:proofErr w:type="spellEnd"/>
-      <w:r>
-        <w:t xml:space="preserve">-RDA model that includes spatiotemporal and environmental covariates using ANOVA (see </w:t>
+        <w:t xml:space="preserve">Compare support for a base db-RDA model that only uses spatiotemporal covariates to a full db-RDA model that includes spatiotemporal and environmental covariates using ANOVA (see </w:t>
       </w:r>
       <w:r>
         <w:t>“Redundancy analysis” subsection of results in De Pascale et al. 2025)</w:t>
@@ -234,15 +194,7 @@
         </w:numPr>
       </w:pPr>
       <w:r>
-        <w:t xml:space="preserve">Plot model-constrained variation in assemblage composition, as explained by variables in </w:t>
-      </w:r>
-      <w:proofErr w:type="spellStart"/>
-      <w:r>
-        <w:t>db</w:t>
-      </w:r>
-      <w:proofErr w:type="spellEnd"/>
-      <w:r>
-        <w:t>-RDAs (see Fig. 2 in De Pascale et al. 2025)</w:t>
+        <w:t>Plot model-constrained variation in assemblage composition, as explained by variables in db-RDAs (see Fig. 2 in De Pascale et al. 2025)</w:t>
       </w:r>
     </w:p>
     <w:p>
@@ -255,15 +207,7 @@
       </w:pPr>
       <w:r>
         <w:lastRenderedPageBreak/>
-        <w:t xml:space="preserve">Variance partitioning analysis on </w:t>
-      </w:r>
-      <w:proofErr w:type="spellStart"/>
-      <w:r>
-        <w:t>dbRDA</w:t>
-      </w:r>
-      <w:proofErr w:type="spellEnd"/>
-      <w:r>
-        <w:t xml:space="preserve"> models to test how much variation in assemblage structure is explained by spatiotemporal variables alone, environmental variables alone, and is shared between them, as well as whether the fraction of variation explained by each is significantly different from zero</w:t>
+        <w:t>Variance partitioning analysis on dbRDA models to test how much variation in assemblage structure is explained by spatiotemporal variables alone, environmental variables alone, and is shared between them, as well as whether the fraction of variation explained by each is significantly different from zero</w:t>
       </w:r>
     </w:p>
     <w:p>
@@ -341,18 +285,19 @@
         <w:t xml:space="preserve">Ross: </w:t>
       </w:r>
       <w:r>
+        <w:rPr>
+          <w:color w:val="215E99" w:themeColor="text2" w:themeTint="BF"/>
+        </w:rPr>
         <w:t>Add a version of objective 2 &amp; 3 analyses with data for all clusters except for the main 4 clusters excluded from the data set to see if results change substantially</w:t>
       </w:r>
       <w:r>
-        <w:t xml:space="preserve"> (probably easiest </w:t>
-      </w:r>
-      <w:proofErr w:type="gramStart"/>
-      <w:r>
-        <w:t>to just</w:t>
-      </w:r>
-      <w:proofErr w:type="gramEnd"/>
-      <w:r>
-        <w:t xml:space="preserve"> make new scripts and filter the data set by cluster at the start of each)</w:t>
+        <w:rPr>
+          <w:color w:val="215E99" w:themeColor="text2" w:themeTint="BF"/>
+        </w:rPr>
+        <w:t xml:space="preserve"> (probably easiest to just make new scripts and filter the data set by cluster at the </w:t>
+      </w:r>
+      <w:r>
+        <w:t>start of each)</w:t>
       </w:r>
     </w:p>
     <w:p>
@@ -385,21 +330,7 @@
         <w:rPr>
           <w:strike/>
         </w:rPr>
-        <w:t xml:space="preserve">Dendrogram: make colors of clusters consistent with other plots (make them more distinct </w:t>
-      </w:r>
-      <w:proofErr w:type="gramStart"/>
-      <w:r>
-        <w:rPr>
-          <w:strike/>
-        </w:rPr>
-        <w:t>than what</w:t>
-      </w:r>
-      <w:proofErr w:type="gramEnd"/>
-      <w:r>
-        <w:rPr>
-          <w:strike/>
-        </w:rPr>
-        <w:t xml:space="preserve"> they currently are); make x-axis more descriptive and plain language</w:t>
+        <w:t>Dendrogram: make colors of clusters consistent with other plots (make them more distinct than what they currently are); make x-axis more descriptive and plain language</w:t>
       </w:r>
     </w:p>
     <w:p>
@@ -414,27 +345,16 @@
         </w:rPr>
       </w:pPr>
       <w:r>
+        <w:rPr>
+          <w:color w:val="215E99" w:themeColor="text2" w:themeTint="BF"/>
+        </w:rPr>
         <w:t>Stacked bar plot: order x-axis by cluster</w:t>
       </w:r>
       <w:r>
         <w:rPr>
           <w:strike/>
         </w:rPr>
-        <w:t xml:space="preserve">, remove faceting; change color scheme to </w:t>
-      </w:r>
-      <w:proofErr w:type="spellStart"/>
-      <w:r>
-        <w:rPr>
-          <w:strike/>
-        </w:rPr>
-        <w:t>mesopelagics</w:t>
-      </w:r>
-      <w:proofErr w:type="spellEnd"/>
-      <w:r>
-        <w:rPr>
-          <w:strike/>
-        </w:rPr>
-        <w:t>, flatfishes, and others</w:t>
+        <w:t>, remove faceting; change color scheme to mesopelagics, flatfishes, and others</w:t>
       </w:r>
       <w:r>
         <w:rPr>
@@ -486,6 +406,9 @@
         <w:t xml:space="preserve">, legend title, x-axis values (give each tow a number based on order in time/date, </w:t>
       </w:r>
       <w:r>
+        <w:rPr>
+          <w:color w:val="215E99" w:themeColor="text2" w:themeTint="BF"/>
+        </w:rPr>
         <w:t>then order x-axis by cluster first, then tow ID); make two versions (one with only the 4 main clusters, one with all clusters)</w:t>
       </w:r>
     </w:p>
@@ -528,18 +451,23 @@
         <w:rPr>
           <w:strike/>
         </w:rPr>
-        <w:t>by depth stratum; make color hues for each cluster more distinct (especially among the four major clusters);</w:t>
-      </w:r>
-      <w:r>
-        <w:t xml:space="preserve"> add “</w:t>
-      </w:r>
-      <w:proofErr w:type="spellStart"/>
-      <w:r>
-        <w:t>x”s</w:t>
-      </w:r>
-      <w:proofErr w:type="spellEnd"/>
-      <w:r>
-        <w:t xml:space="preserve"> to indicate location of tows that were excluded from analysis or had no fish; </w:t>
+        <w:t>by depth stratum; make color hues for each cluster more distinct (especially among the four major clusters</w:t>
+      </w:r>
+      <w:r>
+        <w:rPr>
+          <w:strike/>
+          <w:color w:val="215E99" w:themeColor="text2" w:themeTint="BF"/>
+        </w:rPr>
+        <w:t>);</w:t>
+      </w:r>
+      <w:r>
+        <w:rPr>
+          <w:color w:val="215E99" w:themeColor="text2" w:themeTint="BF"/>
+        </w:rPr>
+        <w:t xml:space="preserve"> add “x”s to indicate location of tows that were excluded from analysis or had no fish</w:t>
+      </w:r>
+      <w:r>
+        <w:t xml:space="preserve">; </w:t>
       </w:r>
       <w:r>
         <w:rPr>
@@ -555,11 +483,20 @@
           <w:ilvl w:val="1"/>
           <w:numId w:val="2"/>
         </w:numPr>
-      </w:pPr>
-      <w:r>
+        <w:rPr>
+          <w:color w:val="215E99" w:themeColor="text2" w:themeTint="BF"/>
+        </w:rPr>
+      </w:pPr>
+      <w:r>
+        <w:rPr>
+          <w:color w:val="215E99" w:themeColor="text2" w:themeTint="BF"/>
+        </w:rPr>
         <w:t>NMDS plot with no overlays: make a version with only the 4 main clusters</w:t>
       </w:r>
       <w:r>
+        <w:rPr>
+          <w:color w:val="215E99" w:themeColor="text2" w:themeTint="BF"/>
+        </w:rPr>
         <w:t xml:space="preserve"> </w:t>
       </w:r>
     </w:p>
@@ -572,42 +509,68 @@
         </w:numPr>
       </w:pPr>
       <w:r>
+        <w:rPr>
+          <w:strike/>
+        </w:rPr>
         <w:lastRenderedPageBreak/>
-        <w:t xml:space="preserve">NMDS plot with overlays: remove vectors for </w:t>
-      </w:r>
-      <w:proofErr w:type="spellStart"/>
-      <w:r>
-        <w:t>distance_to_shore_km</w:t>
-      </w:r>
-      <w:proofErr w:type="spellEnd"/>
-      <w:r>
-        <w:t xml:space="preserve"> and</w:t>
-      </w:r>
-      <w:r>
+        <w:t>NMDS plot with overlays: remove vectors for distance_to_shore_km and</w:t>
+      </w:r>
+      <w:r>
+        <w:rPr>
+          <w:strike/>
+        </w:rPr>
         <w:t xml:space="preserve"> </w:t>
       </w:r>
-      <w:proofErr w:type="spellStart"/>
-      <w:r>
-        <w:t>start_longitude_dd</w:t>
-      </w:r>
-      <w:proofErr w:type="spellEnd"/>
-      <w:r>
-        <w:t xml:space="preserve"> and ellipses for shelf position</w:t>
-      </w:r>
-      <w:r>
+      <w:r>
+        <w:rPr>
+          <w:strike/>
+        </w:rPr>
+        <w:t>start_longitude_dd and ellipses for shelf position</w:t>
+      </w:r>
+      <w:r>
+        <w:rPr>
+          <w:strike/>
+        </w:rPr>
         <w:t>; change color of “Day/Night” ellipses to black and make day ellipse a solid line</w:t>
       </w:r>
       <w:r>
+        <w:rPr>
+          <w:strike/>
+        </w:rPr>
         <w:t>; make year a factor so that one vector is plotted for each year; make a version with only the 4 main clusters</w:t>
       </w:r>
       <w:r>
+        <w:rPr>
+          <w:strike/>
+        </w:rPr>
         <w:t>; capitalize “cluster” in legend title</w:t>
       </w:r>
       <w:r>
+        <w:rPr>
+          <w:strike/>
+        </w:rPr>
         <w:t>; change “Day/Night” legend title to “Time of day”</w:t>
       </w:r>
       <w:r>
-        <w:t>; add code to save plot with reasonable dimensions (around 6.5” width x 5.5” height) and adjust text, symbols, lines, etc. to an appropriate size in the saved plot; make a version with only the 4 main clusters</w:t>
+        <w:rPr>
+          <w:strike/>
+        </w:rPr>
+        <w:t>; add code to save plot with reasonable dimensions (around 6.5” width x 5.5” height) and adjust text, symbols, lines, etc. to an appropriate size in the saved plot;</w:t>
+      </w:r>
+      <w:r>
+        <w:t xml:space="preserve"> </w:t>
+      </w:r>
+      <w:r>
+        <w:rPr>
+          <w:color w:val="215E99" w:themeColor="text2" w:themeTint="BF"/>
+        </w:rPr>
+        <w:t xml:space="preserve">make a version with only the 4 main </w:t>
+      </w:r>
+      <w:r>
+        <w:rPr>
+          <w:color w:val="215E99" w:themeColor="text2" w:themeTint="BF"/>
+        </w:rPr>
+        <w:t>clusters</w:t>
       </w:r>
     </w:p>
     <w:p>
@@ -618,16 +581,45 @@
           <w:numId w:val="2"/>
         </w:numPr>
       </w:pPr>
-      <w:proofErr w:type="spellStart"/>
-      <w:r>
-        <w:t>dbRDA</w:t>
-      </w:r>
-      <w:proofErr w:type="spellEnd"/>
-      <w:r>
-        <w:t xml:space="preserve"> plot:</w:t>
-      </w:r>
-      <w:r>
-        <w:t xml:space="preserve"> make legend titles, legend symbols, figure dimensions, point sizes, vector and ellipse thickness, etc. consistent with full NMDS plot</w:t>
+      <w:r>
+        <w:rPr>
+          <w:strike/>
+        </w:rPr>
+        <w:t>dbRDA plot:</w:t>
+      </w:r>
+      <w:r>
+        <w:rPr>
+          <w:strike/>
+        </w:rPr>
+        <w:t xml:space="preserve"> make legend titles,</w:t>
+      </w:r>
+      <w:r>
+        <w:t xml:space="preserve"> </w:t>
+      </w:r>
+      <w:commentRangeStart w:id="0"/>
+      <w:r>
+        <w:rPr>
+          <w:color w:val="215E99" w:themeColor="text2" w:themeTint="BF"/>
+        </w:rPr>
+        <w:t>legend symbols</w:t>
+      </w:r>
+      <w:commentRangeEnd w:id="0"/>
+      <w:r>
+        <w:rPr>
+          <w:rStyle w:val="CommentReference"/>
+          <w:sz w:val="24"/>
+          <w:szCs w:val="24"/>
+        </w:rPr>
+        <w:commentReference w:id="0"/>
+      </w:r>
+      <w:r>
+        <w:t xml:space="preserve">, </w:t>
+      </w:r>
+      <w:r>
+        <w:rPr>
+          <w:strike/>
+        </w:rPr>
+        <w:t>figure dimensions, point sizes, vector and ellipse thickness, etc. consistent with full NMDS plot</w:t>
       </w:r>
     </w:p>
     <w:p>
@@ -637,61 +629,99 @@
           <w:ilvl w:val="1"/>
           <w:numId w:val="2"/>
         </w:numPr>
-      </w:pPr>
-      <w:r>
+        <w:rPr>
+          <w:color w:val="215E99" w:themeColor="text2" w:themeTint="BF"/>
+        </w:rPr>
+      </w:pPr>
+      <w:r>
+        <w:rPr>
+          <w:color w:val="215E99" w:themeColor="text2" w:themeTint="BF"/>
+        </w:rPr>
         <w:t>Line graph of concentration vs. depth by taxon: update axis titles (make y-axis title “Concentration (ind./m</w:t>
       </w:r>
       <w:r>
         <w:rPr>
+          <w:color w:val="215E99" w:themeColor="text2" w:themeTint="BF"/>
           <w:vertAlign w:val="superscript"/>
         </w:rPr>
         <w:t>3</w:t>
       </w:r>
       <w:r>
+        <w:rPr>
+          <w:color w:val="215E99" w:themeColor="text2" w:themeTint="BF"/>
+        </w:rPr>
         <w:t>)”</w:t>
       </w:r>
       <w:r>
+        <w:rPr>
+          <w:color w:val="215E99" w:themeColor="text2" w:themeTint="BF"/>
+        </w:rPr>
         <w:t>;</w:t>
       </w:r>
       <w:r>
+        <w:rPr>
+          <w:color w:val="215E99" w:themeColor="text2" w:themeTint="BF"/>
+        </w:rPr>
         <w:t xml:space="preserve"> and make x-axis title “Mean tow depth (m)”)</w:t>
       </w:r>
       <w:r>
+        <w:rPr>
+          <w:color w:val="215E99" w:themeColor="text2" w:themeTint="BF"/>
+        </w:rPr>
         <w:t>;</w:t>
       </w:r>
       <w:r>
+        <w:rPr>
+          <w:color w:val="215E99" w:themeColor="text2" w:themeTint="BF"/>
+        </w:rPr>
         <w:t xml:space="preserve"> check y-axis values (probably shouldn’t be negative, zeros would be undefined (although we need to figure out how to still include them in the plot))</w:t>
       </w:r>
       <w:r>
+        <w:rPr>
+          <w:color w:val="215E99" w:themeColor="text2" w:themeTint="BF"/>
+        </w:rPr>
         <w:t>;</w:t>
       </w:r>
       <w:r>
+        <w:rPr>
+          <w:color w:val="215E99" w:themeColor="text2" w:themeTint="BF"/>
+        </w:rPr>
         <w:t xml:space="preserve"> capitalize legend title</w:t>
       </w:r>
       <w:r>
+        <w:rPr>
+          <w:color w:val="215E99" w:themeColor="text2" w:themeTint="BF"/>
+        </w:rPr>
         <w:t>;</w:t>
       </w:r>
       <w:r>
-        <w:t xml:space="preserve"> change taxon names to proper formatting (italicize, replace underscores with spaces, add periods after each “</w:t>
-      </w:r>
-      <w:proofErr w:type="spellStart"/>
-      <w:r>
-        <w:t>spp</w:t>
-      </w:r>
-      <w:proofErr w:type="spellEnd"/>
-      <w:r>
-        <w:t>”)</w:t>
-      </w:r>
-      <w:r>
+        <w:rPr>
+          <w:color w:val="215E99" w:themeColor="text2" w:themeTint="BF"/>
+        </w:rPr>
+        <w:t xml:space="preserve"> change taxon names to proper formatting (italicize, replace underscores with spaces, add periods after each “spp”)</w:t>
+      </w:r>
+      <w:r>
+        <w:rPr>
+          <w:color w:val="215E99" w:themeColor="text2" w:themeTint="BF"/>
+        </w:rPr>
         <w:t>;</w:t>
       </w:r>
       <w:r>
+        <w:rPr>
+          <w:color w:val="215E99" w:themeColor="text2" w:themeTint="BF"/>
+        </w:rPr>
         <w:t xml:space="preserve"> rotate x-axis values back to 0</w:t>
       </w:r>
       <w:r>
+        <w:rPr>
+          <w:color w:val="215E99" w:themeColor="text2" w:themeTint="BF"/>
+        </w:rPr>
         <w:t>;</w:t>
       </w:r>
       <w:r>
+        <w:rPr>
+          <w:color w:val="215E99" w:themeColor="text2" w:themeTint="BF"/>
+        </w:rPr>
         <w:t xml:space="preserve"> change colors to be consistent with stacked bar plots</w:t>
       </w:r>
     </w:p>
@@ -702,26 +732,28 @@
           <w:ilvl w:val="1"/>
           <w:numId w:val="2"/>
         </w:numPr>
-      </w:pPr>
-      <w:r>
+        <w:rPr>
+          <w:color w:val="215E99" w:themeColor="text2" w:themeTint="BF"/>
+        </w:rPr>
+      </w:pPr>
+      <w:r>
+        <w:rPr>
+          <w:color w:val="215E99" w:themeColor="text2" w:themeTint="BF"/>
+        </w:rPr>
         <w:t>Effect plot for three-way intercept model: change taxon names to proper formatting; change colors to be color-blind friendly; change x-axis title to “Predicted concentration (ind./m</w:t>
       </w:r>
       <w:r>
         <w:rPr>
+          <w:color w:val="215E99" w:themeColor="text2" w:themeTint="BF"/>
           <w:vertAlign w:val="superscript"/>
         </w:rPr>
         <w:t>3</w:t>
       </w:r>
       <w:r>
-        <w:t>)”; abbreviate on-chart labels to “D/N: [ns</w:t>
-      </w:r>
-      <w:proofErr w:type="gramStart"/>
-      <w:r>
-        <w:t>, .</w:t>
-      </w:r>
-      <w:proofErr w:type="gramEnd"/>
-      <w:r>
-        <w:t>, *, or ***]”, “Tows: [n]”, and “n: [n]”; make x-axis values easier to read</w:t>
+        <w:rPr>
+          <w:color w:val="215E99" w:themeColor="text2" w:themeTint="BF"/>
+        </w:rPr>
+        <w:t>)”; abbreviate on-chart labels to “D/N: [ns, ., *, or ***]”, “Tows: [n]”, and “n: [n]”; make x-axis values easier to read</w:t>
       </w:r>
     </w:p>
     <w:p>
@@ -731,33 +763,15 @@
           <w:ilvl w:val="1"/>
           <w:numId w:val="2"/>
         </w:numPr>
-      </w:pPr>
-      <w:r>
-        <w:t xml:space="preserve">Line graph of concentration vs. depth by taxon with only abundant taxa: try plotting concentrations of </w:t>
-      </w:r>
-      <w:proofErr w:type="spellStart"/>
-      <w:r>
-        <w:t>Ammodytidae</w:t>
-      </w:r>
-      <w:proofErr w:type="spellEnd"/>
-      <w:r>
-        <w:t xml:space="preserve"> instead of </w:t>
-      </w:r>
-      <w:proofErr w:type="spellStart"/>
-      <w:r>
-        <w:t>Isopsetta</w:t>
-      </w:r>
-      <w:proofErr w:type="spellEnd"/>
-      <w:r>
-        <w:t xml:space="preserve"> </w:t>
-      </w:r>
-      <w:proofErr w:type="spellStart"/>
-      <w:r>
-        <w:t>isolepis</w:t>
-      </w:r>
-      <w:proofErr w:type="spellEnd"/>
-      <w:r>
-        <w:t xml:space="preserve"> (I’m mostly curious why concentrations in the effect plot for the three-way interaction model seem to be zero, but the choice of taxon to represent cluster 5 is pretty subjective anyway); fix all formatting to match full line graph; add confidence interval ribbons back in</w:t>
+        <w:rPr>
+          <w:color w:val="215E99" w:themeColor="text2" w:themeTint="BF"/>
+        </w:rPr>
+      </w:pPr>
+      <w:r>
+        <w:rPr>
+          <w:color w:val="215E99" w:themeColor="text2" w:themeTint="BF"/>
+        </w:rPr>
+        <w:t>Line graph of concentration vs. depth by taxon with only abundant taxa: try plotting concentrations of Ammodytidae instead of Isopsetta isolepis (I’m mostly curious why concentrations in the effect plot for the three-way interaction model seem to be zero, but the choice of taxon to represent cluster 5 is pretty subjective anyway); fix all formatting to match full line graph; add confidence interval ribbons back in</w:t>
       </w:r>
     </w:p>
     <w:p>
@@ -797,17 +811,32 @@
           <w:ilvl w:val="1"/>
           <w:numId w:val="2"/>
         </w:numPr>
-      </w:pPr>
-      <w:r>
+        <w:rPr>
+          <w:color w:val="215E99" w:themeColor="text2" w:themeTint="BF"/>
+        </w:rPr>
+      </w:pPr>
+      <w:r>
+        <w:rPr>
+          <w:color w:val="215E99" w:themeColor="text2" w:themeTint="BF"/>
+        </w:rPr>
         <w:t xml:space="preserve">Single-species model table: display </w:t>
       </w:r>
       <w:r>
+        <w:rPr>
+          <w:color w:val="215E99" w:themeColor="text2" w:themeTint="BF"/>
+        </w:rPr>
         <w:t>z</w:t>
       </w:r>
       <w:r>
+        <w:rPr>
+          <w:color w:val="215E99" w:themeColor="text2" w:themeTint="BF"/>
+        </w:rPr>
         <w:t xml:space="preserve"> values and p-values for </w:t>
       </w:r>
       <w:r>
+        <w:rPr>
+          <w:color w:val="215E99" w:themeColor="text2" w:themeTint="BF"/>
+        </w:rPr>
         <w:t>regression terms for time of day, mean tow depth, and interaction between time of day and depth from single-species regression models in one table (need to make it very clear that these are from 4 separate models)</w:t>
       </w:r>
     </w:p>
@@ -821,15 +850,13 @@
       </w:pPr>
       <w:r>
         <w:lastRenderedPageBreak/>
-        <w:t xml:space="preserve">Ross: Add all figures and tables to a PowerPoint in </w:t>
-      </w:r>
-      <w:proofErr w:type="gramStart"/>
-      <w:r>
-        <w:t>the order</w:t>
-      </w:r>
-      <w:proofErr w:type="gramEnd"/>
-      <w:r>
-        <w:t xml:space="preserve"> that they will appear in the manuscript and write an outline of the results section and a short list of the main data-supported results of the paper</w:t>
+        <w:t xml:space="preserve">Ross: </w:t>
+      </w:r>
+      <w:r>
+        <w:rPr>
+          <w:color w:val="215E99" w:themeColor="text2" w:themeTint="BF"/>
+        </w:rPr>
+        <w:t>Add all figures and tables to a PowerPoint in the order that they will appear in the manuscript and write an outline of the results section and a short list of the main data-supported results of the paper</w:t>
       </w:r>
     </w:p>
     <w:sectPr>
@@ -840,6 +867,45 @@
     </w:sectPr>
   </w:body>
 </w:document>
+</file>
+
+<file path=word/comments.xml><?xml version="1.0" encoding="utf-8"?>
+<w:comments xmlns:wpc="http://schemas.microsoft.com/office/word/2010/wordprocessingCanvas" xmlns:cx="http://schemas.microsoft.com/office/drawing/2014/chartex" xmlns:cx1="http://schemas.microsoft.com/office/drawing/2015/9/8/chartex" xmlns:cx2="http://schemas.microsoft.com/office/drawing/2015/10/21/chartex" xmlns:cx3="http://schemas.microsoft.com/office/drawing/2016/5/9/chartex" xmlns:cx4="http://schemas.microsoft.com/office/drawing/2016/5/10/chartex" xmlns:cx5="http://schemas.microsoft.com/office/drawing/2016/5/11/chartex" xmlns:cx6="http://schemas.microsoft.com/office/drawing/2016/5/12/chartex" xmlns:cx7="http://schemas.microsoft.com/office/drawing/2016/5/13/chartex" xmlns:cx8="http://schemas.microsoft.com/office/drawing/2016/5/14/chartex" xmlns:mc="http://schemas.openxmlformats.org/markup-compatibility/2006" xmlns:aink="http://schemas.microsoft.com/office/drawing/2016/ink" xmlns:am3d="http://schemas.microsoft.com/office/drawing/2017/model3d" xmlns:o="urn:schemas-microsoft-com:office:office" xmlns:oel="http://schemas.microsoft.com/office/2019/extlst" xmlns:r="http://schemas.openxmlformats.org/officeDocument/2006/relationships" xmlns:m="http://schemas.openxmlformats.org/officeDocument/2006/math" xmlns:v="urn:schemas-microsoft-com:vml" xmlns:wp14="http://schemas.microsoft.com/office/word/2010/wordprocessingDrawing" xmlns:wp="http://schemas.openxmlformats.org/drawingml/2006/wordprocessingDrawing" xmlns:w10="urn:schemas-microsoft-com:office:word" xmlns:w="http://schemas.openxmlformats.org/wordprocessingml/2006/main" xmlns:w14="http://schemas.microsoft.com/office/word/2010/wordml" xmlns:w15="http://schemas.microsoft.com/office/word/2012/wordml" xmlns:w16cex="http://schemas.microsoft.com/office/word/2018/wordml/cex" xmlns:w16cid="http://schemas.microsoft.com/office/word/2016/wordml/cid" xmlns:w16="http://schemas.microsoft.com/office/word/2018/wordml" xmlns:w16du="http://schemas.microsoft.com/office/word/2023/wordml/word16du" xmlns:w16sdtdh="http://schemas.microsoft.com/office/word/2020/wordml/sdtdatahash" xmlns:w16sdtfl="http://schemas.microsoft.com/office/word/2024/wordml/sdtformatlock" xmlns:w16se="http://schemas.microsoft.com/office/word/2015/wordml/symex" xmlns:wpg="http://schemas.microsoft.com/office/word/2010/wordprocessingGroup" xmlns:wpi="http://schemas.microsoft.com/office/word/2010/wordprocessingInk" xmlns:wne="http://schemas.microsoft.com/office/word/2006/wordml" xmlns:wps="http://schemas.microsoft.com/office/word/2010/wordprocessingShape" mc:Ignorable="w14 w15 w16se w16cid w16 w16cex w16sdtdh w16sdtfl w16du wp14">
+  <w:comment w:id="0" w:author="McCloskey, Ross" w:date="2026-05-30T16:32:00Z" w:initials="RM">
+    <w:p>
+      <w:pPr>
+        <w:pStyle w:val="CommentText"/>
+      </w:pPr>
+      <w:r>
+        <w:rPr>
+          <w:rStyle w:val="CommentReference"/>
+        </w:rPr>
+        <w:annotationRef/>
+      </w:r>
+      <w:r>
+        <w:t>I’m getting stuck on how to make the cluster symbols (polygon color and point) in the legend the same as in the NMDS</w:t>
+      </w:r>
+    </w:p>
+  </w:comment>
+</w:comments>
+</file>
+
+<file path=word/commentsExtended.xml><?xml version="1.0" encoding="utf-8"?>
+<w15:commentsEx xmlns:wpc="http://schemas.microsoft.com/office/word/2010/wordprocessingCanvas" xmlns:cx="http://schemas.microsoft.com/office/drawing/2014/chartex" xmlns:cx1="http://schemas.microsoft.com/office/drawing/2015/9/8/chartex" xmlns:cx2="http://schemas.microsoft.com/office/drawing/2015/10/21/chartex" xmlns:cx3="http://schemas.microsoft.com/office/drawing/2016/5/9/chartex" xmlns:cx4="http://schemas.microsoft.com/office/drawing/2016/5/10/chartex" xmlns:cx5="http://schemas.microsoft.com/office/drawing/2016/5/11/chartex" xmlns:cx6="http://schemas.microsoft.com/office/drawing/2016/5/12/chartex" xmlns:cx7="http://schemas.microsoft.com/office/drawing/2016/5/13/chartex" xmlns:cx8="http://schemas.microsoft.com/office/drawing/2016/5/14/chartex" xmlns:mc="http://schemas.openxmlformats.org/markup-compatibility/2006" xmlns:aink="http://schemas.microsoft.com/office/drawing/2016/ink" xmlns:am3d="http://schemas.microsoft.com/office/drawing/2017/model3d" xmlns:o="urn:schemas-microsoft-com:office:office" xmlns:oel="http://schemas.microsoft.com/office/2019/extlst" xmlns:r="http://schemas.openxmlformats.org/officeDocument/2006/relationships" xmlns:m="http://schemas.openxmlformats.org/officeDocument/2006/math" xmlns:v="urn:schemas-microsoft-com:vml" xmlns:wp14="http://schemas.microsoft.com/office/word/2010/wordprocessingDrawing" xmlns:wp="http://schemas.openxmlformats.org/drawingml/2006/wordprocessingDrawing" xmlns:w10="urn:schemas-microsoft-com:office:word" xmlns:w="http://schemas.openxmlformats.org/wordprocessingml/2006/main" xmlns:w14="http://schemas.microsoft.com/office/word/2010/wordml" xmlns:w15="http://schemas.microsoft.com/office/word/2012/wordml" xmlns:w16cex="http://schemas.microsoft.com/office/word/2018/wordml/cex" xmlns:w16cid="http://schemas.microsoft.com/office/word/2016/wordml/cid" xmlns:w16="http://schemas.microsoft.com/office/word/2018/wordml" xmlns:w16du="http://schemas.microsoft.com/office/word/2023/wordml/word16du" xmlns:w16sdtdh="http://schemas.microsoft.com/office/word/2020/wordml/sdtdatahash" xmlns:w16sdtfl="http://schemas.microsoft.com/office/word/2024/wordml/sdtformatlock" xmlns:w16se="http://schemas.microsoft.com/office/word/2015/wordml/symex" xmlns:wpg="http://schemas.microsoft.com/office/word/2010/wordprocessingGroup" xmlns:wpi="http://schemas.microsoft.com/office/word/2010/wordprocessingInk" xmlns:wne="http://schemas.microsoft.com/office/word/2006/wordml" xmlns:wps="http://schemas.microsoft.com/office/word/2010/wordprocessingShape" mc:Ignorable="w14 w15 w16se w16cid w16 w16cex w16sdtdh w16sdtfl w16du wp14">
+  <w15:commentEx w15:paraId="5A87D2E1" w15:done="0"/>
+</w15:commentsEx>
+</file>
+
+<file path=word/commentsExtensible.xml><?xml version="1.0" encoding="utf-8"?>
+<w16cex:commentsExtensible xmlns:wpc="http://schemas.microsoft.com/office/word/2010/wordprocessingCanvas" xmlns:cx="http://schemas.microsoft.com/office/drawing/2014/chartex" xmlns:cx1="http://schemas.microsoft.com/office/drawing/2015/9/8/chartex" xmlns:cx2="http://schemas.microsoft.com/office/drawing/2015/10/21/chartex" xmlns:cx3="http://schemas.microsoft.com/office/drawing/2016/5/9/chartex" xmlns:cx4="http://schemas.microsoft.com/office/drawing/2016/5/10/chartex" xmlns:cx5="http://schemas.microsoft.com/office/drawing/2016/5/11/chartex" xmlns:cx6="http://schemas.microsoft.com/office/drawing/2016/5/12/chartex" xmlns:cx7="http://schemas.microsoft.com/office/drawing/2016/5/13/chartex" xmlns:cx8="http://schemas.microsoft.com/office/drawing/2016/5/14/chartex" xmlns:cr="http://schemas.microsoft.com/office/comments/2020/reactions" xmlns:mc="http://schemas.openxmlformats.org/markup-compatibility/2006" xmlns:aink="http://schemas.microsoft.com/office/drawing/2016/ink" xmlns:am3d="http://schemas.microsoft.com/office/drawing/2017/model3d" xmlns:o="urn:schemas-microsoft-com:office:office" xmlns:oel="http://schemas.microsoft.com/office/2019/extlst" xmlns:r="http://schemas.openxmlformats.org/officeDocument/2006/relationships" xmlns:m="http://schemas.openxmlformats.org/officeDocument/2006/math" xmlns:v="urn:schemas-microsoft-com:vml" xmlns:wp14="http://schemas.microsoft.com/office/word/2010/wordprocessingDrawing" xmlns:wp="http://schemas.openxmlformats.org/drawingml/2006/wordprocessingDrawing" xmlns:w10="urn:schemas-microsoft-com:office:word" xmlns:w="http://schemas.openxmlformats.org/wordprocessingml/2006/main" xmlns:w14="http://schemas.microsoft.com/office/word/2010/wordml" xmlns:w15="http://schemas.microsoft.com/office/word/2012/wordml" xmlns:w16cex="http://schemas.microsoft.com/office/word/2018/wordml/cex" xmlns:w16cid="http://schemas.microsoft.com/office/word/2016/wordml/cid" xmlns:w16="http://schemas.microsoft.com/office/word/2018/wordml" xmlns:w16du="http://schemas.microsoft.com/office/word/2023/wordml/word16du" xmlns:w16sdtdh="http://schemas.microsoft.com/office/word/2020/wordml/sdtdatahash" xmlns:w16sdtfl="http://schemas.microsoft.com/office/word/2024/wordml/sdtformatlock" xmlns:w16se="http://schemas.microsoft.com/office/word/2015/wordml/symex" xmlns:wpg="http://schemas.microsoft.com/office/word/2010/wordprocessingGroup" xmlns:wpi="http://schemas.microsoft.com/office/word/2010/wordprocessingInk" xmlns:wne="http://schemas.microsoft.com/office/word/2006/wordml" xmlns:wps="http://schemas.microsoft.com/office/word/2010/wordprocessingShape" mc:Ignorable="w14 w15 w16se w16cid w16 w16cex w16sdtdh w16sdtfl cr w16du wp14">
+  <w16cex:commentExtensible w16cex:durableId="0022E673" w16cex:dateUtc="2026-05-30T23:32:00Z"/>
+</w16cex:commentsExtensible>
+</file>
+
+<file path=word/commentsIds.xml><?xml version="1.0" encoding="utf-8"?>
+<w16cid:commentsIds xmlns:wpc="http://schemas.microsoft.com/office/word/2010/wordprocessingCanvas" xmlns:cx="http://schemas.microsoft.com/office/drawing/2014/chartex" xmlns:cx1="http://schemas.microsoft.com/office/drawing/2015/9/8/chartex" xmlns:cx2="http://schemas.microsoft.com/office/drawing/2015/10/21/chartex" xmlns:cx3="http://schemas.microsoft.com/office/drawing/2016/5/9/chartex" xmlns:cx4="http://schemas.microsoft.com/office/drawing/2016/5/10/chartex" xmlns:cx5="http://schemas.microsoft.com/office/drawing/2016/5/11/chartex" xmlns:cx6="http://schemas.microsoft.com/office/drawing/2016/5/12/chartex" xmlns:cx7="http://schemas.microsoft.com/office/drawing/2016/5/13/chartex" xmlns:cx8="http://schemas.microsoft.com/office/drawing/2016/5/14/chartex" xmlns:mc="http://schemas.openxmlformats.org/markup-compatibility/2006" xmlns:aink="http://schemas.microsoft.com/office/drawing/2016/ink" xmlns:am3d="http://schemas.microsoft.com/office/drawing/2017/model3d" xmlns:o="urn:schemas-microsoft-com:office:office" xmlns:oel="http://schemas.microsoft.com/office/2019/extlst" xmlns:r="http://schemas.openxmlformats.org/officeDocument/2006/relationships" xmlns:m="http://schemas.openxmlformats.org/officeDocument/2006/math" xmlns:v="urn:schemas-microsoft-com:vml" xmlns:wp14="http://schemas.microsoft.com/office/word/2010/wordprocessingDrawing" xmlns:wp="http://schemas.openxmlformats.org/drawingml/2006/wordprocessingDrawing" xmlns:w10="urn:schemas-microsoft-com:office:word" xmlns:w="http://schemas.openxmlformats.org/wordprocessingml/2006/main" xmlns:w14="http://schemas.microsoft.com/office/word/2010/wordml" xmlns:w15="http://schemas.microsoft.com/office/word/2012/wordml" xmlns:w16cex="http://schemas.microsoft.com/office/word/2018/wordml/cex" xmlns:w16cid="http://schemas.microsoft.com/office/word/2016/wordml/cid" xmlns:w16="http://schemas.microsoft.com/office/word/2018/wordml" xmlns:w16du="http://schemas.microsoft.com/office/word/2023/wordml/word16du" xmlns:w16sdtdh="http://schemas.microsoft.com/office/word/2020/wordml/sdtdatahash" xmlns:w16sdtfl="http://schemas.microsoft.com/office/word/2024/wordml/sdtformatlock" xmlns:w16se="http://schemas.microsoft.com/office/word/2015/wordml/symex" xmlns:wpg="http://schemas.microsoft.com/office/word/2010/wordprocessingGroup" xmlns:wpi="http://schemas.microsoft.com/office/word/2010/wordprocessingInk" xmlns:wne="http://schemas.microsoft.com/office/word/2006/wordml" xmlns:wps="http://schemas.microsoft.com/office/word/2010/wordprocessingShape" mc:Ignorable="w14 w15 w16se w16cid w16 w16cex w16sdtdh w16sdtfl w16du wp14">
+  <w16cid:commentId w16cid:paraId="5A87D2E1" w16cid:durableId="0022E673"/>
+</w16cid:commentsIds>
 </file>
 
 <file path=word/numbering.xml><?xml version="1.0" encoding="utf-8"?>
@@ -1075,6 +1141,14 @@
     <w:abstractNumId w:val="0"/>
   </w:num>
 </w:numbering>
+</file>
+
+<file path=word/people.xml><?xml version="1.0" encoding="utf-8"?>
+<w15:people xmlns:wpc="http://schemas.microsoft.com/office/word/2010/wordprocessingCanvas" xmlns:cx="http://schemas.microsoft.com/office/drawing/2014/chartex" xmlns:cx1="http://schemas.microsoft.com/office/drawing/2015/9/8/chartex" xmlns:cx2="http://schemas.microsoft.com/office/drawing/2015/10/21/chartex" xmlns:cx3="http://schemas.microsoft.com/office/drawing/2016/5/9/chartex" xmlns:cx4="http://schemas.microsoft.com/office/drawing/2016/5/10/chartex" xmlns:cx5="http://schemas.microsoft.com/office/drawing/2016/5/11/chartex" xmlns:cx6="http://schemas.microsoft.com/office/drawing/2016/5/12/chartex" xmlns:cx7="http://schemas.microsoft.com/office/drawing/2016/5/13/chartex" xmlns:cx8="http://schemas.microsoft.com/office/drawing/2016/5/14/chartex" xmlns:mc="http://schemas.openxmlformats.org/markup-compatibility/2006" xmlns:aink="http://schemas.microsoft.com/office/drawing/2016/ink" xmlns:am3d="http://schemas.microsoft.com/office/drawing/2017/model3d" xmlns:o="urn:schemas-microsoft-com:office:office" xmlns:oel="http://schemas.microsoft.com/office/2019/extlst" xmlns:r="http://schemas.openxmlformats.org/officeDocument/2006/relationships" xmlns:m="http://schemas.openxmlformats.org/officeDocument/2006/math" xmlns:v="urn:schemas-microsoft-com:vml" xmlns:wp14="http://schemas.microsoft.com/office/word/2010/wordprocessingDrawing" xmlns:wp="http://schemas.openxmlformats.org/drawingml/2006/wordprocessingDrawing" xmlns:w10="urn:schemas-microsoft-com:office:word" xmlns:w="http://schemas.openxmlformats.org/wordprocessingml/2006/main" xmlns:w14="http://schemas.microsoft.com/office/word/2010/wordml" xmlns:w15="http://schemas.microsoft.com/office/word/2012/wordml" xmlns:w16cex="http://schemas.microsoft.com/office/word/2018/wordml/cex" xmlns:w16cid="http://schemas.microsoft.com/office/word/2016/wordml/cid" xmlns:w16="http://schemas.microsoft.com/office/word/2018/wordml" xmlns:w16du="http://schemas.microsoft.com/office/word/2023/wordml/word16du" xmlns:w16sdtdh="http://schemas.microsoft.com/office/word/2020/wordml/sdtdatahash" xmlns:w16sdtfl="http://schemas.microsoft.com/office/word/2024/wordml/sdtformatlock" xmlns:w16se="http://schemas.microsoft.com/office/word/2015/wordml/symex" xmlns:wpg="http://schemas.microsoft.com/office/word/2010/wordprocessingGroup" xmlns:wpi="http://schemas.microsoft.com/office/word/2010/wordprocessingInk" xmlns:wne="http://schemas.microsoft.com/office/word/2006/wordml" xmlns:wps="http://schemas.microsoft.com/office/word/2010/wordprocessingShape" mc:Ignorable="w14 w15 w16se w16cid w16 w16cex w16sdtdh w16sdtfl w16du wp14">
+  <w15:person w15:author="McCloskey, Ross">
+    <w15:presenceInfo w15:providerId="AD" w15:userId="S::mccloskw@oregonstate.edu::b1990487-ee44-4922-b58f-5b2980a02730"/>
+  </w15:person>
+</w15:people>
 </file>
 
 <file path=word/styles.xml><?xml version="1.0" encoding="utf-8"?>
@@ -1680,7 +1754,6 @@
   <w:style w:type="character" w:default="1" w:styleId="DefaultParagraphFont">
     <w:name w:val="Default Paragraph Font"/>
     <w:uiPriority w:val="1"/>
-    <w:semiHidden/>
     <w:unhideWhenUsed/>
   </w:style>
   <w:style w:type="table" w:default="1" w:styleId="TableNormal">
@@ -1992,6 +2065,72 @@
       <w:smallCaps/>
       <w:color w:val="0F4761" w:themeColor="accent1" w:themeShade="BF"/>
       <w:spacing w:val="5"/>
+    </w:rPr>
+  </w:style>
+  <w:style w:type="character" w:styleId="CommentReference">
+    <w:name w:val="annotation reference"/>
+    <w:basedOn w:val="DefaultParagraphFont"/>
+    <w:uiPriority w:val="99"/>
+    <w:semiHidden/>
+    <w:unhideWhenUsed/>
+    <w:rsid w:val="00165269"/>
+    <w:rPr>
+      <w:sz w:val="16"/>
+      <w:szCs w:val="16"/>
+    </w:rPr>
+  </w:style>
+  <w:style w:type="paragraph" w:styleId="CommentText">
+    <w:name w:val="annotation text"/>
+    <w:basedOn w:val="Normal"/>
+    <w:link w:val="CommentTextChar"/>
+    <w:uiPriority w:val="99"/>
+    <w:unhideWhenUsed/>
+    <w:rsid w:val="00165269"/>
+    <w:pPr>
+      <w:spacing w:line="240" w:lineRule="auto"/>
+    </w:pPr>
+    <w:rPr>
+      <w:sz w:val="20"/>
+      <w:szCs w:val="20"/>
+    </w:rPr>
+  </w:style>
+  <w:style w:type="character" w:customStyle="1" w:styleId="CommentTextChar">
+    <w:name w:val="Comment Text Char"/>
+    <w:basedOn w:val="DefaultParagraphFont"/>
+    <w:link w:val="CommentText"/>
+    <w:uiPriority w:val="99"/>
+    <w:rsid w:val="00165269"/>
+    <w:rPr>
+      <w:sz w:val="20"/>
+      <w:szCs w:val="20"/>
+    </w:rPr>
+  </w:style>
+  <w:style w:type="paragraph" w:styleId="CommentSubject">
+    <w:name w:val="annotation subject"/>
+    <w:basedOn w:val="CommentText"/>
+    <w:next w:val="CommentText"/>
+    <w:link w:val="CommentSubjectChar"/>
+    <w:uiPriority w:val="99"/>
+    <w:semiHidden/>
+    <w:unhideWhenUsed/>
+    <w:rsid w:val="00165269"/>
+    <w:rPr>
+      <w:b/>
+      <w:bCs/>
+    </w:rPr>
+  </w:style>
+  <w:style w:type="character" w:customStyle="1" w:styleId="CommentSubjectChar">
+    <w:name w:val="Comment Subject Char"/>
+    <w:basedOn w:val="CommentTextChar"/>
+    <w:link w:val="CommentSubject"/>
+    <w:uiPriority w:val="99"/>
+    <w:semiHidden/>
+    <w:rsid w:val="00165269"/>
+    <w:rPr>
+      <w:b/>
+      <w:bCs/>
+      <w:sz w:val="20"/>
+      <w:szCs w:val="20"/>
     </w:rPr>
   </w:style>
 </w:styles>

</xml_diff>

<commit_message>
Check off completed steps. Left some comments where I have questions.
</commit_message>
<xml_diff>
--- a/Outline and next steps.docx
+++ b/Outline and next steps.docx
@@ -637,44 +637,106 @@
         <w:rPr>
           <w:color w:val="215E99" w:themeColor="text2" w:themeTint="BF"/>
         </w:rPr>
-        <w:t>Line graph of concentration vs. depth by taxon: update axis titles (make y-axis title “Concentration (ind./m</w:t>
-      </w:r>
-      <w:r>
-        <w:rPr>
-          <w:color w:val="215E99" w:themeColor="text2" w:themeTint="BF"/>
+        <w:t>Line graph of concentration vs. depth by taxon:</w:t>
+      </w:r>
+      <w:r>
+        <w:rPr>
+          <w:strike/>
+          <w:color w:val="000000" w:themeColor="text1"/>
+        </w:rPr>
+        <w:t xml:space="preserve"> update axis titles (make y-axis title “</w:t>
+      </w:r>
+      <w:commentRangeStart w:id="1"/>
+      <w:r>
+        <w:rPr>
+          <w:strike/>
+          <w:color w:val="000000" w:themeColor="text1"/>
+        </w:rPr>
+        <w:t>Concentration (ind./m</w:t>
+      </w:r>
+      <w:r>
+        <w:rPr>
+          <w:strike/>
+          <w:color w:val="000000" w:themeColor="text1"/>
           <w:vertAlign w:val="superscript"/>
         </w:rPr>
         <w:t>3</w:t>
       </w:r>
       <w:r>
         <w:rPr>
-          <w:color w:val="215E99" w:themeColor="text2" w:themeTint="BF"/>
-        </w:rPr>
-        <w:t>)”</w:t>
-      </w:r>
-      <w:r>
-        <w:rPr>
-          <w:color w:val="215E99" w:themeColor="text2" w:themeTint="BF"/>
+          <w:strike/>
+          <w:color w:val="000000" w:themeColor="text1"/>
+        </w:rPr>
+        <w:t>)</w:t>
+      </w:r>
+      <w:commentRangeEnd w:id="1"/>
+      <w:r>
+        <w:rPr>
+          <w:rStyle w:val="CommentReference"/>
+          <w:strike/>
+          <w:color w:val="000000" w:themeColor="text1"/>
+          <w:sz w:val="24"/>
+          <w:szCs w:val="24"/>
+        </w:rPr>
+        <w:commentReference w:id="1"/>
+      </w:r>
+      <w:r>
+        <w:rPr>
+          <w:strike/>
+          <w:color w:val="000000" w:themeColor="text1"/>
+        </w:rPr>
+        <w:t>”</w:t>
+      </w:r>
+      <w:r>
+        <w:rPr>
+          <w:strike/>
+          <w:color w:val="000000" w:themeColor="text1"/>
         </w:rPr>
         <w:t>;</w:t>
       </w:r>
       <w:r>
         <w:rPr>
-          <w:color w:val="215E99" w:themeColor="text2" w:themeTint="BF"/>
+          <w:strike/>
+          <w:color w:val="000000" w:themeColor="text1"/>
         </w:rPr>
         <w:t xml:space="preserve"> and make x-axis title “Mean tow depth (m)”)</w:t>
       </w:r>
       <w:r>
         <w:rPr>
-          <w:color w:val="215E99" w:themeColor="text2" w:themeTint="BF"/>
+          <w:strike/>
+          <w:color w:val="000000" w:themeColor="text1"/>
         </w:rPr>
         <w:t>;</w:t>
       </w:r>
       <w:r>
         <w:rPr>
-          <w:color w:val="215E99" w:themeColor="text2" w:themeTint="BF"/>
-        </w:rPr>
-        <w:t xml:space="preserve"> check y-axis values (probably shouldn’t be negative, zeros would be undefined (although we need to figure out how to still include them in the plot))</w:t>
+          <w:strike/>
+          <w:color w:val="000000" w:themeColor="text1"/>
+        </w:rPr>
+        <w:t xml:space="preserve"> </w:t>
+      </w:r>
+      <w:commentRangeStart w:id="2"/>
+      <w:r>
+        <w:rPr>
+          <w:color w:val="215E99" w:themeColor="text2" w:themeTint="BF"/>
+        </w:rPr>
+        <w:t>check y-axis values (probably shouldn’t be negative</w:t>
+      </w:r>
+      <w:commentRangeEnd w:id="2"/>
+      <w:r>
+        <w:rPr>
+          <w:rStyle w:val="CommentReference"/>
+          <w:color w:val="215E99" w:themeColor="text2" w:themeTint="BF"/>
+          <w:sz w:val="24"/>
+          <w:szCs w:val="24"/>
+        </w:rPr>
+        <w:commentReference w:id="2"/>
+      </w:r>
+      <w:r>
+        <w:rPr>
+          <w:color w:val="215E99" w:themeColor="text2" w:themeTint="BF"/>
+        </w:rPr>
+        <w:t>, zeros would be undefined (although we need to figure out how to still include them in the plot))</w:t>
       </w:r>
       <w:r>
         <w:rPr>
@@ -686,41 +748,54 @@
         <w:rPr>
           <w:color w:val="215E99" w:themeColor="text2" w:themeTint="BF"/>
         </w:rPr>
-        <w:t xml:space="preserve"> capitalize legend title</w:t>
-      </w:r>
-      <w:r>
-        <w:rPr>
-          <w:color w:val="215E99" w:themeColor="text2" w:themeTint="BF"/>
+        <w:t xml:space="preserve"> </w:t>
+      </w:r>
+      <w:r>
+        <w:rPr>
+          <w:strike/>
+          <w:color w:val="000000" w:themeColor="text1"/>
+        </w:rPr>
+        <w:t>capitalize legend title</w:t>
+      </w:r>
+      <w:r>
+        <w:rPr>
+          <w:strike/>
+          <w:color w:val="000000" w:themeColor="text1"/>
         </w:rPr>
         <w:t>;</w:t>
       </w:r>
       <w:r>
         <w:rPr>
-          <w:color w:val="215E99" w:themeColor="text2" w:themeTint="BF"/>
+          <w:strike/>
+          <w:color w:val="000000" w:themeColor="text1"/>
         </w:rPr>
         <w:t xml:space="preserve"> change taxon names to proper formatting (italicize, replace underscores with spaces, add periods after each “spp”)</w:t>
       </w:r>
       <w:r>
         <w:rPr>
-          <w:color w:val="215E99" w:themeColor="text2" w:themeTint="BF"/>
+          <w:strike/>
+          <w:color w:val="000000" w:themeColor="text1"/>
         </w:rPr>
         <w:t>;</w:t>
       </w:r>
       <w:r>
         <w:rPr>
-          <w:color w:val="215E99" w:themeColor="text2" w:themeTint="BF"/>
+          <w:strike/>
+          <w:color w:val="000000" w:themeColor="text1"/>
         </w:rPr>
         <w:t xml:space="preserve"> rotate x-axis values back to 0</w:t>
       </w:r>
       <w:r>
         <w:rPr>
-          <w:color w:val="215E99" w:themeColor="text2" w:themeTint="BF"/>
+          <w:strike/>
+          <w:color w:val="000000" w:themeColor="text1"/>
         </w:rPr>
         <w:t>;</w:t>
       </w:r>
       <w:r>
         <w:rPr>
-          <w:color w:val="215E99" w:themeColor="text2" w:themeTint="BF"/>
+          <w:strike/>
+          <w:color w:val="000000" w:themeColor="text1"/>
         </w:rPr>
         <w:t xml:space="preserve"> change colors to be consistent with stacked bar plots</w:t>
       </w:r>
@@ -769,9 +844,24 @@
       </w:pPr>
       <w:r>
         <w:rPr>
-          <w:color w:val="215E99" w:themeColor="text2" w:themeTint="BF"/>
-        </w:rPr>
-        <w:t>Line graph of concentration vs. depth by taxon with only abundant taxa: try plotting concentrations of Ammodytidae instead of Isopsetta isolepis (I’m mostly curious why concentrations in the effect plot for the three-way interaction model seem to be zero, but the choice of taxon to represent cluster 5 is pretty subjective anyway); fix all formatting to match full line graph; add confidence interval ribbons back in</w:t>
+          <w:strike/>
+          <w:color w:val="000000" w:themeColor="text1"/>
+        </w:rPr>
+        <w:t xml:space="preserve">Line graph of concentration vs. depth by taxon with only abundant taxa: try </w:t>
+      </w:r>
+      <w:r>
+        <w:rPr>
+          <w:strike/>
+          <w:color w:val="000000" w:themeColor="text1"/>
+        </w:rPr>
+        <w:t>plotting concentrations of Ammodytidae instead of Isopsetta isolepis (I’m mostly curious why concentrations in the effect plot for the three-way interaction model seem to be zero, but the choice of taxon to represent cluster 5 is pretty subjective anyway); fix all formatting to match full line graph</w:t>
+      </w:r>
+      <w:r>
+        <w:rPr>
+          <w:strike/>
+          <w:color w:val="000000" w:themeColor="text1"/>
+        </w:rPr>
+        <w:t>; add confidence interval ribbons back in</w:t>
       </w:r>
     </w:p>
     <w:p>
@@ -887,24 +977,62 @@
       </w:r>
     </w:p>
   </w:comment>
+  <w:comment w:id="1" w:author="McCloskey, Ross" w:date="2026-05-31T15:28:00Z" w:initials="RM">
+    <w:p>
+      <w:pPr>
+        <w:pStyle w:val="CommentText"/>
+      </w:pPr>
+      <w:r>
+        <w:rPr>
+          <w:rStyle w:val="CommentReference"/>
+        </w:rPr>
+        <w:annotationRef/>
+      </w:r>
+      <w:r>
+        <w:t>Should we still have log(ind/m3) in there at all since the y values were log transformed?</w:t>
+      </w:r>
+    </w:p>
+  </w:comment>
+  <w:comment w:id="2" w:author="McCloskey, Ross" w:date="2026-05-31T15:29:00Z" w:initials="RM">
+    <w:p>
+      <w:pPr>
+        <w:pStyle w:val="CommentText"/>
+      </w:pPr>
+      <w:r>
+        <w:rPr>
+          <w:rStyle w:val="CommentReference"/>
+        </w:rPr>
+        <w:annotationRef/>
+      </w:r>
+      <w:r>
+        <w:t>I think this must be due to the log transforming of the y values since most of our concentrations are &lt; 1.</w:t>
+      </w:r>
+    </w:p>
+  </w:comment>
 </w:comments>
 </file>
 
 <file path=word/commentsExtended.xml><?xml version="1.0" encoding="utf-8"?>
 <w15:commentsEx xmlns:wpc="http://schemas.microsoft.com/office/word/2010/wordprocessingCanvas" xmlns:cx="http://schemas.microsoft.com/office/drawing/2014/chartex" xmlns:cx1="http://schemas.microsoft.com/office/drawing/2015/9/8/chartex" xmlns:cx2="http://schemas.microsoft.com/office/drawing/2015/10/21/chartex" xmlns:cx3="http://schemas.microsoft.com/office/drawing/2016/5/9/chartex" xmlns:cx4="http://schemas.microsoft.com/office/drawing/2016/5/10/chartex" xmlns:cx5="http://schemas.microsoft.com/office/drawing/2016/5/11/chartex" xmlns:cx6="http://schemas.microsoft.com/office/drawing/2016/5/12/chartex" xmlns:cx7="http://schemas.microsoft.com/office/drawing/2016/5/13/chartex" xmlns:cx8="http://schemas.microsoft.com/office/drawing/2016/5/14/chartex" xmlns:mc="http://schemas.openxmlformats.org/markup-compatibility/2006" xmlns:aink="http://schemas.microsoft.com/office/drawing/2016/ink" xmlns:am3d="http://schemas.microsoft.com/office/drawing/2017/model3d" xmlns:o="urn:schemas-microsoft-com:office:office" xmlns:oel="http://schemas.microsoft.com/office/2019/extlst" xmlns:r="http://schemas.openxmlformats.org/officeDocument/2006/relationships" xmlns:m="http://schemas.openxmlformats.org/officeDocument/2006/math" xmlns:v="urn:schemas-microsoft-com:vml" xmlns:wp14="http://schemas.microsoft.com/office/word/2010/wordprocessingDrawing" xmlns:wp="http://schemas.openxmlformats.org/drawingml/2006/wordprocessingDrawing" xmlns:w10="urn:schemas-microsoft-com:office:word" xmlns:w="http://schemas.openxmlformats.org/wordprocessingml/2006/main" xmlns:w14="http://schemas.microsoft.com/office/word/2010/wordml" xmlns:w15="http://schemas.microsoft.com/office/word/2012/wordml" xmlns:w16cex="http://schemas.microsoft.com/office/word/2018/wordml/cex" xmlns:w16cid="http://schemas.microsoft.com/office/word/2016/wordml/cid" xmlns:w16="http://schemas.microsoft.com/office/word/2018/wordml" xmlns:w16du="http://schemas.microsoft.com/office/word/2023/wordml/word16du" xmlns:w16sdtdh="http://schemas.microsoft.com/office/word/2020/wordml/sdtdatahash" xmlns:w16sdtfl="http://schemas.microsoft.com/office/word/2024/wordml/sdtformatlock" xmlns:w16se="http://schemas.microsoft.com/office/word/2015/wordml/symex" xmlns:wpg="http://schemas.microsoft.com/office/word/2010/wordprocessingGroup" xmlns:wpi="http://schemas.microsoft.com/office/word/2010/wordprocessingInk" xmlns:wne="http://schemas.microsoft.com/office/word/2006/wordml" xmlns:wps="http://schemas.microsoft.com/office/word/2010/wordprocessingShape" mc:Ignorable="w14 w15 w16se w16cid w16 w16cex w16sdtdh w16sdtfl w16du wp14">
   <w15:commentEx w15:paraId="5A87D2E1" w15:done="0"/>
+  <w15:commentEx w15:paraId="0691F039" w15:done="0"/>
+  <w15:commentEx w15:paraId="6499137E" w15:done="0"/>
 </w15:commentsEx>
 </file>
 
 <file path=word/commentsExtensible.xml><?xml version="1.0" encoding="utf-8"?>
 <w16cex:commentsExtensible xmlns:wpc="http://schemas.microsoft.com/office/word/2010/wordprocessingCanvas" xmlns:cx="http://schemas.microsoft.com/office/drawing/2014/chartex" xmlns:cx1="http://schemas.microsoft.com/office/drawing/2015/9/8/chartex" xmlns:cx2="http://schemas.microsoft.com/office/drawing/2015/10/21/chartex" xmlns:cx3="http://schemas.microsoft.com/office/drawing/2016/5/9/chartex" xmlns:cx4="http://schemas.microsoft.com/office/drawing/2016/5/10/chartex" xmlns:cx5="http://schemas.microsoft.com/office/drawing/2016/5/11/chartex" xmlns:cx6="http://schemas.microsoft.com/office/drawing/2016/5/12/chartex" xmlns:cx7="http://schemas.microsoft.com/office/drawing/2016/5/13/chartex" xmlns:cx8="http://schemas.microsoft.com/office/drawing/2016/5/14/chartex" xmlns:cr="http://schemas.microsoft.com/office/comments/2020/reactions" xmlns:mc="http://schemas.openxmlformats.org/markup-compatibility/2006" xmlns:aink="http://schemas.microsoft.com/office/drawing/2016/ink" xmlns:am3d="http://schemas.microsoft.com/office/drawing/2017/model3d" xmlns:o="urn:schemas-microsoft-com:office:office" xmlns:oel="http://schemas.microsoft.com/office/2019/extlst" xmlns:r="http://schemas.openxmlformats.org/officeDocument/2006/relationships" xmlns:m="http://schemas.openxmlformats.org/officeDocument/2006/math" xmlns:v="urn:schemas-microsoft-com:vml" xmlns:wp14="http://schemas.microsoft.com/office/word/2010/wordprocessingDrawing" xmlns:wp="http://schemas.openxmlformats.org/drawingml/2006/wordprocessingDrawing" xmlns:w10="urn:schemas-microsoft-com:office:word" xmlns:w="http://schemas.openxmlformats.org/wordprocessingml/2006/main" xmlns:w14="http://schemas.microsoft.com/office/word/2010/wordml" xmlns:w15="http://schemas.microsoft.com/office/word/2012/wordml" xmlns:w16cex="http://schemas.microsoft.com/office/word/2018/wordml/cex" xmlns:w16cid="http://schemas.microsoft.com/office/word/2016/wordml/cid" xmlns:w16="http://schemas.microsoft.com/office/word/2018/wordml" xmlns:w16du="http://schemas.microsoft.com/office/word/2023/wordml/word16du" xmlns:w16sdtdh="http://schemas.microsoft.com/office/word/2020/wordml/sdtdatahash" xmlns:w16sdtfl="http://schemas.microsoft.com/office/word/2024/wordml/sdtformatlock" xmlns:w16se="http://schemas.microsoft.com/office/word/2015/wordml/symex" xmlns:wpg="http://schemas.microsoft.com/office/word/2010/wordprocessingGroup" xmlns:wpi="http://schemas.microsoft.com/office/word/2010/wordprocessingInk" xmlns:wne="http://schemas.microsoft.com/office/word/2006/wordml" xmlns:wps="http://schemas.microsoft.com/office/word/2010/wordprocessingShape" mc:Ignorable="w14 w15 w16se w16cid w16 w16cex w16sdtdh w16sdtfl cr w16du wp14">
   <w16cex:commentExtensible w16cex:durableId="0022E673" w16cex:dateUtc="2026-05-30T23:32:00Z"/>
+  <w16cex:commentExtensible w16cex:durableId="12E67657" w16cex:dateUtc="2026-05-31T22:28:00Z"/>
+  <w16cex:commentExtensible w16cex:durableId="10CECB45" w16cex:dateUtc="2026-05-31T22:29:00Z"/>
 </w16cex:commentsExtensible>
 </file>
 
 <file path=word/commentsIds.xml><?xml version="1.0" encoding="utf-8"?>
 <w16cid:commentsIds xmlns:wpc="http://schemas.microsoft.com/office/word/2010/wordprocessingCanvas" xmlns:cx="http://schemas.microsoft.com/office/drawing/2014/chartex" xmlns:cx1="http://schemas.microsoft.com/office/drawing/2015/9/8/chartex" xmlns:cx2="http://schemas.microsoft.com/office/drawing/2015/10/21/chartex" xmlns:cx3="http://schemas.microsoft.com/office/drawing/2016/5/9/chartex" xmlns:cx4="http://schemas.microsoft.com/office/drawing/2016/5/10/chartex" xmlns:cx5="http://schemas.microsoft.com/office/drawing/2016/5/11/chartex" xmlns:cx6="http://schemas.microsoft.com/office/drawing/2016/5/12/chartex" xmlns:cx7="http://schemas.microsoft.com/office/drawing/2016/5/13/chartex" xmlns:cx8="http://schemas.microsoft.com/office/drawing/2016/5/14/chartex" xmlns:mc="http://schemas.openxmlformats.org/markup-compatibility/2006" xmlns:aink="http://schemas.microsoft.com/office/drawing/2016/ink" xmlns:am3d="http://schemas.microsoft.com/office/drawing/2017/model3d" xmlns:o="urn:schemas-microsoft-com:office:office" xmlns:oel="http://schemas.microsoft.com/office/2019/extlst" xmlns:r="http://schemas.openxmlformats.org/officeDocument/2006/relationships" xmlns:m="http://schemas.openxmlformats.org/officeDocument/2006/math" xmlns:v="urn:schemas-microsoft-com:vml" xmlns:wp14="http://schemas.microsoft.com/office/word/2010/wordprocessingDrawing" xmlns:wp="http://schemas.openxmlformats.org/drawingml/2006/wordprocessingDrawing" xmlns:w10="urn:schemas-microsoft-com:office:word" xmlns:w="http://schemas.openxmlformats.org/wordprocessingml/2006/main" xmlns:w14="http://schemas.microsoft.com/office/word/2010/wordml" xmlns:w15="http://schemas.microsoft.com/office/word/2012/wordml" xmlns:w16cex="http://schemas.microsoft.com/office/word/2018/wordml/cex" xmlns:w16cid="http://schemas.microsoft.com/office/word/2016/wordml/cid" xmlns:w16="http://schemas.microsoft.com/office/word/2018/wordml" xmlns:w16du="http://schemas.microsoft.com/office/word/2023/wordml/word16du" xmlns:w16sdtdh="http://schemas.microsoft.com/office/word/2020/wordml/sdtdatahash" xmlns:w16sdtfl="http://schemas.microsoft.com/office/word/2024/wordml/sdtformatlock" xmlns:w16se="http://schemas.microsoft.com/office/word/2015/wordml/symex" xmlns:wpg="http://schemas.microsoft.com/office/word/2010/wordprocessingGroup" xmlns:wpi="http://schemas.microsoft.com/office/word/2010/wordprocessingInk" xmlns:wne="http://schemas.microsoft.com/office/word/2006/wordml" xmlns:wps="http://schemas.microsoft.com/office/word/2010/wordprocessingShape" mc:Ignorable="w14 w15 w16se w16cid w16 w16cex w16sdtdh w16sdtfl w16du wp14">
   <w16cid:commentId w16cid:paraId="5A87D2E1" w16cid:durableId="0022E673"/>
+  <w16cid:commentId w16cid:paraId="0691F039" w16cid:durableId="12E67657"/>
+  <w16cid:commentId w16cid:paraId="6499137E" w16cid:durableId="10CECB45"/>
 </w16cid:commentsIds>
 </file>
 
@@ -1754,6 +1882,7 @@
   <w:style w:type="character" w:default="1" w:styleId="DefaultParagraphFont">
     <w:name w:val="Default Paragraph Font"/>
     <w:uiPriority w:val="1"/>
+    <w:semiHidden/>
     <w:unhideWhenUsed/>
   </w:style>
   <w:style w:type="table" w:default="1" w:styleId="TableNormal">

</xml_diff>

<commit_message>
make updates/adjustments to doc and ppt with recent progress
</commit_message>
<xml_diff>
--- a/Outline and next steps.docx
+++ b/Outline and next steps.docx
@@ -1,6 +1,6 @@
 
 <file path=word/document.xml><?xml version="1.0" encoding="utf-8"?>
-<w:document xmlns:wpc="http://schemas.microsoft.com/office/word/2010/wordprocessingCanvas" xmlns:cx="http://schemas.microsoft.com/office/drawing/2014/chartex" xmlns:cx1="http://schemas.microsoft.com/office/drawing/2015/9/8/chartex" xmlns:cx2="http://schemas.microsoft.com/office/drawing/2015/10/21/chartex" xmlns:cx3="http://schemas.microsoft.com/office/drawing/2016/5/9/chartex" xmlns:cx4="http://schemas.microsoft.com/office/drawing/2016/5/10/chartex" xmlns:cx5="http://schemas.microsoft.com/office/drawing/2016/5/11/chartex" xmlns:cx6="http://schemas.microsoft.com/office/drawing/2016/5/12/chartex" xmlns:cx7="http://schemas.microsoft.com/office/drawing/2016/5/13/chartex" xmlns:cx8="http://schemas.microsoft.com/office/drawing/2016/5/14/chartex" xmlns:mc="http://schemas.openxmlformats.org/markup-compatibility/2006" xmlns:aink="http://schemas.microsoft.com/office/drawing/2016/ink" xmlns:am3d="http://schemas.microsoft.com/office/drawing/2017/model3d" xmlns:o="urn:schemas-microsoft-com:office:office" xmlns:oel="http://schemas.microsoft.com/office/2019/extlst" xmlns:r="http://schemas.openxmlformats.org/officeDocument/2006/relationships" xmlns:m="http://schemas.openxmlformats.org/officeDocument/2006/math" xmlns:v="urn:schemas-microsoft-com:vml" xmlns:wp14="http://schemas.microsoft.com/office/word/2010/wordprocessingDrawing" xmlns:wp="http://schemas.openxmlformats.org/drawingml/2006/wordprocessingDrawing" xmlns:w10="urn:schemas-microsoft-com:office:word" xmlns:w="http://schemas.openxmlformats.org/wordprocessingml/2006/main" xmlns:w14="http://schemas.microsoft.com/office/word/2010/wordml" xmlns:w15="http://schemas.microsoft.com/office/word/2012/wordml" xmlns:w16cex="http://schemas.microsoft.com/office/word/2018/wordml/cex" xmlns:w16cid="http://schemas.microsoft.com/office/word/2016/wordml/cid" xmlns:w16="http://schemas.microsoft.com/office/word/2018/wordml" xmlns:w16du="http://schemas.microsoft.com/office/word/2023/wordml/word16du" xmlns:w16sdtdh="http://schemas.microsoft.com/office/word/2020/wordml/sdtdatahash" xmlns:w16sdtfl="http://schemas.microsoft.com/office/word/2024/wordml/sdtformatlock" xmlns:w16se="http://schemas.microsoft.com/office/word/2015/wordml/symex" xmlns:wpg="http://schemas.microsoft.com/office/word/2010/wordprocessingGroup" xmlns:wpi="http://schemas.microsoft.com/office/word/2010/wordprocessingInk" xmlns:wne="http://schemas.microsoft.com/office/word/2006/wordml" xmlns:wps="http://schemas.microsoft.com/office/word/2010/wordprocessingShape" mc:Ignorable="w14 w15 w16se w16cid w16 w16cex w16sdtdh w16sdtfl w16du wp14">
+<w:document xmlns:wpc="http://schemas.microsoft.com/office/word/2010/wordprocessingCanvas" xmlns:cx="http://schemas.microsoft.com/office/drawing/2014/chartex" xmlns:cx1="http://schemas.microsoft.com/office/drawing/2015/9/8/chartex" xmlns:cx2="http://schemas.microsoft.com/office/drawing/2015/10/21/chartex" xmlns:cx3="http://schemas.microsoft.com/office/drawing/2016/5/9/chartex" xmlns:cx4="http://schemas.microsoft.com/office/drawing/2016/5/10/chartex" xmlns:cx5="http://schemas.microsoft.com/office/drawing/2016/5/11/chartex" xmlns:cx6="http://schemas.microsoft.com/office/drawing/2016/5/12/chartex" xmlns:cx7="http://schemas.microsoft.com/office/drawing/2016/5/13/chartex" xmlns:cx8="http://schemas.microsoft.com/office/drawing/2016/5/14/chartex" xmlns:mc="http://schemas.openxmlformats.org/markup-compatibility/2006" xmlns:aink="http://schemas.microsoft.com/office/drawing/2016/ink" xmlns:am3d="http://schemas.microsoft.com/office/drawing/2017/model3d" xmlns:o="urn:schemas-microsoft-com:office:office" xmlns:oel="http://schemas.microsoft.com/office/2019/extlst" xmlns:r="http://schemas.openxmlformats.org/officeDocument/2006/relationships" xmlns:m="http://schemas.openxmlformats.org/officeDocument/2006/math" xmlns:v="urn:schemas-microsoft-com:vml" xmlns:wp14="http://schemas.microsoft.com/office/word/2010/wordprocessingDrawing" xmlns:wp="http://schemas.openxmlformats.org/drawingml/2006/wordprocessingDrawing" xmlns:w10="urn:schemas-microsoft-com:office:word" xmlns:w="http://schemas.openxmlformats.org/wordprocessingml/2006/main" xmlns:w14="http://schemas.microsoft.com/office/word/2010/wordml" xmlns:w15="http://schemas.microsoft.com/office/word/2012/wordml" xmlns:w16cei="http://schemas.microsoft.com/office/word/2026/wordml/cei" xmlns:w16cex="http://schemas.microsoft.com/office/word/2018/wordml/cex" xmlns:w16cid="http://schemas.microsoft.com/office/word/2016/wordml/cid" xmlns:w16="http://schemas.microsoft.com/office/word/2018/wordml" xmlns:w16du="http://schemas.microsoft.com/office/word/2023/wordml/word16du" xmlns:w16sdtdh="http://schemas.microsoft.com/office/word/2020/wordml/sdtdatahash" xmlns:w16sdtfl="http://schemas.microsoft.com/office/word/2024/wordml/sdtformatlock" xmlns:w16se="http://schemas.microsoft.com/office/word/2015/wordml/symex" xmlns:wpg="http://schemas.microsoft.com/office/word/2010/wordprocessingGroup" xmlns:wpi="http://schemas.microsoft.com/office/word/2010/wordprocessingInk" xmlns:wne="http://schemas.microsoft.com/office/word/2006/wordml" xmlns:wps="http://schemas.microsoft.com/office/word/2010/wordprocessingShape" mc:Ignorable="w14 w15 w16se w16cid w16 w16cex w16sdtdh w16sdtfl w16du wp14">
   <w:body>
     <w:p>
       <w:pPr>
@@ -71,7 +71,10 @@
         </w:numPr>
       </w:pPr>
       <w:r>
-        <w:t>May want to use an indicator taxa analysis to identify species that characterize each cluster (see Table 2 in Henderson et al. 2020 for an example)</w:t>
+        <w:t>Use</w:t>
+      </w:r>
+      <w:r>
+        <w:t xml:space="preserve"> an indicator taxa analysis to identify species that characterize each cluster (see Table 2 in Henderson et al. 2020 for an example)</w:t>
       </w:r>
     </w:p>
     <w:p>
@@ -95,7 +98,34 @@
         </w:numPr>
       </w:pPr>
       <w:r>
-        <w:t>Point color, point shape, and ellipses to indicate categories (i.e. cluster) and levels of categorical spatiotemporal variables (i.e. year, position relative to shelf break, time of day</w:t>
+        <w:t>Point color</w:t>
+      </w:r>
+      <w:r>
+        <w:t xml:space="preserve"> and </w:t>
+      </w:r>
+      <w:r>
+        <w:t>polygons</w:t>
+      </w:r>
+      <w:r>
+        <w:t xml:space="preserve"> to indicate c</w:t>
+      </w:r>
+      <w:r>
+        <w:t>luster</w:t>
+      </w:r>
+      <w:r>
+        <w:t xml:space="preserve"> and </w:t>
+      </w:r>
+      <w:r>
+        <w:t xml:space="preserve">ellipses to indicate </w:t>
+      </w:r>
+      <w:r>
+        <w:t xml:space="preserve">levels of categorical spatiotemporal variable </w:t>
+      </w:r>
+      <w:r>
+        <w:t xml:space="preserve">(e.g., </w:t>
+      </w:r>
+      <w:r>
+        <w:t>time of day</w:t>
       </w:r>
       <w:r>
         <w:t>; see Fig. 9b in Rodriguez et al. 2015 for an example</w:t>
@@ -113,7 +143,34 @@
         </w:numPr>
       </w:pPr>
       <w:r>
-        <w:t>Vectors to indicate correlation with continuous spatiotemporal variables (i.e. sampling depth, latitude, seafloor depth)</w:t>
+        <w:t xml:space="preserve">Vectors to indicate correlation with </w:t>
+      </w:r>
+      <w:r>
+        <w:t>spatiotemporal</w:t>
+      </w:r>
+      <w:r>
+        <w:t xml:space="preserve"> variables (i.e. sampling depth</w:t>
+      </w:r>
+      <w:r>
+        <w:t>/mean depth</w:t>
+      </w:r>
+      <w:r>
+        <w:t xml:space="preserve">, </w:t>
+      </w:r>
+      <w:r>
+        <w:t>longit</w:t>
+      </w:r>
+      <w:r>
+        <w:t>ude</w:t>
+      </w:r>
+      <w:r>
+        <w:t>, seafloor depth</w:t>
+      </w:r>
+      <w:r>
+        <w:t>, and year</w:t>
+      </w:r>
+      <w:r>
+        <w:t>)</w:t>
       </w:r>
     </w:p>
     <w:p>
@@ -206,8 +263,11 @@
         </w:numPr>
       </w:pPr>
       <w:r>
+        <w:t xml:space="preserve">Variance partitioning analysis on dbRDA models to test how much variation in assemblage structure is explained by spatiotemporal variables alone, </w:t>
+      </w:r>
+      <w:r>
         <w:lastRenderedPageBreak/>
-        <w:t>Variance partitioning analysis on dbRDA models to test how much variation in assemblage structure is explained by spatiotemporal variables alone, environmental variables alone, and is shared between them, as well as whether the fraction of variation explained by each is significantly different from zero</w:t>
+        <w:t>environmental variables alone, and is shared between them, as well as whether the fraction of variation explained by each is significantly different from zero</w:t>
       </w:r>
     </w:p>
     <w:p>
@@ -512,26 +572,32 @@
         <w:rPr>
           <w:strike/>
         </w:rPr>
+        <w:t>NMDS plot with overlays: remove vectors for distance_to_shore_km and</w:t>
+      </w:r>
+      <w:r>
+        <w:rPr>
+          <w:strike/>
+        </w:rPr>
+        <w:t xml:space="preserve"> </w:t>
+      </w:r>
+      <w:r>
+        <w:rPr>
+          <w:strike/>
+        </w:rPr>
+        <w:t>start_longitude_dd and ellipses for shelf position</w:t>
+      </w:r>
+      <w:r>
+        <w:rPr>
+          <w:strike/>
+        </w:rPr>
+        <w:t xml:space="preserve">; change color of </w:t>
+      </w:r>
+      <w:r>
+        <w:rPr>
+          <w:strike/>
+        </w:rPr>
         <w:lastRenderedPageBreak/>
-        <w:t>NMDS plot with overlays: remove vectors for distance_to_shore_km and</w:t>
-      </w:r>
-      <w:r>
-        <w:rPr>
-          <w:strike/>
-        </w:rPr>
-        <w:t xml:space="preserve"> </w:t>
-      </w:r>
-      <w:r>
-        <w:rPr>
-          <w:strike/>
-        </w:rPr>
-        <w:t>start_longitude_dd and ellipses for shelf position</w:t>
-      </w:r>
-      <w:r>
-        <w:rPr>
-          <w:strike/>
-        </w:rPr>
-        <w:t>; change color of “Day/Night” ellipses to black and make day ellipse a solid line</w:t>
+        <w:t>“Day/Night” ellipses to black and make day ellipse a solid line</w:t>
       </w:r>
       <w:r>
         <w:rPr>
@@ -939,7 +1005,6 @@
         </w:numPr>
       </w:pPr>
       <w:r>
-        <w:lastRenderedPageBreak/>
         <w:t xml:space="preserve">Ross: </w:t>
       </w:r>
       <w:r>
@@ -960,7 +1025,7 @@
 </file>
 
 <file path=word/comments.xml><?xml version="1.0" encoding="utf-8"?>
-<w:comments xmlns:wpc="http://schemas.microsoft.com/office/word/2010/wordprocessingCanvas" xmlns:cx="http://schemas.microsoft.com/office/drawing/2014/chartex" xmlns:cx1="http://schemas.microsoft.com/office/drawing/2015/9/8/chartex" xmlns:cx2="http://schemas.microsoft.com/office/drawing/2015/10/21/chartex" xmlns:cx3="http://schemas.microsoft.com/office/drawing/2016/5/9/chartex" xmlns:cx4="http://schemas.microsoft.com/office/drawing/2016/5/10/chartex" xmlns:cx5="http://schemas.microsoft.com/office/drawing/2016/5/11/chartex" xmlns:cx6="http://schemas.microsoft.com/office/drawing/2016/5/12/chartex" xmlns:cx7="http://schemas.microsoft.com/office/drawing/2016/5/13/chartex" xmlns:cx8="http://schemas.microsoft.com/office/drawing/2016/5/14/chartex" xmlns:mc="http://schemas.openxmlformats.org/markup-compatibility/2006" xmlns:aink="http://schemas.microsoft.com/office/drawing/2016/ink" xmlns:am3d="http://schemas.microsoft.com/office/drawing/2017/model3d" xmlns:o="urn:schemas-microsoft-com:office:office" xmlns:oel="http://schemas.microsoft.com/office/2019/extlst" xmlns:r="http://schemas.openxmlformats.org/officeDocument/2006/relationships" xmlns:m="http://schemas.openxmlformats.org/officeDocument/2006/math" xmlns:v="urn:schemas-microsoft-com:vml" xmlns:wp14="http://schemas.microsoft.com/office/word/2010/wordprocessingDrawing" xmlns:wp="http://schemas.openxmlformats.org/drawingml/2006/wordprocessingDrawing" xmlns:w10="urn:schemas-microsoft-com:office:word" xmlns:w="http://schemas.openxmlformats.org/wordprocessingml/2006/main" xmlns:w14="http://schemas.microsoft.com/office/word/2010/wordml" xmlns:w15="http://schemas.microsoft.com/office/word/2012/wordml" xmlns:w16cex="http://schemas.microsoft.com/office/word/2018/wordml/cex" xmlns:w16cid="http://schemas.microsoft.com/office/word/2016/wordml/cid" xmlns:w16="http://schemas.microsoft.com/office/word/2018/wordml" xmlns:w16du="http://schemas.microsoft.com/office/word/2023/wordml/word16du" xmlns:w16sdtdh="http://schemas.microsoft.com/office/word/2020/wordml/sdtdatahash" xmlns:w16sdtfl="http://schemas.microsoft.com/office/word/2024/wordml/sdtformatlock" xmlns:w16se="http://schemas.microsoft.com/office/word/2015/wordml/symex" xmlns:wpg="http://schemas.microsoft.com/office/word/2010/wordprocessingGroup" xmlns:wpi="http://schemas.microsoft.com/office/word/2010/wordprocessingInk" xmlns:wne="http://schemas.microsoft.com/office/word/2006/wordml" xmlns:wps="http://schemas.microsoft.com/office/word/2010/wordprocessingShape" mc:Ignorable="w14 w15 w16se w16cid w16 w16cex w16sdtdh w16sdtfl w16du wp14">
+<w:comments xmlns:wpc="http://schemas.microsoft.com/office/word/2010/wordprocessingCanvas" xmlns:cx="http://schemas.microsoft.com/office/drawing/2014/chartex" xmlns:cx1="http://schemas.microsoft.com/office/drawing/2015/9/8/chartex" xmlns:cx2="http://schemas.microsoft.com/office/drawing/2015/10/21/chartex" xmlns:cx3="http://schemas.microsoft.com/office/drawing/2016/5/9/chartex" xmlns:cx4="http://schemas.microsoft.com/office/drawing/2016/5/10/chartex" xmlns:cx5="http://schemas.microsoft.com/office/drawing/2016/5/11/chartex" xmlns:cx6="http://schemas.microsoft.com/office/drawing/2016/5/12/chartex" xmlns:cx7="http://schemas.microsoft.com/office/drawing/2016/5/13/chartex" xmlns:cx8="http://schemas.microsoft.com/office/drawing/2016/5/14/chartex" xmlns:mc="http://schemas.openxmlformats.org/markup-compatibility/2006" xmlns:aink="http://schemas.microsoft.com/office/drawing/2016/ink" xmlns:am3d="http://schemas.microsoft.com/office/drawing/2017/model3d" xmlns:o="urn:schemas-microsoft-com:office:office" xmlns:oel="http://schemas.microsoft.com/office/2019/extlst" xmlns:r="http://schemas.openxmlformats.org/officeDocument/2006/relationships" xmlns:m="http://schemas.openxmlformats.org/officeDocument/2006/math" xmlns:v="urn:schemas-microsoft-com:vml" xmlns:wp14="http://schemas.microsoft.com/office/word/2010/wordprocessingDrawing" xmlns:wp="http://schemas.openxmlformats.org/drawingml/2006/wordprocessingDrawing" xmlns:w10="urn:schemas-microsoft-com:office:word" xmlns:w="http://schemas.openxmlformats.org/wordprocessingml/2006/main" xmlns:w14="http://schemas.microsoft.com/office/word/2010/wordml" xmlns:w15="http://schemas.microsoft.com/office/word/2012/wordml" xmlns:w16cei="http://schemas.microsoft.com/office/word/2026/wordml/cei" xmlns:w16cex="http://schemas.microsoft.com/office/word/2018/wordml/cex" xmlns:w16cid="http://schemas.microsoft.com/office/word/2016/wordml/cid" xmlns:w16="http://schemas.microsoft.com/office/word/2018/wordml" xmlns:w16du="http://schemas.microsoft.com/office/word/2023/wordml/word16du" xmlns:w16sdtdh="http://schemas.microsoft.com/office/word/2020/wordml/sdtdatahash" xmlns:w16sdtfl="http://schemas.microsoft.com/office/word/2024/wordml/sdtformatlock" xmlns:w16se="http://schemas.microsoft.com/office/word/2015/wordml/symex" xmlns:wpg="http://schemas.microsoft.com/office/word/2010/wordprocessingGroup" xmlns:wpi="http://schemas.microsoft.com/office/word/2010/wordprocessingInk" xmlns:wne="http://schemas.microsoft.com/office/word/2006/wordml" xmlns:wps="http://schemas.microsoft.com/office/word/2010/wordprocessingShape" mc:Ignorable="w14 w15 w16se w16cid w16 w16cex w16sdtdh w16sdtfl w16du wp14">
   <w:comment w:id="0" w:author="McCloskey, Ross" w:date="2026-05-30T16:32:00Z" w:initials="RM">
     <w:p>
       <w:pPr>
@@ -1013,7 +1078,7 @@
 </file>
 
 <file path=word/commentsExtended.xml><?xml version="1.0" encoding="utf-8"?>
-<w15:commentsEx xmlns:wpc="http://schemas.microsoft.com/office/word/2010/wordprocessingCanvas" xmlns:cx="http://schemas.microsoft.com/office/drawing/2014/chartex" xmlns:cx1="http://schemas.microsoft.com/office/drawing/2015/9/8/chartex" xmlns:cx2="http://schemas.microsoft.com/office/drawing/2015/10/21/chartex" xmlns:cx3="http://schemas.microsoft.com/office/drawing/2016/5/9/chartex" xmlns:cx4="http://schemas.microsoft.com/office/drawing/2016/5/10/chartex" xmlns:cx5="http://schemas.microsoft.com/office/drawing/2016/5/11/chartex" xmlns:cx6="http://schemas.microsoft.com/office/drawing/2016/5/12/chartex" xmlns:cx7="http://schemas.microsoft.com/office/drawing/2016/5/13/chartex" xmlns:cx8="http://schemas.microsoft.com/office/drawing/2016/5/14/chartex" xmlns:mc="http://schemas.openxmlformats.org/markup-compatibility/2006" xmlns:aink="http://schemas.microsoft.com/office/drawing/2016/ink" xmlns:am3d="http://schemas.microsoft.com/office/drawing/2017/model3d" xmlns:o="urn:schemas-microsoft-com:office:office" xmlns:oel="http://schemas.microsoft.com/office/2019/extlst" xmlns:r="http://schemas.openxmlformats.org/officeDocument/2006/relationships" xmlns:m="http://schemas.openxmlformats.org/officeDocument/2006/math" xmlns:v="urn:schemas-microsoft-com:vml" xmlns:wp14="http://schemas.microsoft.com/office/word/2010/wordprocessingDrawing" xmlns:wp="http://schemas.openxmlformats.org/drawingml/2006/wordprocessingDrawing" xmlns:w10="urn:schemas-microsoft-com:office:word" xmlns:w="http://schemas.openxmlformats.org/wordprocessingml/2006/main" xmlns:w14="http://schemas.microsoft.com/office/word/2010/wordml" xmlns:w15="http://schemas.microsoft.com/office/word/2012/wordml" xmlns:w16cex="http://schemas.microsoft.com/office/word/2018/wordml/cex" xmlns:w16cid="http://schemas.microsoft.com/office/word/2016/wordml/cid" xmlns:w16="http://schemas.microsoft.com/office/word/2018/wordml" xmlns:w16du="http://schemas.microsoft.com/office/word/2023/wordml/word16du" xmlns:w16sdtdh="http://schemas.microsoft.com/office/word/2020/wordml/sdtdatahash" xmlns:w16sdtfl="http://schemas.microsoft.com/office/word/2024/wordml/sdtformatlock" xmlns:w16se="http://schemas.microsoft.com/office/word/2015/wordml/symex" xmlns:wpg="http://schemas.microsoft.com/office/word/2010/wordprocessingGroup" xmlns:wpi="http://schemas.microsoft.com/office/word/2010/wordprocessingInk" xmlns:wne="http://schemas.microsoft.com/office/word/2006/wordml" xmlns:wps="http://schemas.microsoft.com/office/word/2010/wordprocessingShape" mc:Ignorable="w14 w15 w16se w16cid w16 w16cex w16sdtdh w16sdtfl w16du wp14">
+<w15:commentsEx xmlns:wpc="http://schemas.microsoft.com/office/word/2010/wordprocessingCanvas" xmlns:cx="http://schemas.microsoft.com/office/drawing/2014/chartex" xmlns:cx1="http://schemas.microsoft.com/office/drawing/2015/9/8/chartex" xmlns:cx2="http://schemas.microsoft.com/office/drawing/2015/10/21/chartex" xmlns:cx3="http://schemas.microsoft.com/office/drawing/2016/5/9/chartex" xmlns:cx4="http://schemas.microsoft.com/office/drawing/2016/5/10/chartex" xmlns:cx5="http://schemas.microsoft.com/office/drawing/2016/5/11/chartex" xmlns:cx6="http://schemas.microsoft.com/office/drawing/2016/5/12/chartex" xmlns:cx7="http://schemas.microsoft.com/office/drawing/2016/5/13/chartex" xmlns:cx8="http://schemas.microsoft.com/office/drawing/2016/5/14/chartex" xmlns:mc="http://schemas.openxmlformats.org/markup-compatibility/2006" xmlns:aink="http://schemas.microsoft.com/office/drawing/2016/ink" xmlns:am3d="http://schemas.microsoft.com/office/drawing/2017/model3d" xmlns:o="urn:schemas-microsoft-com:office:office" xmlns:oel="http://schemas.microsoft.com/office/2019/extlst" xmlns:r="http://schemas.openxmlformats.org/officeDocument/2006/relationships" xmlns:m="http://schemas.openxmlformats.org/officeDocument/2006/math" xmlns:v="urn:schemas-microsoft-com:vml" xmlns:wp14="http://schemas.microsoft.com/office/word/2010/wordprocessingDrawing" xmlns:wp="http://schemas.openxmlformats.org/drawingml/2006/wordprocessingDrawing" xmlns:w10="urn:schemas-microsoft-com:office:word" xmlns:w="http://schemas.openxmlformats.org/wordprocessingml/2006/main" xmlns:w14="http://schemas.microsoft.com/office/word/2010/wordml" xmlns:w15="http://schemas.microsoft.com/office/word/2012/wordml" xmlns:w16cei="http://schemas.microsoft.com/office/word/2026/wordml/cei" xmlns:w16cex="http://schemas.microsoft.com/office/word/2018/wordml/cex" xmlns:w16cid="http://schemas.microsoft.com/office/word/2016/wordml/cid" xmlns:w16="http://schemas.microsoft.com/office/word/2018/wordml" xmlns:w16du="http://schemas.microsoft.com/office/word/2023/wordml/word16du" xmlns:w16sdtdh="http://schemas.microsoft.com/office/word/2020/wordml/sdtdatahash" xmlns:w16sdtfl="http://schemas.microsoft.com/office/word/2024/wordml/sdtformatlock" xmlns:w16se="http://schemas.microsoft.com/office/word/2015/wordml/symex" xmlns:wpg="http://schemas.microsoft.com/office/word/2010/wordprocessingGroup" xmlns:wpi="http://schemas.microsoft.com/office/word/2010/wordprocessingInk" xmlns:wne="http://schemas.microsoft.com/office/word/2006/wordml" xmlns:wps="http://schemas.microsoft.com/office/word/2010/wordprocessingShape" mc:Ignorable="w14 w15 w16se w16cid w16 w16cex w16sdtdh w16sdtfl w16du wp14">
   <w15:commentEx w15:paraId="5A87D2E1" w15:done="0"/>
   <w15:commentEx w15:paraId="0691F039" w15:done="0"/>
   <w15:commentEx w15:paraId="6499137E" w15:done="0"/>
@@ -1021,7 +1086,7 @@
 </file>
 
 <file path=word/commentsExtensible.xml><?xml version="1.0" encoding="utf-8"?>
-<w16cex:commentsExtensible xmlns:wpc="http://schemas.microsoft.com/office/word/2010/wordprocessingCanvas" xmlns:cx="http://schemas.microsoft.com/office/drawing/2014/chartex" xmlns:cx1="http://schemas.microsoft.com/office/drawing/2015/9/8/chartex" xmlns:cx2="http://schemas.microsoft.com/office/drawing/2015/10/21/chartex" xmlns:cx3="http://schemas.microsoft.com/office/drawing/2016/5/9/chartex" xmlns:cx4="http://schemas.microsoft.com/office/drawing/2016/5/10/chartex" xmlns:cx5="http://schemas.microsoft.com/office/drawing/2016/5/11/chartex" xmlns:cx6="http://schemas.microsoft.com/office/drawing/2016/5/12/chartex" xmlns:cx7="http://schemas.microsoft.com/office/drawing/2016/5/13/chartex" xmlns:cx8="http://schemas.microsoft.com/office/drawing/2016/5/14/chartex" xmlns:cr="http://schemas.microsoft.com/office/comments/2020/reactions" xmlns:mc="http://schemas.openxmlformats.org/markup-compatibility/2006" xmlns:aink="http://schemas.microsoft.com/office/drawing/2016/ink" xmlns:am3d="http://schemas.microsoft.com/office/drawing/2017/model3d" xmlns:o="urn:schemas-microsoft-com:office:office" xmlns:oel="http://schemas.microsoft.com/office/2019/extlst" xmlns:r="http://schemas.openxmlformats.org/officeDocument/2006/relationships" xmlns:m="http://schemas.openxmlformats.org/officeDocument/2006/math" xmlns:v="urn:schemas-microsoft-com:vml" xmlns:wp14="http://schemas.microsoft.com/office/word/2010/wordprocessingDrawing" xmlns:wp="http://schemas.openxmlformats.org/drawingml/2006/wordprocessingDrawing" xmlns:w10="urn:schemas-microsoft-com:office:word" xmlns:w="http://schemas.openxmlformats.org/wordprocessingml/2006/main" xmlns:w14="http://schemas.microsoft.com/office/word/2010/wordml" xmlns:w15="http://schemas.microsoft.com/office/word/2012/wordml" xmlns:w16cex="http://schemas.microsoft.com/office/word/2018/wordml/cex" xmlns:w16cid="http://schemas.microsoft.com/office/word/2016/wordml/cid" xmlns:w16="http://schemas.microsoft.com/office/word/2018/wordml" xmlns:w16du="http://schemas.microsoft.com/office/word/2023/wordml/word16du" xmlns:w16sdtdh="http://schemas.microsoft.com/office/word/2020/wordml/sdtdatahash" xmlns:w16sdtfl="http://schemas.microsoft.com/office/word/2024/wordml/sdtformatlock" xmlns:w16se="http://schemas.microsoft.com/office/word/2015/wordml/symex" xmlns:wpg="http://schemas.microsoft.com/office/word/2010/wordprocessingGroup" xmlns:wpi="http://schemas.microsoft.com/office/word/2010/wordprocessingInk" xmlns:wne="http://schemas.microsoft.com/office/word/2006/wordml" xmlns:wps="http://schemas.microsoft.com/office/word/2010/wordprocessingShape" mc:Ignorable="w14 w15 w16se w16cid w16 w16cex w16sdtdh w16sdtfl cr w16du wp14">
+<w16cex:commentsExtensible xmlns:wpc="http://schemas.microsoft.com/office/word/2010/wordprocessingCanvas" xmlns:cx="http://schemas.microsoft.com/office/drawing/2014/chartex" xmlns:cx1="http://schemas.microsoft.com/office/drawing/2015/9/8/chartex" xmlns:cx2="http://schemas.microsoft.com/office/drawing/2015/10/21/chartex" xmlns:cx3="http://schemas.microsoft.com/office/drawing/2016/5/9/chartex" xmlns:cx4="http://schemas.microsoft.com/office/drawing/2016/5/10/chartex" xmlns:cx5="http://schemas.microsoft.com/office/drawing/2016/5/11/chartex" xmlns:cx6="http://schemas.microsoft.com/office/drawing/2016/5/12/chartex" xmlns:cx7="http://schemas.microsoft.com/office/drawing/2016/5/13/chartex" xmlns:cx8="http://schemas.microsoft.com/office/drawing/2016/5/14/chartex" xmlns:cr="http://schemas.microsoft.com/office/comments/2020/reactions" xmlns:mc="http://schemas.openxmlformats.org/markup-compatibility/2006" xmlns:aink="http://schemas.microsoft.com/office/drawing/2016/ink" xmlns:am3d="http://schemas.microsoft.com/office/drawing/2017/model3d" xmlns:o="urn:schemas-microsoft-com:office:office" xmlns:oel="http://schemas.microsoft.com/office/2019/extlst" xmlns:r="http://schemas.openxmlformats.org/officeDocument/2006/relationships" xmlns:m="http://schemas.openxmlformats.org/officeDocument/2006/math" xmlns:v="urn:schemas-microsoft-com:vml" xmlns:wp14="http://schemas.microsoft.com/office/word/2010/wordprocessingDrawing" xmlns:wp="http://schemas.openxmlformats.org/drawingml/2006/wordprocessingDrawing" xmlns:w10="urn:schemas-microsoft-com:office:word" xmlns:w="http://schemas.openxmlformats.org/wordprocessingml/2006/main" xmlns:w14="http://schemas.microsoft.com/office/word/2010/wordml" xmlns:w15="http://schemas.microsoft.com/office/word/2012/wordml" xmlns:w16cei="http://schemas.microsoft.com/office/word/2026/wordml/cei" xmlns:w16cex="http://schemas.microsoft.com/office/word/2018/wordml/cex" xmlns:w16cid="http://schemas.microsoft.com/office/word/2016/wordml/cid" xmlns:w16="http://schemas.microsoft.com/office/word/2018/wordml" xmlns:w16du="http://schemas.microsoft.com/office/word/2023/wordml/word16du" xmlns:w16sdtdh="http://schemas.microsoft.com/office/word/2020/wordml/sdtdatahash" xmlns:w16sdtfl="http://schemas.microsoft.com/office/word/2024/wordml/sdtformatlock" xmlns:w16se="http://schemas.microsoft.com/office/word/2015/wordml/symex" xmlns:wpg="http://schemas.microsoft.com/office/word/2010/wordprocessingGroup" xmlns:wpi="http://schemas.microsoft.com/office/word/2010/wordprocessingInk" xmlns:wne="http://schemas.microsoft.com/office/word/2006/wordml" xmlns:wps="http://schemas.microsoft.com/office/word/2010/wordprocessingShape" mc:Ignorable="w14 w15 w16se w16cid w16 w16cex w16sdtdh w16sdtfl cr w16du wp14">
   <w16cex:commentExtensible w16cex:durableId="0022E673" w16cex:dateUtc="2026-05-30T23:32:00Z"/>
   <w16cex:commentExtensible w16cex:durableId="12E67657" w16cex:dateUtc="2026-05-31T22:28:00Z"/>
   <w16cex:commentExtensible w16cex:durableId="10CECB45" w16cex:dateUtc="2026-05-31T22:29:00Z"/>
@@ -1029,7 +1094,7 @@
 </file>
 
 <file path=word/commentsIds.xml><?xml version="1.0" encoding="utf-8"?>
-<w16cid:commentsIds xmlns:wpc="http://schemas.microsoft.com/office/word/2010/wordprocessingCanvas" xmlns:cx="http://schemas.microsoft.com/office/drawing/2014/chartex" xmlns:cx1="http://schemas.microsoft.com/office/drawing/2015/9/8/chartex" xmlns:cx2="http://schemas.microsoft.com/office/drawing/2015/10/21/chartex" xmlns:cx3="http://schemas.microsoft.com/office/drawing/2016/5/9/chartex" xmlns:cx4="http://schemas.microsoft.com/office/drawing/2016/5/10/chartex" xmlns:cx5="http://schemas.microsoft.com/office/drawing/2016/5/11/chartex" xmlns:cx6="http://schemas.microsoft.com/office/drawing/2016/5/12/chartex" xmlns:cx7="http://schemas.microsoft.com/office/drawing/2016/5/13/chartex" xmlns:cx8="http://schemas.microsoft.com/office/drawing/2016/5/14/chartex" xmlns:mc="http://schemas.openxmlformats.org/markup-compatibility/2006" xmlns:aink="http://schemas.microsoft.com/office/drawing/2016/ink" xmlns:am3d="http://schemas.microsoft.com/office/drawing/2017/model3d" xmlns:o="urn:schemas-microsoft-com:office:office" xmlns:oel="http://schemas.microsoft.com/office/2019/extlst" xmlns:r="http://schemas.openxmlformats.org/officeDocument/2006/relationships" xmlns:m="http://schemas.openxmlformats.org/officeDocument/2006/math" xmlns:v="urn:schemas-microsoft-com:vml" xmlns:wp14="http://schemas.microsoft.com/office/word/2010/wordprocessingDrawing" xmlns:wp="http://schemas.openxmlformats.org/drawingml/2006/wordprocessingDrawing" xmlns:w10="urn:schemas-microsoft-com:office:word" xmlns:w="http://schemas.openxmlformats.org/wordprocessingml/2006/main" xmlns:w14="http://schemas.microsoft.com/office/word/2010/wordml" xmlns:w15="http://schemas.microsoft.com/office/word/2012/wordml" xmlns:w16cex="http://schemas.microsoft.com/office/word/2018/wordml/cex" xmlns:w16cid="http://schemas.microsoft.com/office/word/2016/wordml/cid" xmlns:w16="http://schemas.microsoft.com/office/word/2018/wordml" xmlns:w16du="http://schemas.microsoft.com/office/word/2023/wordml/word16du" xmlns:w16sdtdh="http://schemas.microsoft.com/office/word/2020/wordml/sdtdatahash" xmlns:w16sdtfl="http://schemas.microsoft.com/office/word/2024/wordml/sdtformatlock" xmlns:w16se="http://schemas.microsoft.com/office/word/2015/wordml/symex" xmlns:wpg="http://schemas.microsoft.com/office/word/2010/wordprocessingGroup" xmlns:wpi="http://schemas.microsoft.com/office/word/2010/wordprocessingInk" xmlns:wne="http://schemas.microsoft.com/office/word/2006/wordml" xmlns:wps="http://schemas.microsoft.com/office/word/2010/wordprocessingShape" mc:Ignorable="w14 w15 w16se w16cid w16 w16cex w16sdtdh w16sdtfl w16du wp14">
+<w16cid:commentsIds xmlns:wpc="http://schemas.microsoft.com/office/word/2010/wordprocessingCanvas" xmlns:cx="http://schemas.microsoft.com/office/drawing/2014/chartex" xmlns:cx1="http://schemas.microsoft.com/office/drawing/2015/9/8/chartex" xmlns:cx2="http://schemas.microsoft.com/office/drawing/2015/10/21/chartex" xmlns:cx3="http://schemas.microsoft.com/office/drawing/2016/5/9/chartex" xmlns:cx4="http://schemas.microsoft.com/office/drawing/2016/5/10/chartex" xmlns:cx5="http://schemas.microsoft.com/office/drawing/2016/5/11/chartex" xmlns:cx6="http://schemas.microsoft.com/office/drawing/2016/5/12/chartex" xmlns:cx7="http://schemas.microsoft.com/office/drawing/2016/5/13/chartex" xmlns:cx8="http://schemas.microsoft.com/office/drawing/2016/5/14/chartex" xmlns:mc="http://schemas.openxmlformats.org/markup-compatibility/2006" xmlns:aink="http://schemas.microsoft.com/office/drawing/2016/ink" xmlns:am3d="http://schemas.microsoft.com/office/drawing/2017/model3d" xmlns:o="urn:schemas-microsoft-com:office:office" xmlns:oel="http://schemas.microsoft.com/office/2019/extlst" xmlns:r="http://schemas.openxmlformats.org/officeDocument/2006/relationships" xmlns:m="http://schemas.openxmlformats.org/officeDocument/2006/math" xmlns:v="urn:schemas-microsoft-com:vml" xmlns:wp14="http://schemas.microsoft.com/office/word/2010/wordprocessingDrawing" xmlns:wp="http://schemas.openxmlformats.org/drawingml/2006/wordprocessingDrawing" xmlns:w10="urn:schemas-microsoft-com:office:word" xmlns:w="http://schemas.openxmlformats.org/wordprocessingml/2006/main" xmlns:w14="http://schemas.microsoft.com/office/word/2010/wordml" xmlns:w15="http://schemas.microsoft.com/office/word/2012/wordml" xmlns:w16cei="http://schemas.microsoft.com/office/word/2026/wordml/cei" xmlns:w16cex="http://schemas.microsoft.com/office/word/2018/wordml/cex" xmlns:w16cid="http://schemas.microsoft.com/office/word/2016/wordml/cid" xmlns:w16="http://schemas.microsoft.com/office/word/2018/wordml" xmlns:w16du="http://schemas.microsoft.com/office/word/2023/wordml/word16du" xmlns:w16sdtdh="http://schemas.microsoft.com/office/word/2020/wordml/sdtdatahash" xmlns:w16sdtfl="http://schemas.microsoft.com/office/word/2024/wordml/sdtformatlock" xmlns:w16se="http://schemas.microsoft.com/office/word/2015/wordml/symex" xmlns:wpg="http://schemas.microsoft.com/office/word/2010/wordprocessingGroup" xmlns:wpi="http://schemas.microsoft.com/office/word/2010/wordprocessingInk" xmlns:wne="http://schemas.microsoft.com/office/word/2006/wordml" xmlns:wps="http://schemas.microsoft.com/office/word/2010/wordprocessingShape" mc:Ignorable="w14 w15 w16se w16cid w16 w16cex w16sdtdh w16sdtfl w16du wp14">
   <w16cid:commentId w16cid:paraId="5A87D2E1" w16cid:durableId="0022E673"/>
   <w16cid:commentId w16cid:paraId="0691F039" w16cid:durableId="12E67657"/>
   <w16cid:commentId w16cid:paraId="6499137E" w16cid:durableId="10CECB45"/>
@@ -1037,7 +1102,7 @@
 </file>
 
 <file path=word/numbering.xml><?xml version="1.0" encoding="utf-8"?>
-<w:numbering xmlns:wpc="http://schemas.microsoft.com/office/word/2010/wordprocessingCanvas" xmlns:cx="http://schemas.microsoft.com/office/drawing/2014/chartex" xmlns:cx1="http://schemas.microsoft.com/office/drawing/2015/9/8/chartex" xmlns:cx2="http://schemas.microsoft.com/office/drawing/2015/10/21/chartex" xmlns:cx3="http://schemas.microsoft.com/office/drawing/2016/5/9/chartex" xmlns:cx4="http://schemas.microsoft.com/office/drawing/2016/5/10/chartex" xmlns:cx5="http://schemas.microsoft.com/office/drawing/2016/5/11/chartex" xmlns:cx6="http://schemas.microsoft.com/office/drawing/2016/5/12/chartex" xmlns:cx7="http://schemas.microsoft.com/office/drawing/2016/5/13/chartex" xmlns:cx8="http://schemas.microsoft.com/office/drawing/2016/5/14/chartex" xmlns:mc="http://schemas.openxmlformats.org/markup-compatibility/2006" xmlns:aink="http://schemas.microsoft.com/office/drawing/2016/ink" xmlns:am3d="http://schemas.microsoft.com/office/drawing/2017/model3d" xmlns:o="urn:schemas-microsoft-com:office:office" xmlns:oel="http://schemas.microsoft.com/office/2019/extlst" xmlns:r="http://schemas.openxmlformats.org/officeDocument/2006/relationships" xmlns:m="http://schemas.openxmlformats.org/officeDocument/2006/math" xmlns:v="urn:schemas-microsoft-com:vml" xmlns:wp14="http://schemas.microsoft.com/office/word/2010/wordprocessingDrawing" xmlns:wp="http://schemas.openxmlformats.org/drawingml/2006/wordprocessingDrawing" xmlns:w10="urn:schemas-microsoft-com:office:word" xmlns:w="http://schemas.openxmlformats.org/wordprocessingml/2006/main" xmlns:w14="http://schemas.microsoft.com/office/word/2010/wordml" xmlns:w15="http://schemas.microsoft.com/office/word/2012/wordml" xmlns:w16cex="http://schemas.microsoft.com/office/word/2018/wordml/cex" xmlns:w16cid="http://schemas.microsoft.com/office/word/2016/wordml/cid" xmlns:w16="http://schemas.microsoft.com/office/word/2018/wordml" xmlns:w16du="http://schemas.microsoft.com/office/word/2023/wordml/word16du" xmlns:w16sdtdh="http://schemas.microsoft.com/office/word/2020/wordml/sdtdatahash" xmlns:w16sdtfl="http://schemas.microsoft.com/office/word/2024/wordml/sdtformatlock" xmlns:w16se="http://schemas.microsoft.com/office/word/2015/wordml/symex" xmlns:wpg="http://schemas.microsoft.com/office/word/2010/wordprocessingGroup" xmlns:wpi="http://schemas.microsoft.com/office/word/2010/wordprocessingInk" xmlns:wne="http://schemas.microsoft.com/office/word/2006/wordml" xmlns:wps="http://schemas.microsoft.com/office/word/2010/wordprocessingShape" mc:Ignorable="w14 w15 w16se w16cid w16 w16cex w16sdtdh w16sdtfl w16du wp14">
+<w:numbering xmlns:wpc="http://schemas.microsoft.com/office/word/2010/wordprocessingCanvas" xmlns:cx="http://schemas.microsoft.com/office/drawing/2014/chartex" xmlns:cx1="http://schemas.microsoft.com/office/drawing/2015/9/8/chartex" xmlns:cx2="http://schemas.microsoft.com/office/drawing/2015/10/21/chartex" xmlns:cx3="http://schemas.microsoft.com/office/drawing/2016/5/9/chartex" xmlns:cx4="http://schemas.microsoft.com/office/drawing/2016/5/10/chartex" xmlns:cx5="http://schemas.microsoft.com/office/drawing/2016/5/11/chartex" xmlns:cx6="http://schemas.microsoft.com/office/drawing/2016/5/12/chartex" xmlns:cx7="http://schemas.microsoft.com/office/drawing/2016/5/13/chartex" xmlns:cx8="http://schemas.microsoft.com/office/drawing/2016/5/14/chartex" xmlns:mc="http://schemas.openxmlformats.org/markup-compatibility/2006" xmlns:aink="http://schemas.microsoft.com/office/drawing/2016/ink" xmlns:am3d="http://schemas.microsoft.com/office/drawing/2017/model3d" xmlns:o="urn:schemas-microsoft-com:office:office" xmlns:oel="http://schemas.microsoft.com/office/2019/extlst" xmlns:r="http://schemas.openxmlformats.org/officeDocument/2006/relationships" xmlns:m="http://schemas.openxmlformats.org/officeDocument/2006/math" xmlns:v="urn:schemas-microsoft-com:vml" xmlns:wp14="http://schemas.microsoft.com/office/word/2010/wordprocessingDrawing" xmlns:wp="http://schemas.openxmlformats.org/drawingml/2006/wordprocessingDrawing" xmlns:w10="urn:schemas-microsoft-com:office:word" xmlns:w="http://schemas.openxmlformats.org/wordprocessingml/2006/main" xmlns:w14="http://schemas.microsoft.com/office/word/2010/wordml" xmlns:w15="http://schemas.microsoft.com/office/word/2012/wordml" xmlns:w16cei="http://schemas.microsoft.com/office/word/2026/wordml/cei" xmlns:w16cex="http://schemas.microsoft.com/office/word/2018/wordml/cex" xmlns:w16cid="http://schemas.microsoft.com/office/word/2016/wordml/cid" xmlns:w16="http://schemas.microsoft.com/office/word/2018/wordml" xmlns:w16du="http://schemas.microsoft.com/office/word/2023/wordml/word16du" xmlns:w16sdtdh="http://schemas.microsoft.com/office/word/2020/wordml/sdtdatahash" xmlns:w16sdtfl="http://schemas.microsoft.com/office/word/2024/wordml/sdtformatlock" xmlns:w16se="http://schemas.microsoft.com/office/word/2015/wordml/symex" xmlns:wpg="http://schemas.microsoft.com/office/word/2010/wordprocessingGroup" xmlns:wpi="http://schemas.microsoft.com/office/word/2010/wordprocessingInk" xmlns:wne="http://schemas.microsoft.com/office/word/2006/wordml" xmlns:wps="http://schemas.microsoft.com/office/word/2010/wordprocessingShape" mc:Ignorable="w14 w15 w16se w16cid w16 w16cex w16sdtdh w16sdtfl w16du wp14">
   <w:abstractNum w:abstractNumId="0" w15:restartNumberingAfterBreak="0">
     <w:nsid w:val="0F4043B3"/>
     <w:multiLevelType w:val="hybridMultilevel"/>
@@ -1272,7 +1337,7 @@
 </file>
 
 <file path=word/people.xml><?xml version="1.0" encoding="utf-8"?>
-<w15:people xmlns:wpc="http://schemas.microsoft.com/office/word/2010/wordprocessingCanvas" xmlns:cx="http://schemas.microsoft.com/office/drawing/2014/chartex" xmlns:cx1="http://schemas.microsoft.com/office/drawing/2015/9/8/chartex" xmlns:cx2="http://schemas.microsoft.com/office/drawing/2015/10/21/chartex" xmlns:cx3="http://schemas.microsoft.com/office/drawing/2016/5/9/chartex" xmlns:cx4="http://schemas.microsoft.com/office/drawing/2016/5/10/chartex" xmlns:cx5="http://schemas.microsoft.com/office/drawing/2016/5/11/chartex" xmlns:cx6="http://schemas.microsoft.com/office/drawing/2016/5/12/chartex" xmlns:cx7="http://schemas.microsoft.com/office/drawing/2016/5/13/chartex" xmlns:cx8="http://schemas.microsoft.com/office/drawing/2016/5/14/chartex" xmlns:mc="http://schemas.openxmlformats.org/markup-compatibility/2006" xmlns:aink="http://schemas.microsoft.com/office/drawing/2016/ink" xmlns:am3d="http://schemas.microsoft.com/office/drawing/2017/model3d" xmlns:o="urn:schemas-microsoft-com:office:office" xmlns:oel="http://schemas.microsoft.com/office/2019/extlst" xmlns:r="http://schemas.openxmlformats.org/officeDocument/2006/relationships" xmlns:m="http://schemas.openxmlformats.org/officeDocument/2006/math" xmlns:v="urn:schemas-microsoft-com:vml" xmlns:wp14="http://schemas.microsoft.com/office/word/2010/wordprocessingDrawing" xmlns:wp="http://schemas.openxmlformats.org/drawingml/2006/wordprocessingDrawing" xmlns:w10="urn:schemas-microsoft-com:office:word" xmlns:w="http://schemas.openxmlformats.org/wordprocessingml/2006/main" xmlns:w14="http://schemas.microsoft.com/office/word/2010/wordml" xmlns:w15="http://schemas.microsoft.com/office/word/2012/wordml" xmlns:w16cex="http://schemas.microsoft.com/office/word/2018/wordml/cex" xmlns:w16cid="http://schemas.microsoft.com/office/word/2016/wordml/cid" xmlns:w16="http://schemas.microsoft.com/office/word/2018/wordml" xmlns:w16du="http://schemas.microsoft.com/office/word/2023/wordml/word16du" xmlns:w16sdtdh="http://schemas.microsoft.com/office/word/2020/wordml/sdtdatahash" xmlns:w16sdtfl="http://schemas.microsoft.com/office/word/2024/wordml/sdtformatlock" xmlns:w16se="http://schemas.microsoft.com/office/word/2015/wordml/symex" xmlns:wpg="http://schemas.microsoft.com/office/word/2010/wordprocessingGroup" xmlns:wpi="http://schemas.microsoft.com/office/word/2010/wordprocessingInk" xmlns:wne="http://schemas.microsoft.com/office/word/2006/wordml" xmlns:wps="http://schemas.microsoft.com/office/word/2010/wordprocessingShape" mc:Ignorable="w14 w15 w16se w16cid w16 w16cex w16sdtdh w16sdtfl w16du wp14">
+<w15:people xmlns:wpc="http://schemas.microsoft.com/office/word/2010/wordprocessingCanvas" xmlns:cx="http://schemas.microsoft.com/office/drawing/2014/chartex" xmlns:cx1="http://schemas.microsoft.com/office/drawing/2015/9/8/chartex" xmlns:cx2="http://schemas.microsoft.com/office/drawing/2015/10/21/chartex" xmlns:cx3="http://schemas.microsoft.com/office/drawing/2016/5/9/chartex" xmlns:cx4="http://schemas.microsoft.com/office/drawing/2016/5/10/chartex" xmlns:cx5="http://schemas.microsoft.com/office/drawing/2016/5/11/chartex" xmlns:cx6="http://schemas.microsoft.com/office/drawing/2016/5/12/chartex" xmlns:cx7="http://schemas.microsoft.com/office/drawing/2016/5/13/chartex" xmlns:cx8="http://schemas.microsoft.com/office/drawing/2016/5/14/chartex" xmlns:mc="http://schemas.openxmlformats.org/markup-compatibility/2006" xmlns:aink="http://schemas.microsoft.com/office/drawing/2016/ink" xmlns:am3d="http://schemas.microsoft.com/office/drawing/2017/model3d" xmlns:o="urn:schemas-microsoft-com:office:office" xmlns:oel="http://schemas.microsoft.com/office/2019/extlst" xmlns:r="http://schemas.openxmlformats.org/officeDocument/2006/relationships" xmlns:m="http://schemas.openxmlformats.org/officeDocument/2006/math" xmlns:v="urn:schemas-microsoft-com:vml" xmlns:wp14="http://schemas.microsoft.com/office/word/2010/wordprocessingDrawing" xmlns:wp="http://schemas.openxmlformats.org/drawingml/2006/wordprocessingDrawing" xmlns:w10="urn:schemas-microsoft-com:office:word" xmlns:w="http://schemas.openxmlformats.org/wordprocessingml/2006/main" xmlns:w14="http://schemas.microsoft.com/office/word/2010/wordml" xmlns:w15="http://schemas.microsoft.com/office/word/2012/wordml" xmlns:w16cei="http://schemas.microsoft.com/office/word/2026/wordml/cei" xmlns:w16cex="http://schemas.microsoft.com/office/word/2018/wordml/cex" xmlns:w16cid="http://schemas.microsoft.com/office/word/2016/wordml/cid" xmlns:w16="http://schemas.microsoft.com/office/word/2018/wordml" xmlns:w16du="http://schemas.microsoft.com/office/word/2023/wordml/word16du" xmlns:w16sdtdh="http://schemas.microsoft.com/office/word/2020/wordml/sdtdatahash" xmlns:w16sdtfl="http://schemas.microsoft.com/office/word/2024/wordml/sdtformatlock" xmlns:w16se="http://schemas.microsoft.com/office/word/2015/wordml/symex" xmlns:wpg="http://schemas.microsoft.com/office/word/2010/wordprocessingGroup" xmlns:wpi="http://schemas.microsoft.com/office/word/2010/wordprocessingInk" xmlns:wne="http://schemas.microsoft.com/office/word/2006/wordml" xmlns:wps="http://schemas.microsoft.com/office/word/2010/wordprocessingShape" mc:Ignorable="w14 w15 w16se w16cid w16 w16cex w16sdtdh w16sdtfl w16du wp14">
   <w15:person w15:author="McCloskey, Ross">
     <w15:presenceInfo w15:providerId="AD" w15:userId="S::mccloskw@oregonstate.edu::b1990487-ee44-4922-b58f-5b2980a02730"/>
   </w15:person>

</xml_diff>

<commit_message>
updates to checklist, outline, and powerpoint based on recent progress
</commit_message>
<xml_diff>
--- a/Outline and next steps.docx
+++ b/Outline and next steps.docx
@@ -342,36 +342,39 @@
         </w:numPr>
       </w:pPr>
       <w:r>
+        <w:t>Ross</w:t>
+      </w:r>
+      <w:r>
+        <w:rPr>
+          <w:strike/>
+        </w:rPr>
+        <w:t xml:space="preserve">: </w:t>
+      </w:r>
+      <w:r>
+        <w:rPr>
+          <w:strike/>
+        </w:rPr>
+        <w:t>Add a version of objective 2 &amp; 3 analyses with data for all clusters except for the main 4 clusters excluded from the data set to see if results change substantially</w:t>
+      </w:r>
+      <w:r>
+        <w:rPr>
+          <w:strike/>
+        </w:rPr>
+        <w:t xml:space="preserve"> (probably easiest to just make new scripts and filter the data set by cluster at the start of each)</w:t>
+      </w:r>
+    </w:p>
+    <w:p>
+      <w:pPr>
+        <w:pStyle w:val="ListParagraph"/>
+        <w:numPr>
+          <w:ilvl w:val="0"/>
+          <w:numId w:val="2"/>
+        </w:numPr>
+      </w:pPr>
+      <w:r>
         <w:t xml:space="preserve">Ross: </w:t>
       </w:r>
       <w:r>
-        <w:rPr>
-          <w:color w:val="215E99" w:themeColor="text2" w:themeTint="BF"/>
-        </w:rPr>
-        <w:t>Add a version of objective 2 &amp; 3 analyses with data for all clusters except for the main 4 clusters excluded from the data set to see if results change substantially</w:t>
-      </w:r>
-      <w:r>
-        <w:rPr>
-          <w:color w:val="215E99" w:themeColor="text2" w:themeTint="BF"/>
-        </w:rPr>
-        <w:t xml:space="preserve"> (probably easiest to just make new scripts and filter the data set by cluster at the </w:t>
-      </w:r>
-      <w:r>
-        <w:t>start of each)</w:t>
-      </w:r>
-    </w:p>
-    <w:p>
-      <w:pPr>
-        <w:pStyle w:val="ListParagraph"/>
-        <w:numPr>
-          <w:ilvl w:val="0"/>
-          <w:numId w:val="2"/>
-        </w:numPr>
-      </w:pPr>
-      <w:r>
-        <w:t xml:space="preserve">Ross: </w:t>
-      </w:r>
-      <w:r>
         <w:t>Update figures</w:t>
       </w:r>
     </w:p>
@@ -406,15 +409,9 @@
       </w:pPr>
       <w:r>
         <w:rPr>
-          <w:color w:val="215E99" w:themeColor="text2" w:themeTint="BF"/>
-        </w:rPr>
-        <w:t>Stacked bar plot: order x-axis by cluster</w:t>
-      </w:r>
-      <w:r>
-        <w:rPr>
-          <w:strike/>
-        </w:rPr>
-        <w:t>, remove faceting; change color scheme to mesopelagics, flatfishes, and others</w:t>
+          <w:strike/>
+        </w:rPr>
+        <w:t>Stacked bar plot: order x-axis by cluster, remove faceting; change color scheme to mesopelagics, flatfishes, and others</w:t>
       </w:r>
       <w:r>
         <w:rPr>
@@ -463,13 +460,7 @@
         <w:rPr>
           <w:strike/>
         </w:rPr>
-        <w:t xml:space="preserve">, legend title, x-axis values (give each tow a number based on order in time/date, </w:t>
-      </w:r>
-      <w:r>
-        <w:rPr>
-          <w:color w:val="215E99" w:themeColor="text2" w:themeTint="BF"/>
-        </w:rPr>
-        <w:t>then order x-axis by cluster first, then tow ID); make two versions (one with only the 4 main clusters, one with all clusters)</w:t>
+        <w:t>, legend title, x-axis values (give each tow a number based on order in time/date, then order x-axis by cluster first, then tow ID); make two versions (one with only the 4 main clusters, one with all clusters)</w:t>
       </w:r>
     </w:p>
     <w:p>
@@ -516,18 +507,11 @@
       <w:r>
         <w:rPr>
           <w:strike/>
-          <w:color w:val="215E99" w:themeColor="text2" w:themeTint="BF"/>
-        </w:rPr>
-        <w:t>);</w:t>
-      </w:r>
-      <w:r>
-        <w:rPr>
-          <w:color w:val="215E99" w:themeColor="text2" w:themeTint="BF"/>
-        </w:rPr>
-        <w:t xml:space="preserve"> add “x”s to indicate location of tows that were excluded from analysis or had no fish</w:t>
-      </w:r>
-      <w:r>
-        <w:t xml:space="preserve">; </w:t>
+        </w:rPr>
+        <w:t>); add “x”s to indicate location of tows that were excluded from analysis or had no fish;</w:t>
+      </w:r>
+      <w:r>
+        <w:t xml:space="preserve"> </w:t>
       </w:r>
       <w:r>
         <w:rPr>
@@ -544,18 +528,18 @@
           <w:numId w:val="2"/>
         </w:numPr>
         <w:rPr>
-          <w:color w:val="215E99" w:themeColor="text2" w:themeTint="BF"/>
-        </w:rPr>
-      </w:pPr>
-      <w:r>
-        <w:rPr>
-          <w:color w:val="215E99" w:themeColor="text2" w:themeTint="BF"/>
+          <w:strike/>
+        </w:rPr>
+      </w:pPr>
+      <w:r>
+        <w:rPr>
+          <w:strike/>
         </w:rPr>
         <w:t>NMDS plot with no overlays: make a version with only the 4 main clusters</w:t>
       </w:r>
       <w:r>
         <w:rPr>
-          <w:color w:val="215E99" w:themeColor="text2" w:themeTint="BF"/>
+          <w:strike/>
         </w:rPr>
         <w:t xml:space="preserve"> </w:t>
       </w:r>
@@ -567,6 +551,9 @@
           <w:ilvl w:val="1"/>
           <w:numId w:val="2"/>
         </w:numPr>
+        <w:rPr>
+          <w:strike/>
+        </w:rPr>
       </w:pPr>
       <w:r>
         <w:rPr>
@@ -621,22 +608,7 @@
         <w:rPr>
           <w:strike/>
         </w:rPr>
-        <w:t>; add code to save plot with reasonable dimensions (around 6.5” width x 5.5” height) and adjust text, symbols, lines, etc. to an appropriate size in the saved plot;</w:t>
-      </w:r>
-      <w:r>
-        <w:t xml:space="preserve"> </w:t>
-      </w:r>
-      <w:r>
-        <w:rPr>
-          <w:color w:val="215E99" w:themeColor="text2" w:themeTint="BF"/>
-        </w:rPr>
-        <w:t xml:space="preserve">make a version with only the 4 main </w:t>
-      </w:r>
-      <w:r>
-        <w:rPr>
-          <w:color w:val="215E99" w:themeColor="text2" w:themeTint="BF"/>
-        </w:rPr>
-        <w:t>clusters</w:t>
+        <w:t>; add code to save plot with reasonable dimensions (around 6.5” width x 5.5” height) and adjust text, symbols, lines, etc. to an appropriate size in the saved plot; make a version with only the 4 main clusters</w:t>
       </w:r>
     </w:p>
     <w:p>
@@ -646,6 +618,9 @@
           <w:ilvl w:val="1"/>
           <w:numId w:val="2"/>
         </w:numPr>
+        <w:rPr>
+          <w:strike/>
+        </w:rPr>
       </w:pPr>
       <w:r>
         <w:rPr>
@@ -657,15 +632,12 @@
         <w:rPr>
           <w:strike/>
         </w:rPr>
-        <w:t xml:space="preserve"> make legend titles,</w:t>
-      </w:r>
-      <w:r>
-        <w:t xml:space="preserve"> </w:t>
+        <w:t xml:space="preserve"> make legend titles, </w:t>
       </w:r>
       <w:commentRangeStart w:id="0"/>
       <w:r>
         <w:rPr>
-          <w:color w:val="215E99" w:themeColor="text2" w:themeTint="BF"/>
+          <w:strike/>
         </w:rPr>
         <w:t>legend symbols</w:t>
       </w:r>
@@ -673,19 +645,17 @@
       <w:r>
         <w:rPr>
           <w:rStyle w:val="CommentReference"/>
+          <w:strike/>
           <w:sz w:val="24"/>
           <w:szCs w:val="24"/>
         </w:rPr>
         <w:commentReference w:id="0"/>
       </w:r>
       <w:r>
-        <w:t xml:space="preserve">, </w:t>
-      </w:r>
-      <w:r>
-        <w:rPr>
-          <w:strike/>
-        </w:rPr>
-        <w:t>figure dimensions, point sizes, vector and ellipse thickness, etc. consistent with full NMDS plot</w:t>
+        <w:rPr>
+          <w:strike/>
+        </w:rPr>
+        <w:t>, figure dimensions, point sizes, vector and ellipse thickness, etc. consistent with full NMDS plot</w:t>
       </w:r>
     </w:p>
     <w:p>
@@ -1079,7 +1049,7 @@
 
 <file path=word/commentsExtended.xml><?xml version="1.0" encoding="utf-8"?>
 <w15:commentsEx xmlns:wpc="http://schemas.microsoft.com/office/word/2010/wordprocessingCanvas" xmlns:cx="http://schemas.microsoft.com/office/drawing/2014/chartex" xmlns:cx1="http://schemas.microsoft.com/office/drawing/2015/9/8/chartex" xmlns:cx2="http://schemas.microsoft.com/office/drawing/2015/10/21/chartex" xmlns:cx3="http://schemas.microsoft.com/office/drawing/2016/5/9/chartex" xmlns:cx4="http://schemas.microsoft.com/office/drawing/2016/5/10/chartex" xmlns:cx5="http://schemas.microsoft.com/office/drawing/2016/5/11/chartex" xmlns:cx6="http://schemas.microsoft.com/office/drawing/2016/5/12/chartex" xmlns:cx7="http://schemas.microsoft.com/office/drawing/2016/5/13/chartex" xmlns:cx8="http://schemas.microsoft.com/office/drawing/2016/5/14/chartex" xmlns:mc="http://schemas.openxmlformats.org/markup-compatibility/2006" xmlns:aink="http://schemas.microsoft.com/office/drawing/2016/ink" xmlns:am3d="http://schemas.microsoft.com/office/drawing/2017/model3d" xmlns:o="urn:schemas-microsoft-com:office:office" xmlns:oel="http://schemas.microsoft.com/office/2019/extlst" xmlns:r="http://schemas.openxmlformats.org/officeDocument/2006/relationships" xmlns:m="http://schemas.openxmlformats.org/officeDocument/2006/math" xmlns:v="urn:schemas-microsoft-com:vml" xmlns:wp14="http://schemas.microsoft.com/office/word/2010/wordprocessingDrawing" xmlns:wp="http://schemas.openxmlformats.org/drawingml/2006/wordprocessingDrawing" xmlns:w10="urn:schemas-microsoft-com:office:word" xmlns:w="http://schemas.openxmlformats.org/wordprocessingml/2006/main" xmlns:w14="http://schemas.microsoft.com/office/word/2010/wordml" xmlns:w15="http://schemas.microsoft.com/office/word/2012/wordml" xmlns:w16cei="http://schemas.microsoft.com/office/word/2026/wordml/cei" xmlns:w16cex="http://schemas.microsoft.com/office/word/2018/wordml/cex" xmlns:w16cid="http://schemas.microsoft.com/office/word/2016/wordml/cid" xmlns:w16="http://schemas.microsoft.com/office/word/2018/wordml" xmlns:w16du="http://schemas.microsoft.com/office/word/2023/wordml/word16du" xmlns:w16sdtdh="http://schemas.microsoft.com/office/word/2020/wordml/sdtdatahash" xmlns:w16sdtfl="http://schemas.microsoft.com/office/word/2024/wordml/sdtformatlock" xmlns:w16se="http://schemas.microsoft.com/office/word/2015/wordml/symex" xmlns:wpg="http://schemas.microsoft.com/office/word/2010/wordprocessingGroup" xmlns:wpi="http://schemas.microsoft.com/office/word/2010/wordprocessingInk" xmlns:wne="http://schemas.microsoft.com/office/word/2006/wordml" xmlns:wps="http://schemas.microsoft.com/office/word/2010/wordprocessingShape" mc:Ignorable="w14 w15 w16se w16cid w16 w16cex w16sdtdh w16sdtfl w16du wp14">
-  <w15:commentEx w15:paraId="5A87D2E1" w15:done="0"/>
+  <w15:commentEx w15:paraId="5A87D2E1" w15:done="1"/>
   <w15:commentEx w15:paraId="0691F039" w15:done="0"/>
   <w15:commentEx w15:paraId="6499137E" w15:done="0"/>
 </w15:commentsEx>
@@ -1947,7 +1917,6 @@
   <w:style w:type="character" w:default="1" w:styleId="DefaultParagraphFont">
     <w:name w:val="Default Paragraph Font"/>
     <w:uiPriority w:val="1"/>
-    <w:semiHidden/>
     <w:unhideWhenUsed/>
   </w:style>
   <w:style w:type="table" w:default="1" w:styleId="TableNormal">

</xml_diff>